<commit_message>
docs: add performance optimization three-layer methodology to Starknew prep
</commit_message>
<xml_diff>
--- a/02-Knowledge/career-development/interview-project-summaries/03-project-design/Acuvim/调试AD7779驱动说明_20181015.docx
+++ b/02-Knowledge/career-development/interview-project-summaries/03-project-design/Acuvim/调试AD7779驱动说明_20181015.docx
@@ -1,11 +1,11 @@
 
 <file path=word/document.xml><?xml version="1.0" encoding="utf-8"?>
-<w:document xmlns:wpc="http://schemas.microsoft.com/office/word/2010/wordprocessingCanvas" xmlns:mc="http://schemas.openxmlformats.org/markup-compatibility/2006" xmlns:o="urn:schemas-microsoft-com:office:office" xmlns:r="http://schemas.openxmlformats.org/officeDocument/2006/relationships" xmlns:m="http://schemas.openxmlformats.org/officeDocument/2006/math" xmlns:v="urn:schemas-microsoft-com:vml" xmlns:wp14="http://schemas.microsoft.com/office/word/2010/wordprocessingDrawing" xmlns:wp="http://schemas.openxmlformats.org/drawingml/2006/wordprocessingDrawing" xmlns:w10="urn:schemas-microsoft-com:office:word" xmlns:w="http://schemas.openxmlformats.org/wordprocessingml/2006/main" xmlns:w14="http://schemas.microsoft.com/office/word/2010/wordml" xmlns:wpg="http://schemas.microsoft.com/office/word/2010/wordprocessingGroup" xmlns:wpi="http://schemas.microsoft.com/office/word/2010/wordprocessingInk" xmlns:wne="http://schemas.microsoft.com/office/word/2006/wordml" xmlns:wps="http://schemas.microsoft.com/office/word/2010/wordprocessingShape" mc:Ignorable="w14 wp14">
+<w:document xmlns:wpc="http://schemas.microsoft.com/office/word/2010/wordprocessingCanvas" xmlns:cx="http://schemas.microsoft.com/office/drawing/2014/chartex" xmlns:cx1="http://schemas.microsoft.com/office/drawing/2015/9/8/chartex" xmlns:cx2="http://schemas.microsoft.com/office/drawing/2015/10/21/chartex" xmlns:cx3="http://schemas.microsoft.com/office/drawing/2016/5/9/chartex" xmlns:cx4="http://schemas.microsoft.com/office/drawing/2016/5/10/chartex" xmlns:cx5="http://schemas.microsoft.com/office/drawing/2016/5/11/chartex" xmlns:cx6="http://schemas.microsoft.com/office/drawing/2016/5/12/chartex" xmlns:cx7="http://schemas.microsoft.com/office/drawing/2016/5/13/chartex" xmlns:cx8="http://schemas.microsoft.com/office/drawing/2016/5/14/chartex" xmlns:mc="http://schemas.openxmlformats.org/markup-compatibility/2006" xmlns:aink="http://schemas.microsoft.com/office/drawing/2016/ink" xmlns:am3d="http://schemas.microsoft.com/office/drawing/2017/model3d" xmlns:o="urn:schemas-microsoft-com:office:office" xmlns:r="http://schemas.openxmlformats.org/officeDocument/2006/relationships" xmlns:m="http://schemas.openxmlformats.org/officeDocument/2006/math" xmlns:v="urn:schemas-microsoft-com:vml" xmlns:wp14="http://schemas.microsoft.com/office/word/2010/wordprocessingDrawing" xmlns:wp="http://schemas.openxmlformats.org/drawingml/2006/wordprocessingDrawing" xmlns:w10="urn:schemas-microsoft-com:office:word" xmlns:w="http://schemas.openxmlformats.org/wordprocessingml/2006/main" xmlns:w14="http://schemas.microsoft.com/office/word/2010/wordml" xmlns:w15="http://schemas.microsoft.com/office/word/2012/wordml" xmlns:w16cex="http://schemas.microsoft.com/office/word/2018/wordml/cex" xmlns:w16cid="http://schemas.microsoft.com/office/word/2016/wordml/cid" xmlns:w16="http://schemas.microsoft.com/office/word/2018/wordml" xmlns:w16sdtdh="http://schemas.microsoft.com/office/word/2020/wordml/sdtdatahash" xmlns:w16se="http://schemas.microsoft.com/office/word/2015/wordml/symex" xmlns:wpg="http://schemas.microsoft.com/office/word/2010/wordprocessingGroup" xmlns:wpi="http://schemas.microsoft.com/office/word/2010/wordprocessingInk" xmlns:wne="http://schemas.microsoft.com/office/word/2006/wordml" xmlns:wps="http://schemas.microsoft.com/office/word/2010/wordprocessingShape" mc:Ignorable="w14 w15 w16se w16cid w16 w16cex w16sdtdh wp14">
   <w:background w:color="FFFFFF"/>
   <w:body>
     <w:p>
       <w:pPr>
-        <w:pStyle w:val="a6"/>
+        <w:pStyle w:val="a7"/>
       </w:pPr>
       <w:r>
         <w:rPr>
@@ -22,7 +22,68 @@
     </w:p>
     <w:p>
       <w:pPr>
-        <w:pStyle w:val="a7"/>
+        <w:pStyle w:val="a9"/>
+        <w:ind w:left="360" w:firstLineChars="0" w:firstLine="0"/>
+      </w:pPr>
+    </w:p>
+    <w:p>
+      <w:pPr>
+        <w:pStyle w:val="a9"/>
+        <w:ind w:left="360" w:firstLineChars="0" w:firstLine="0"/>
+      </w:pPr>
+      <w:r>
+        <w:rPr>
+          <w:noProof/>
+        </w:rPr>
+        <w:drawing>
+          <wp:inline distT="0" distB="0" distL="0" distR="0" wp14:anchorId="032D5834" wp14:editId="7D9D67D4">
+            <wp:extent cx="5498434" cy="5263384"/>
+            <wp:effectExtent l="3175" t="0" r="0" b="0"/>
+            <wp:docPr id="61" name="图片 61"/>
+            <wp:cNvGraphicFramePr>
+              <a:graphicFrameLocks xmlns:a="http://schemas.openxmlformats.org/drawingml/2006/main" noChangeAspect="1"/>
+            </wp:cNvGraphicFramePr>
+            <a:graphic xmlns:a="http://schemas.openxmlformats.org/drawingml/2006/main">
+              <a:graphicData uri="http://schemas.openxmlformats.org/drawingml/2006/picture">
+                <pic:pic xmlns:pic="http://schemas.openxmlformats.org/drawingml/2006/picture">
+                  <pic:nvPicPr>
+                    <pic:cNvPr id="0" name=""/>
+                    <pic:cNvPicPr/>
+                  </pic:nvPicPr>
+                  <pic:blipFill>
+                    <a:blip r:embed="rId7"/>
+                    <a:stretch>
+                      <a:fillRect/>
+                    </a:stretch>
+                  </pic:blipFill>
+                  <pic:spPr>
+                    <a:xfrm rot="5400000">
+                      <a:off x="0" y="0"/>
+                      <a:ext cx="5506142" cy="5270762"/>
+                    </a:xfrm>
+                    <a:prstGeom prst="rect">
+                      <a:avLst/>
+                    </a:prstGeom>
+                  </pic:spPr>
+                </pic:pic>
+              </a:graphicData>
+            </a:graphic>
+          </wp:inline>
+        </w:drawing>
+      </w:r>
+    </w:p>
+    <w:p>
+      <w:pPr>
+        <w:pStyle w:val="a9"/>
+        <w:ind w:left="360" w:firstLineChars="0" w:firstLine="0"/>
+        <w:rPr>
+          <w:rFonts w:hint="eastAsia"/>
+        </w:rPr>
+      </w:pPr>
+    </w:p>
+    <w:p>
+      <w:pPr>
+        <w:pStyle w:val="a9"/>
         <w:numPr>
           <w:ilvl w:val="0"/>
           <w:numId w:val="1"/>
@@ -38,7 +99,7 @@
     </w:p>
     <w:p>
       <w:pPr>
-        <w:pStyle w:val="a7"/>
+        <w:pStyle w:val="a9"/>
         <w:numPr>
           <w:ilvl w:val="0"/>
           <w:numId w:val="2"/>
@@ -60,7 +121,7 @@
     </w:p>
     <w:p>
       <w:pPr>
-        <w:pStyle w:val="a7"/>
+        <w:pStyle w:val="a9"/>
         <w:ind w:left="720" w:firstLineChars="0" w:firstLine="0"/>
       </w:pPr>
       <w:r>
@@ -120,7 +181,7 @@
     </w:p>
     <w:p>
       <w:pPr>
-        <w:pStyle w:val="a7"/>
+        <w:pStyle w:val="a9"/>
         <w:ind w:left="720" w:firstLineChars="0" w:firstLine="0"/>
       </w:pPr>
       <w:r>
@@ -128,7 +189,7 @@
           <w:noProof/>
         </w:rPr>
         <w:drawing>
-          <wp:inline distT="0" distB="0" distL="0" distR="0" wp14:anchorId="28C6A9F6" wp14:editId="1EACE15D">
+          <wp:inline distT="0" distB="0" distL="0" distR="0" wp14:anchorId="69D2E4FE" wp14:editId="5AA7E1C7">
             <wp:extent cx="5486400" cy="1200785"/>
             <wp:effectExtent l="0" t="0" r="0" b="0"/>
             <wp:docPr id="2" name="图片 2"/>
@@ -166,7 +227,7 @@
     </w:p>
     <w:p>
       <w:pPr>
-        <w:pStyle w:val="a7"/>
+        <w:pStyle w:val="a9"/>
         <w:ind w:left="720" w:firstLineChars="0" w:firstLine="0"/>
       </w:pPr>
       <w:r>
@@ -268,7 +329,7 @@
     </w:p>
     <w:p>
       <w:pPr>
-        <w:pStyle w:val="a7"/>
+        <w:pStyle w:val="a9"/>
         <w:ind w:left="720" w:firstLineChars="0" w:firstLine="0"/>
       </w:pPr>
     </w:p>
@@ -280,6 +341,7 @@
         <w:rPr>
           <w:rFonts w:hint="eastAsia"/>
         </w:rPr>
+        <w:lastRenderedPageBreak/>
         <w:t>2)</w:t>
       </w:r>
       <w:r>
@@ -297,7 +359,7 @@
     </w:p>
     <w:p>
       <w:pPr>
-        <w:pStyle w:val="a7"/>
+        <w:pStyle w:val="a9"/>
         <w:ind w:left="1080" w:firstLineChars="0" w:firstLine="0"/>
       </w:pPr>
       <w:r>
@@ -305,7 +367,7 @@
           <w:noProof/>
         </w:rPr>
         <w:drawing>
-          <wp:inline distT="0" distB="0" distL="0" distR="0" wp14:anchorId="3839A284" wp14:editId="161C7EB8">
+          <wp:inline distT="0" distB="0" distL="0" distR="0" wp14:anchorId="758D72A5" wp14:editId="4E741E99">
             <wp:extent cx="5486398" cy="2941982"/>
             <wp:effectExtent l="0" t="0" r="635" b="0"/>
             <wp:docPr id="8" name="图片 8"/>
@@ -344,7 +406,7 @@
     <w:p/>
     <w:p>
       <w:pPr>
-        <w:pStyle w:val="a7"/>
+        <w:pStyle w:val="a9"/>
         <w:numPr>
           <w:ilvl w:val="0"/>
           <w:numId w:val="2"/>
@@ -384,7 +446,7 @@
     </w:p>
     <w:p>
       <w:pPr>
-        <w:pStyle w:val="a7"/>
+        <w:pStyle w:val="a9"/>
         <w:numPr>
           <w:ilvl w:val="0"/>
           <w:numId w:val="3"/>
@@ -478,7 +540,7 @@
           <w:noProof/>
         </w:rPr>
         <w:drawing>
-          <wp:inline distT="0" distB="0" distL="0" distR="0" wp14:anchorId="68E1EB28" wp14:editId="38A169A1">
+          <wp:inline distT="0" distB="0" distL="0" distR="0" wp14:anchorId="57C6BAC2" wp14:editId="7DF782E2">
             <wp:extent cx="2369488" cy="1709530"/>
             <wp:effectExtent l="0" t="0" r="0" b="5080"/>
             <wp:docPr id="5" name="图片 5"/>
@@ -542,7 +604,7 @@
     </w:p>
     <w:p>
       <w:pPr>
-        <w:pStyle w:val="a7"/>
+        <w:pStyle w:val="a9"/>
         <w:numPr>
           <w:ilvl w:val="0"/>
           <w:numId w:val="1"/>
@@ -553,7 +615,6 @@
         <w:rPr>
           <w:rFonts w:hint="eastAsia"/>
         </w:rPr>
-        <w:lastRenderedPageBreak/>
         <w:t>AD7779</w:t>
       </w:r>
       <w:r>
@@ -577,7 +638,7 @@
     </w:p>
     <w:p>
       <w:pPr>
-        <w:pStyle w:val="a7"/>
+        <w:pStyle w:val="a9"/>
         <w:numPr>
           <w:ilvl w:val="0"/>
           <w:numId w:val="4"/>
@@ -599,7 +660,7 @@
     </w:p>
     <w:p>
       <w:pPr>
-        <w:pStyle w:val="a7"/>
+        <w:pStyle w:val="a9"/>
         <w:ind w:left="720" w:firstLineChars="0" w:firstLine="0"/>
       </w:pPr>
       <w:r>
@@ -607,7 +668,7 @@
           <w:noProof/>
         </w:rPr>
         <w:drawing>
-          <wp:inline distT="0" distB="0" distL="0" distR="0" wp14:anchorId="3BE5802A" wp14:editId="3E150EB0">
+          <wp:inline distT="0" distB="0" distL="0" distR="0" wp14:anchorId="1B651336" wp14:editId="0F9EC2E1">
             <wp:extent cx="2719346" cy="1971923"/>
             <wp:effectExtent l="0" t="0" r="5080" b="9525"/>
             <wp:docPr id="14" name="图片 14"/>
@@ -645,7 +706,7 @@
     </w:p>
     <w:p>
       <w:pPr>
-        <w:pStyle w:val="a7"/>
+        <w:pStyle w:val="a9"/>
         <w:ind w:left="720" w:firstLineChars="0" w:firstLine="0"/>
       </w:pPr>
       <w:r>
@@ -681,7 +742,7 @@
     </w:p>
     <w:p>
       <w:pPr>
-        <w:pStyle w:val="a7"/>
+        <w:pStyle w:val="a9"/>
         <w:numPr>
           <w:ilvl w:val="0"/>
           <w:numId w:val="4"/>
@@ -697,7 +758,7 @@
     </w:p>
     <w:p>
       <w:pPr>
-        <w:pStyle w:val="a7"/>
+        <w:pStyle w:val="a9"/>
         <w:numPr>
           <w:ilvl w:val="0"/>
           <w:numId w:val="5"/>
@@ -708,6 +769,7 @@
         <w:rPr>
           <w:rFonts w:hint="eastAsia"/>
         </w:rPr>
+        <w:lastRenderedPageBreak/>
         <w:t>基准电压：</w:t>
       </w:r>
       <w:r>
@@ -719,7 +781,7 @@
     </w:p>
     <w:p>
       <w:pPr>
-        <w:pStyle w:val="a7"/>
+        <w:pStyle w:val="a9"/>
         <w:numPr>
           <w:ilvl w:val="0"/>
           <w:numId w:val="5"/>
@@ -747,7 +809,7 @@
     </w:p>
     <w:p>
       <w:pPr>
-        <w:pStyle w:val="a7"/>
+        <w:pStyle w:val="a9"/>
         <w:numPr>
           <w:ilvl w:val="0"/>
           <w:numId w:val="5"/>
@@ -763,7 +825,7 @@
     </w:p>
     <w:p>
       <w:pPr>
-        <w:pStyle w:val="a7"/>
+        <w:pStyle w:val="a9"/>
         <w:numPr>
           <w:ilvl w:val="0"/>
           <w:numId w:val="4"/>
@@ -791,7 +853,7 @@
     </w:p>
     <w:p>
       <w:pPr>
-        <w:pStyle w:val="a7"/>
+        <w:pStyle w:val="a9"/>
         <w:numPr>
           <w:ilvl w:val="0"/>
           <w:numId w:val="6"/>
@@ -807,7 +869,7 @@
     </w:p>
     <w:p>
       <w:pPr>
-        <w:pStyle w:val="a7"/>
+        <w:pStyle w:val="a9"/>
         <w:numPr>
           <w:ilvl w:val="0"/>
           <w:numId w:val="6"/>
@@ -835,7 +897,7 @@
     </w:p>
     <w:p>
       <w:pPr>
-        <w:pStyle w:val="a7"/>
+        <w:pStyle w:val="a9"/>
         <w:numPr>
           <w:ilvl w:val="0"/>
           <w:numId w:val="6"/>
@@ -851,7 +913,7 @@
     </w:p>
     <w:p>
       <w:pPr>
-        <w:pStyle w:val="a7"/>
+        <w:pStyle w:val="a9"/>
         <w:numPr>
           <w:ilvl w:val="0"/>
           <w:numId w:val="6"/>
@@ -867,7 +929,7 @@
     </w:p>
     <w:p>
       <w:pPr>
-        <w:pStyle w:val="a7"/>
+        <w:pStyle w:val="a9"/>
         <w:numPr>
           <w:ilvl w:val="0"/>
           <w:numId w:val="4"/>
@@ -883,7 +945,7 @@
     </w:p>
     <w:p>
       <w:pPr>
-        <w:pStyle w:val="a7"/>
+        <w:pStyle w:val="a9"/>
         <w:numPr>
           <w:ilvl w:val="0"/>
           <w:numId w:val="7"/>
@@ -899,7 +961,7 @@
     </w:p>
     <w:p>
       <w:pPr>
-        <w:pStyle w:val="a7"/>
+        <w:pStyle w:val="a9"/>
         <w:numPr>
           <w:ilvl w:val="0"/>
           <w:numId w:val="7"/>
@@ -939,7 +1001,7 @@
     </w:p>
     <w:p>
       <w:pPr>
-        <w:pStyle w:val="a7"/>
+        <w:pStyle w:val="a9"/>
         <w:numPr>
           <w:ilvl w:val="0"/>
           <w:numId w:val="7"/>
@@ -955,7 +1017,7 @@
     </w:p>
     <w:p>
       <w:pPr>
-        <w:pStyle w:val="a7"/>
+        <w:pStyle w:val="a9"/>
         <w:numPr>
           <w:ilvl w:val="0"/>
           <w:numId w:val="4"/>
@@ -983,7 +1045,7 @@
     </w:p>
     <w:p>
       <w:pPr>
-        <w:pStyle w:val="a7"/>
+        <w:pStyle w:val="a9"/>
         <w:ind w:left="720" w:firstLineChars="0" w:firstLine="0"/>
       </w:pPr>
     </w:p>
@@ -1000,7 +1062,7 @@
       <w:hyperlink r:id="rId12" w:history="1">
         <w:r>
           <w:rPr>
-            <w:rStyle w:val="a8"/>
+            <w:rStyle w:val="aa"/>
           </w:rPr>
           <w:t>https://blog.csdn.net/masmin/article/details/80101182</w:t>
         </w:r>
@@ -1019,7 +1081,7 @@
       <w:hyperlink r:id="rId13" w:history="1">
         <w:r>
           <w:rPr>
-            <w:rStyle w:val="a8"/>
+            <w:rStyle w:val="aa"/>
           </w:rPr>
           <w:t>https://ez.analog.com/cn/data-converters/f/q-a/94286/ad7779</w:t>
         </w:r>
@@ -1144,7 +1206,7 @@
           <w:noProof/>
         </w:rPr>
         <w:drawing>
-          <wp:inline distT="0" distB="0" distL="0" distR="0" wp14:anchorId="3C773BB9" wp14:editId="53FBB8BC">
+          <wp:inline distT="0" distB="0" distL="0" distR="0" wp14:anchorId="58A6F76C" wp14:editId="186EC13B">
             <wp:extent cx="5486400" cy="1250315"/>
             <wp:effectExtent l="0" t="0" r="0" b="6985"/>
             <wp:docPr id="54" name="图片 54"/>
@@ -1184,7 +1246,7 @@
     <w:p/>
     <w:p>
       <w:pPr>
-        <w:pStyle w:val="a7"/>
+        <w:pStyle w:val="a9"/>
         <w:numPr>
           <w:ilvl w:val="0"/>
           <w:numId w:val="1"/>
@@ -1195,7 +1257,6 @@
         <w:rPr>
           <w:rFonts w:hint="eastAsia"/>
         </w:rPr>
-        <w:lastRenderedPageBreak/>
         <w:t>调试</w:t>
       </w:r>
       <w:r>
@@ -1213,7 +1274,7 @@
     </w:p>
     <w:p>
       <w:pPr>
-        <w:pStyle w:val="a7"/>
+        <w:pStyle w:val="a9"/>
         <w:numPr>
           <w:ilvl w:val="0"/>
           <w:numId w:val="8"/>
@@ -1241,7 +1302,7 @@
     </w:p>
     <w:p>
       <w:pPr>
-        <w:pStyle w:val="a7"/>
+        <w:pStyle w:val="a9"/>
         <w:ind w:left="720" w:firstLineChars="0" w:firstLine="0"/>
       </w:pPr>
       <w:r>
@@ -1249,7 +1310,7 @@
           <w:noProof/>
         </w:rPr>
         <w:drawing>
-          <wp:inline distT="0" distB="0" distL="0" distR="0" wp14:anchorId="1A5AFE19" wp14:editId="2FD2BF4D">
+          <wp:inline distT="0" distB="0" distL="0" distR="0" wp14:anchorId="6BF7A37C" wp14:editId="1647CEF3">
             <wp:extent cx="3742857" cy="1038095"/>
             <wp:effectExtent l="0" t="0" r="0" b="0"/>
             <wp:docPr id="3" name="图片 3"/>
@@ -1287,7 +1348,7 @@
     </w:p>
     <w:p>
       <w:pPr>
-        <w:pStyle w:val="a7"/>
+        <w:pStyle w:val="a9"/>
         <w:numPr>
           <w:ilvl w:val="0"/>
           <w:numId w:val="8"/>
@@ -1381,7 +1442,7 @@
     </w:p>
     <w:p>
       <w:pPr>
-        <w:pStyle w:val="a7"/>
+        <w:pStyle w:val="a9"/>
         <w:ind w:left="720" w:firstLineChars="0" w:firstLine="0"/>
       </w:pPr>
       <w:r>
@@ -1389,7 +1450,7 @@
           <w:noProof/>
         </w:rPr>
         <w:drawing>
-          <wp:inline distT="0" distB="0" distL="0" distR="0" wp14:anchorId="11400AFA" wp14:editId="4BFA04D6">
+          <wp:inline distT="0" distB="0" distL="0" distR="0" wp14:anchorId="5BDB0057" wp14:editId="7BA8EF0E">
             <wp:extent cx="5486400" cy="814705"/>
             <wp:effectExtent l="0" t="0" r="0" b="4445"/>
             <wp:docPr id="12" name="图片 12"/>
@@ -1427,7 +1488,7 @@
     </w:p>
     <w:p>
       <w:pPr>
-        <w:pStyle w:val="a7"/>
+        <w:pStyle w:val="a9"/>
         <w:ind w:left="720" w:firstLineChars="0" w:firstLine="0"/>
       </w:pPr>
       <w:r>
@@ -1487,15 +1548,16 @@
     </w:p>
     <w:p>
       <w:pPr>
-        <w:pStyle w:val="a7"/>
+        <w:pStyle w:val="a9"/>
         <w:ind w:left="720" w:firstLineChars="0" w:firstLine="0"/>
       </w:pPr>
       <w:r>
         <w:rPr>
           <w:noProof/>
         </w:rPr>
+        <w:lastRenderedPageBreak/>
         <w:drawing>
-          <wp:inline distT="0" distB="0" distL="0" distR="0" wp14:anchorId="5067BB91" wp14:editId="36938BC2">
+          <wp:inline distT="0" distB="0" distL="0" distR="0" wp14:anchorId="1AE7EA0B" wp14:editId="4E0A6882">
             <wp:extent cx="5486400" cy="901700"/>
             <wp:effectExtent l="0" t="0" r="0" b="0"/>
             <wp:docPr id="13" name="图片 13"/>
@@ -1533,13 +1595,13 @@
     </w:p>
     <w:p>
       <w:pPr>
-        <w:pStyle w:val="a7"/>
+        <w:pStyle w:val="a9"/>
         <w:ind w:left="720" w:firstLineChars="0" w:firstLine="0"/>
       </w:pPr>
     </w:p>
     <w:p>
       <w:pPr>
-        <w:pStyle w:val="a7"/>
+        <w:pStyle w:val="a9"/>
         <w:ind w:left="720" w:firstLineChars="0" w:firstLine="0"/>
       </w:pPr>
       <w:r>
@@ -1569,7 +1631,7 @@
     </w:p>
     <w:p>
       <w:pPr>
-        <w:pStyle w:val="a7"/>
+        <w:pStyle w:val="a9"/>
         <w:ind w:left="720" w:firstLineChars="0" w:firstLine="0"/>
       </w:pPr>
       <w:r>
@@ -1593,7 +1655,7 @@
     </w:p>
     <w:p>
       <w:pPr>
-        <w:pStyle w:val="a7"/>
+        <w:pStyle w:val="a9"/>
         <w:ind w:left="720" w:firstLineChars="0" w:firstLine="0"/>
       </w:pPr>
       <w:r>
@@ -1601,7 +1663,7 @@
           <w:noProof/>
         </w:rPr>
         <w:drawing>
-          <wp:inline distT="0" distB="0" distL="0" distR="0" wp14:anchorId="36E5018D" wp14:editId="0A795B23">
+          <wp:inline distT="0" distB="0" distL="0" distR="0" wp14:anchorId="00582C21" wp14:editId="51A1ACDA">
             <wp:extent cx="4802588" cy="2136222"/>
             <wp:effectExtent l="0" t="0" r="0" b="0"/>
             <wp:docPr id="17" name="图片 17"/>
@@ -1639,7 +1701,7 @@
     </w:p>
     <w:p>
       <w:pPr>
-        <w:pStyle w:val="a7"/>
+        <w:pStyle w:val="a9"/>
         <w:ind w:left="720" w:firstLineChars="0" w:firstLine="0"/>
       </w:pPr>
       <w:r>
@@ -1663,16 +1725,15 @@
     </w:p>
     <w:p>
       <w:pPr>
-        <w:pStyle w:val="a7"/>
+        <w:pStyle w:val="a9"/>
         <w:ind w:left="720" w:firstLineChars="0" w:firstLine="0"/>
       </w:pPr>
       <w:r>
         <w:rPr>
           <w:noProof/>
         </w:rPr>
-        <w:lastRenderedPageBreak/>
         <w:drawing>
-          <wp:inline distT="0" distB="0" distL="0" distR="0">
+          <wp:inline distT="0" distB="0" distL="0" distR="0" wp14:anchorId="4271103F" wp14:editId="06891C14">
             <wp:extent cx="3514477" cy="2719346"/>
             <wp:effectExtent l="0" t="0" r="0" b="5080"/>
             <wp:docPr id="18" name="图片 18"/>
@@ -1717,8 +1778,9 @@
         <w:rPr>
           <w:noProof/>
         </w:rPr>
+        <w:lastRenderedPageBreak/>
         <w:drawing>
-          <wp:inline distT="0" distB="0" distL="0" distR="0">
+          <wp:inline distT="0" distB="0" distL="0" distR="0" wp14:anchorId="5506E0EA" wp14:editId="03EF4CF3">
             <wp:extent cx="3506525" cy="2289975"/>
             <wp:effectExtent l="0" t="0" r="0" b="0"/>
             <wp:docPr id="19" name="图片 19"/>
@@ -1762,7 +1824,7 @@
     </w:p>
     <w:p>
       <w:pPr>
-        <w:pStyle w:val="a7"/>
+        <w:pStyle w:val="a9"/>
         <w:ind w:left="720" w:firstLineChars="0" w:firstLine="0"/>
       </w:pPr>
       <w:r>
@@ -1774,13 +1836,13 @@
     </w:p>
     <w:p>
       <w:pPr>
-        <w:pStyle w:val="a7"/>
+        <w:pStyle w:val="a9"/>
         <w:ind w:left="720" w:firstLineChars="0" w:firstLine="0"/>
       </w:pPr>
     </w:p>
     <w:p>
       <w:pPr>
-        <w:pStyle w:val="a7"/>
+        <w:pStyle w:val="a9"/>
         <w:ind w:left="720" w:firstLineChars="0" w:firstLine="0"/>
       </w:pPr>
       <w:r>
@@ -1834,7 +1896,7 @@
     </w:p>
     <w:p>
       <w:pPr>
-        <w:pStyle w:val="a7"/>
+        <w:pStyle w:val="a9"/>
         <w:ind w:left="720" w:firstLineChars="0" w:firstLine="0"/>
       </w:pPr>
       <w:r>
@@ -1876,7 +1938,7 @@
     </w:p>
     <w:p>
       <w:pPr>
-        <w:pStyle w:val="a7"/>
+        <w:pStyle w:val="a9"/>
         <w:ind w:left="720" w:firstLineChars="0" w:firstLine="0"/>
       </w:pPr>
       <w:r>
@@ -1884,7 +1946,7 @@
           <w:noProof/>
         </w:rPr>
         <w:drawing>
-          <wp:inline distT="0" distB="0" distL="0" distR="0" wp14:anchorId="33EB87EF" wp14:editId="6DCAB955">
+          <wp:inline distT="0" distB="0" distL="0" distR="0" wp14:anchorId="0E67B4E3" wp14:editId="3B931B31">
             <wp:extent cx="4707172" cy="1947697"/>
             <wp:effectExtent l="0" t="0" r="0" b="0"/>
             <wp:docPr id="16" name="图片 16"/>
@@ -1922,7 +1984,7 @@
     </w:p>
     <w:p>
       <w:pPr>
-        <w:pStyle w:val="a7"/>
+        <w:pStyle w:val="a9"/>
         <w:ind w:left="720" w:firstLineChars="0" w:firstLine="0"/>
       </w:pPr>
       <w:r>
@@ -1934,16 +1996,15 @@
     </w:p>
     <w:p>
       <w:pPr>
-        <w:pStyle w:val="a7"/>
+        <w:pStyle w:val="a9"/>
         <w:ind w:left="720" w:firstLineChars="0" w:firstLine="0"/>
       </w:pPr>
       <w:r>
         <w:rPr>
           <w:noProof/>
         </w:rPr>
-        <w:lastRenderedPageBreak/>
         <w:drawing>
-          <wp:inline distT="0" distB="0" distL="0" distR="0" wp14:anchorId="3CA3B0F3" wp14:editId="1358BF7E">
+          <wp:inline distT="0" distB="0" distL="0" distR="0" wp14:anchorId="1586FF85" wp14:editId="77054730">
             <wp:extent cx="2942134" cy="2154803"/>
             <wp:effectExtent l="0" t="0" r="0" b="0"/>
             <wp:docPr id="22" name="图片 22"/>
@@ -1981,7 +2042,7 @@
     </w:p>
     <w:p>
       <w:pPr>
-        <w:pStyle w:val="a7"/>
+        <w:pStyle w:val="a9"/>
         <w:ind w:left="720" w:firstLineChars="0" w:firstLine="0"/>
       </w:pPr>
       <w:r>
@@ -2017,15 +2078,16 @@
     </w:p>
     <w:p>
       <w:pPr>
-        <w:pStyle w:val="a7"/>
+        <w:pStyle w:val="a9"/>
         <w:ind w:left="720" w:firstLineChars="0" w:firstLine="0"/>
       </w:pPr>
       <w:r>
         <w:rPr>
           <w:noProof/>
         </w:rPr>
+        <w:lastRenderedPageBreak/>
         <w:drawing>
-          <wp:inline distT="0" distB="0" distL="0" distR="0" wp14:anchorId="55263209" wp14:editId="69F8B72E">
+          <wp:inline distT="0" distB="0" distL="0" distR="0" wp14:anchorId="2088ED48" wp14:editId="4003ABE9">
             <wp:extent cx="2868202" cy="2154804"/>
             <wp:effectExtent l="0" t="0" r="8890" b="0"/>
             <wp:docPr id="24" name="图片 24"/>
@@ -2063,19 +2125,19 @@
     </w:p>
     <w:p>
       <w:pPr>
-        <w:pStyle w:val="a7"/>
+        <w:pStyle w:val="a9"/>
         <w:ind w:left="720" w:firstLineChars="0" w:firstLine="0"/>
       </w:pPr>
     </w:p>
     <w:p>
       <w:pPr>
-        <w:pStyle w:val="a7"/>
+        <w:pStyle w:val="a9"/>
         <w:ind w:left="720" w:firstLineChars="0" w:firstLine="0"/>
       </w:pPr>
     </w:p>
     <w:p>
       <w:pPr>
-        <w:pStyle w:val="a7"/>
+        <w:pStyle w:val="a9"/>
         <w:ind w:left="720" w:firstLineChars="0" w:firstLine="0"/>
       </w:pPr>
       <w:r>
@@ -2117,13 +2179,13 @@
     </w:p>
     <w:p>
       <w:pPr>
-        <w:pStyle w:val="a7"/>
+        <w:pStyle w:val="a9"/>
         <w:ind w:left="720" w:firstLineChars="0" w:firstLine="0"/>
       </w:pPr>
     </w:p>
     <w:p>
       <w:pPr>
-        <w:pStyle w:val="a7"/>
+        <w:pStyle w:val="a9"/>
         <w:numPr>
           <w:ilvl w:val="0"/>
           <w:numId w:val="8"/>
@@ -2211,7 +2273,7 @@
     </w:p>
     <w:p>
       <w:pPr>
-        <w:pStyle w:val="a7"/>
+        <w:pStyle w:val="a9"/>
         <w:ind w:left="720" w:firstLineChars="0" w:firstLine="0"/>
       </w:pPr>
       <w:r>
@@ -2259,7 +2321,7 @@
     </w:p>
     <w:p>
       <w:pPr>
-        <w:pStyle w:val="a7"/>
+        <w:pStyle w:val="a9"/>
         <w:ind w:left="720" w:firstLineChars="0" w:firstLine="0"/>
       </w:pPr>
       <w:r>
@@ -2289,7 +2351,7 @@
     </w:p>
     <w:p>
       <w:pPr>
-        <w:pStyle w:val="a7"/>
+        <w:pStyle w:val="a9"/>
         <w:ind w:left="720" w:firstLineChars="0" w:firstLine="0"/>
       </w:pPr>
       <w:r>
@@ -2297,7 +2359,7 @@
           <w:noProof/>
         </w:rPr>
         <w:drawing>
-          <wp:inline distT="0" distB="0" distL="0" distR="0" wp14:anchorId="1A5D70FE" wp14:editId="486D9252">
+          <wp:inline distT="0" distB="0" distL="0" distR="0" wp14:anchorId="67E6F1CB" wp14:editId="21D6E505">
             <wp:extent cx="2955187" cy="2289975"/>
             <wp:effectExtent l="0" t="0" r="0" b="0"/>
             <wp:docPr id="20" name="图片 20"/>
@@ -2335,7 +2397,7 @@
     </w:p>
     <w:p>
       <w:pPr>
-        <w:pStyle w:val="a7"/>
+        <w:pStyle w:val="a9"/>
         <w:ind w:left="720" w:firstLineChars="0" w:firstLine="0"/>
       </w:pPr>
       <w:r>
@@ -2377,16 +2439,15 @@
     </w:p>
     <w:p>
       <w:pPr>
-        <w:pStyle w:val="a7"/>
+        <w:pStyle w:val="a9"/>
         <w:ind w:left="720" w:firstLineChars="0" w:firstLine="0"/>
       </w:pPr>
       <w:r>
         <w:rPr>
           <w:noProof/>
         </w:rPr>
-        <w:lastRenderedPageBreak/>
         <w:drawing>
-          <wp:inline distT="0" distB="0" distL="0" distR="0" wp14:anchorId="3B26AD6A" wp14:editId="4AEDE47A">
+          <wp:inline distT="0" distB="0" distL="0" distR="0" wp14:anchorId="4C1CB659" wp14:editId="048C63C1">
             <wp:extent cx="4428877" cy="1691857"/>
             <wp:effectExtent l="0" t="0" r="0" b="3810"/>
             <wp:docPr id="15" name="图片 15"/>
@@ -2424,7 +2485,7 @@
     </w:p>
     <w:p>
       <w:pPr>
-        <w:pStyle w:val="a7"/>
+        <w:pStyle w:val="a9"/>
         <w:ind w:left="720" w:firstLineChars="0" w:firstLine="0"/>
       </w:pPr>
       <w:r>
@@ -2466,15 +2527,16 @@
     </w:p>
     <w:p>
       <w:pPr>
-        <w:pStyle w:val="a7"/>
+        <w:pStyle w:val="a9"/>
         <w:ind w:left="720" w:firstLineChars="0" w:firstLine="0"/>
       </w:pPr>
       <w:r>
         <w:rPr>
           <w:noProof/>
         </w:rPr>
+        <w:lastRenderedPageBreak/>
         <w:drawing>
-          <wp:inline distT="0" distB="0" distL="0" distR="0" wp14:anchorId="0CC499FD" wp14:editId="1AF6672A">
+          <wp:inline distT="0" distB="0" distL="0" distR="0" wp14:anchorId="18DB9A6A" wp14:editId="3BBF89EF">
             <wp:extent cx="5581816" cy="1494845"/>
             <wp:effectExtent l="0" t="0" r="0" b="0"/>
             <wp:docPr id="21" name="图片 21"/>
@@ -2512,7 +2574,7 @@
     </w:p>
     <w:p>
       <w:pPr>
-        <w:pStyle w:val="a7"/>
+        <w:pStyle w:val="a9"/>
         <w:ind w:left="720" w:firstLineChars="0" w:firstLine="0"/>
       </w:pPr>
     </w:p>
@@ -2520,7 +2582,7 @@
     <w:p/>
     <w:p>
       <w:pPr>
-        <w:pStyle w:val="a7"/>
+        <w:pStyle w:val="a9"/>
         <w:numPr>
           <w:ilvl w:val="0"/>
           <w:numId w:val="8"/>
@@ -2590,7 +2652,7 @@
     </w:p>
     <w:p>
       <w:pPr>
-        <w:pStyle w:val="a7"/>
+        <w:pStyle w:val="a9"/>
         <w:ind w:left="720" w:firstLineChars="0" w:firstLine="0"/>
       </w:pPr>
       <w:r>
@@ -2602,7 +2664,7 @@
     </w:p>
     <w:p>
       <w:pPr>
-        <w:pStyle w:val="a7"/>
+        <w:pStyle w:val="a9"/>
         <w:ind w:left="720" w:firstLineChars="0" w:firstLine="0"/>
       </w:pPr>
       <w:r>
@@ -2610,7 +2672,7 @@
           <w:noProof/>
         </w:rPr>
         <w:drawing>
-          <wp:inline distT="0" distB="0" distL="0" distR="0" wp14:anchorId="60771C7A" wp14:editId="2A6AB559">
+          <wp:inline distT="0" distB="0" distL="0" distR="0" wp14:anchorId="3E1B5CDB" wp14:editId="3AC61EE4">
             <wp:extent cx="2411107" cy="1812897"/>
             <wp:effectExtent l="0" t="0" r="8255" b="0"/>
             <wp:docPr id="27" name="图片 27"/>
@@ -2648,7 +2710,7 @@
     </w:p>
     <w:p>
       <w:pPr>
-        <w:pStyle w:val="a7"/>
+        <w:pStyle w:val="a9"/>
         <w:ind w:left="720" w:firstLineChars="0" w:firstLine="0"/>
       </w:pPr>
       <w:r>
@@ -2656,7 +2718,7 @@
           <w:noProof/>
         </w:rPr>
         <w:drawing>
-          <wp:inline distT="0" distB="0" distL="0" distR="0" wp14:anchorId="78160602" wp14:editId="6E36ABEF">
+          <wp:inline distT="0" distB="0" distL="0" distR="0" wp14:anchorId="5D9BE8CB" wp14:editId="413E9707">
             <wp:extent cx="2408452" cy="1860606"/>
             <wp:effectExtent l="0" t="0" r="0" b="6350"/>
             <wp:docPr id="28" name="图片 28"/>
@@ -2694,7 +2756,7 @@
     </w:p>
     <w:p>
       <w:pPr>
-        <w:pStyle w:val="a7"/>
+        <w:pStyle w:val="a9"/>
         <w:ind w:left="720" w:firstLineChars="0" w:firstLine="0"/>
       </w:pPr>
       <w:r>
@@ -2724,16 +2786,15 @@
     </w:p>
     <w:p>
       <w:pPr>
-        <w:pStyle w:val="a7"/>
+        <w:pStyle w:val="a9"/>
         <w:ind w:left="720" w:firstLineChars="0" w:firstLine="0"/>
       </w:pPr>
       <w:r>
         <w:rPr>
           <w:noProof/>
         </w:rPr>
-        <w:lastRenderedPageBreak/>
         <w:drawing>
-          <wp:inline distT="0" distB="0" distL="0" distR="0" wp14:anchorId="25FD60EA" wp14:editId="6AF21321">
+          <wp:inline distT="0" distB="0" distL="0" distR="0" wp14:anchorId="1934B4DF" wp14:editId="160B93E0">
             <wp:extent cx="5486400" cy="814070"/>
             <wp:effectExtent l="0" t="0" r="0" b="5080"/>
             <wp:docPr id="23" name="图片 23"/>
@@ -2771,7 +2832,7 @@
     </w:p>
     <w:p>
       <w:pPr>
-        <w:pStyle w:val="a7"/>
+        <w:pStyle w:val="a9"/>
         <w:ind w:left="720" w:firstLineChars="0" w:firstLine="0"/>
       </w:pPr>
       <w:r>
@@ -2779,7 +2840,7 @@
           <w:noProof/>
         </w:rPr>
         <w:drawing>
-          <wp:inline distT="0" distB="0" distL="0" distR="0" wp14:anchorId="458D6BAF" wp14:editId="1C821131">
+          <wp:inline distT="0" distB="0" distL="0" distR="0" wp14:anchorId="5534A914" wp14:editId="604740A7">
             <wp:extent cx="5486400" cy="674370"/>
             <wp:effectExtent l="0" t="0" r="0" b="0"/>
             <wp:docPr id="25" name="图片 25"/>
@@ -2817,7 +2878,7 @@
     </w:p>
     <w:p>
       <w:pPr>
-        <w:pStyle w:val="a7"/>
+        <w:pStyle w:val="a9"/>
         <w:ind w:left="720" w:firstLineChars="0" w:firstLine="0"/>
       </w:pPr>
       <w:r>
@@ -2847,15 +2908,16 @@
     </w:p>
     <w:p>
       <w:pPr>
-        <w:pStyle w:val="a7"/>
+        <w:pStyle w:val="a9"/>
         <w:ind w:left="720" w:firstLineChars="0" w:firstLine="0"/>
       </w:pPr>
       <w:r>
         <w:rPr>
           <w:noProof/>
         </w:rPr>
+        <w:lastRenderedPageBreak/>
         <w:drawing>
-          <wp:inline distT="0" distB="0" distL="0" distR="0" wp14:anchorId="04DDCDE5" wp14:editId="5916B4CE">
+          <wp:inline distT="0" distB="0" distL="0" distR="0" wp14:anchorId="28881F16" wp14:editId="091D4F5C">
             <wp:extent cx="5486400" cy="757555"/>
             <wp:effectExtent l="0" t="0" r="0" b="4445"/>
             <wp:docPr id="26" name="图片 26"/>
@@ -2893,7 +2955,7 @@
     </w:p>
     <w:p>
       <w:pPr>
-        <w:pStyle w:val="a7"/>
+        <w:pStyle w:val="a9"/>
         <w:numPr>
           <w:ilvl w:val="0"/>
           <w:numId w:val="8"/>
@@ -2957,7 +3019,7 @@
     </w:p>
     <w:p>
       <w:pPr>
-        <w:pStyle w:val="a7"/>
+        <w:pStyle w:val="a9"/>
         <w:ind w:left="720" w:firstLineChars="0" w:firstLine="0"/>
       </w:pPr>
       <w:r>
@@ -2981,7 +3043,7 @@
     </w:p>
     <w:p>
       <w:pPr>
-        <w:pStyle w:val="a7"/>
+        <w:pStyle w:val="a9"/>
         <w:ind w:left="720" w:firstLineChars="0" w:firstLine="0"/>
       </w:pPr>
       <w:r>
@@ -2989,7 +3051,7 @@
           <w:noProof/>
         </w:rPr>
         <w:drawing>
-          <wp:inline distT="0" distB="0" distL="0" distR="0" wp14:anchorId="3A0A12F2" wp14:editId="529590BB">
+          <wp:inline distT="0" distB="0" distL="0" distR="0" wp14:anchorId="447A3106" wp14:editId="1EB77A4A">
             <wp:extent cx="5486400" cy="847725"/>
             <wp:effectExtent l="0" t="0" r="0" b="9525"/>
             <wp:docPr id="10" name="图片 10"/>
@@ -3027,7 +3089,7 @@
     </w:p>
     <w:p>
       <w:pPr>
-        <w:pStyle w:val="a7"/>
+        <w:pStyle w:val="a9"/>
         <w:ind w:left="720" w:firstLineChars="0" w:firstLine="0"/>
       </w:pPr>
       <w:r>
@@ -3035,7 +3097,7 @@
           <w:noProof/>
         </w:rPr>
         <w:drawing>
-          <wp:inline distT="0" distB="0" distL="0" distR="0" wp14:anchorId="5FD3E5DC" wp14:editId="638D33A2">
+          <wp:inline distT="0" distB="0" distL="0" distR="0" wp14:anchorId="7FDB2AD1" wp14:editId="16068E23">
             <wp:extent cx="5486400" cy="795020"/>
             <wp:effectExtent l="0" t="0" r="0" b="5080"/>
             <wp:docPr id="11" name="图片 11"/>
@@ -3073,7 +3135,7 @@
     </w:p>
     <w:p>
       <w:pPr>
-        <w:pStyle w:val="a7"/>
+        <w:pStyle w:val="a9"/>
         <w:ind w:left="720" w:firstLineChars="0" w:firstLine="0"/>
       </w:pPr>
       <w:r>
@@ -3097,7 +3159,7 @@
     </w:p>
     <w:p>
       <w:pPr>
-        <w:pStyle w:val="a7"/>
+        <w:pStyle w:val="a9"/>
         <w:ind w:left="720" w:firstLineChars="0" w:firstLine="0"/>
       </w:pPr>
       <w:r>
@@ -3105,7 +3167,7 @@
           <w:noProof/>
         </w:rPr>
         <w:drawing>
-          <wp:inline distT="0" distB="0" distL="0" distR="0" wp14:anchorId="0DEE061A" wp14:editId="09F2EA9A">
+          <wp:inline distT="0" distB="0" distL="0" distR="0" wp14:anchorId="14879216" wp14:editId="2FFC0067">
             <wp:extent cx="5486400" cy="595630"/>
             <wp:effectExtent l="0" t="0" r="0" b="0"/>
             <wp:docPr id="9" name="图片 9"/>
@@ -3143,7 +3205,7 @@
     </w:p>
     <w:p>
       <w:pPr>
-        <w:pStyle w:val="a7"/>
+        <w:pStyle w:val="a9"/>
         <w:ind w:left="720" w:firstLineChars="0" w:firstLine="0"/>
       </w:pPr>
     </w:p>
@@ -3174,16 +3236,16 @@
     </w:p>
     <w:p>
       <w:pPr>
-        <w:pStyle w:val="a7"/>
+        <w:pStyle w:val="a9"/>
         <w:ind w:leftChars="343" w:left="720" w:firstLineChars="150" w:firstLine="315"/>
       </w:pPr>
       <w:r>
         <w:rPr>
-          <w:rFonts w:ascii="DengXian" w:hAnsi="DengXian"/>
+          <w:rFonts w:ascii="等线" w:hAnsi="等线"/>
           <w:noProof/>
         </w:rPr>
         <w:drawing>
-          <wp:inline distT="0" distB="0" distL="0" distR="0">
+          <wp:inline distT="0" distB="0" distL="0" distR="0" wp14:anchorId="71A841E9" wp14:editId="5EF58752">
             <wp:extent cx="3912235" cy="1820545"/>
             <wp:effectExtent l="0" t="0" r="0" b="8255"/>
             <wp:docPr id="29" name="图片 29" descr="cid:image001.jpg@01D47AB3.89C94270"/>
@@ -3236,165 +3298,406 @@
       <w:pPr>
         <w:ind w:leftChars="450" w:left="945"/>
         <w:rPr>
-          <w:rFonts w:ascii="DengXian" w:hAnsi="DengXian" w:hint="eastAsia"/>
-        </w:rPr>
-      </w:pPr>
-      <w:r>
-        <w:rPr>
-          <w:rFonts w:ascii="DengXian" w:hAnsi="DengXian"/>
+          <w:rFonts w:ascii="等线" w:hAnsi="等线"/>
+        </w:rPr>
+      </w:pPr>
+      <w:r>
+        <w:rPr>
+          <w:rFonts w:ascii="等线" w:hAnsi="等线"/>
         </w:rPr>
         <w:t>Doutx</w:t>
       </w:r>
       <w:r>
         <w:rPr>
-          <w:rFonts w:ascii="DengXian" w:hAnsi="DengXian" w:hint="eastAsia"/>
+          <w:rFonts w:ascii="等线" w:hAnsi="等线" w:hint="eastAsia"/>
         </w:rPr>
         <w:t>的输出以</w:t>
       </w:r>
       <w:r>
         <w:rPr>
-          <w:rFonts w:ascii="DengXian" w:hAnsi="DengXian"/>
+          <w:rFonts w:ascii="等线" w:hAnsi="等线"/>
         </w:rPr>
         <w:t>DCLK</w:t>
       </w:r>
       <w:r>
         <w:rPr>
-          <w:rFonts w:ascii="DengXian" w:hAnsi="DengXian" w:hint="eastAsia"/>
+          <w:rFonts w:ascii="等线" w:hAnsi="等线" w:hint="eastAsia"/>
         </w:rPr>
         <w:t>的上升沿为参考</w:t>
       </w:r>
       <w:r>
         <w:rPr>
-          <w:rFonts w:ascii="DengXian" w:hAnsi="DengXian" w:hint="eastAsia"/>
+          <w:rFonts w:ascii="等线" w:hAnsi="等线" w:hint="eastAsia"/>
         </w:rPr>
         <w:t>（意思是：上升沿数据改变）</w:t>
       </w:r>
       <w:r>
         <w:rPr>
-          <w:rFonts w:ascii="DengXian" w:hAnsi="DengXian" w:hint="eastAsia"/>
+          <w:rFonts w:ascii="等线" w:hAnsi="等线" w:hint="eastAsia"/>
         </w:rPr>
         <w:t>，建议是检测到</w:t>
       </w:r>
       <w:r>
         <w:rPr>
-          <w:rFonts w:ascii="DengXian" w:hAnsi="DengXian"/>
+          <w:rFonts w:ascii="等线" w:hAnsi="等线"/>
           <w:color w:val="FF0000"/>
         </w:rPr>
         <w:t>DRDY</w:t>
       </w:r>
       <w:r>
         <w:rPr>
-          <w:rFonts w:ascii="DengXian" w:hAnsi="DengXian" w:hint="eastAsia"/>
+          <w:rFonts w:ascii="等线" w:hAnsi="等线" w:hint="eastAsia"/>
           <w:color w:val="FF0000"/>
         </w:rPr>
-        <w:t>下降</w:t>
-      </w:r>
-      <w:r>
-        <w:rPr>
-          <w:rFonts w:ascii="DengXian" w:hAnsi="DengXian" w:hint="eastAsia"/>
+        <w:t>下降沿</w:t>
+      </w:r>
+      <w:r>
+        <w:rPr>
+          <w:rFonts w:ascii="等线" w:hAnsi="等线" w:hint="eastAsia"/>
+        </w:rPr>
+        <w:t>后，再去检测</w:t>
+      </w:r>
+      <w:r>
+        <w:rPr>
+          <w:rFonts w:ascii="等线" w:hAnsi="等线"/>
           <w:color w:val="FF0000"/>
         </w:rPr>
+        <w:t>DCLK</w:t>
+      </w:r>
+      <w:r>
+        <w:rPr>
+          <w:rFonts w:ascii="等线" w:hAnsi="等线" w:hint="eastAsia"/>
+          <w:color w:val="FF0000"/>
+        </w:rPr>
+        <w:t>的下降沿</w:t>
+      </w:r>
+      <w:r>
+        <w:rPr>
+          <w:rFonts w:ascii="等线" w:hAnsi="等线" w:hint="eastAsia"/>
+        </w:rPr>
+        <w:t>将此下降沿对应的</w:t>
+      </w:r>
+      <w:r>
+        <w:rPr>
+          <w:rFonts w:ascii="等线" w:hAnsi="等线"/>
+        </w:rPr>
+        <w:t>DOUT</w:t>
+      </w:r>
+      <w:r>
+        <w:rPr>
+          <w:rFonts w:ascii="等线" w:hAnsi="等线" w:hint="eastAsia"/>
+        </w:rPr>
+        <w:t>保存，该值为有效数据。请采用该时序进行测试验证</w:t>
+      </w:r>
+      <w:r>
+        <w:rPr>
+          <w:rFonts w:ascii="等线" w:hAnsi="等线" w:hint="eastAsia"/>
+        </w:rPr>
+        <w:t>。</w:t>
+      </w:r>
+    </w:p>
+    <w:p>
+      <w:pPr>
+        <w:ind w:leftChars="450" w:left="945"/>
+        <w:rPr>
+          <w:rFonts w:ascii="等线" w:hAnsi="等线"/>
+        </w:rPr>
+      </w:pPr>
+    </w:p>
+    <w:p>
+      <w:pPr>
+        <w:ind w:leftChars="450" w:left="945"/>
+        <w:rPr>
+          <w:rFonts w:ascii="等线" w:hAnsi="等线"/>
+        </w:rPr>
+      </w:pPr>
+      <w:r>
+        <w:rPr>
+          <w:rFonts w:ascii="等线" w:hAnsi="等线" w:hint="eastAsia"/>
+        </w:rPr>
+        <w:t>2</w:t>
+      </w:r>
+      <w:r>
+        <w:rPr>
+          <w:rFonts w:ascii="等线" w:hAnsi="等线" w:hint="eastAsia"/>
+        </w:rPr>
+        <w:t>）</w:t>
+      </w:r>
+      <w:r>
+        <w:rPr>
+          <w:rFonts w:ascii="等线" w:hAnsi="等线" w:hint="eastAsia"/>
+        </w:rPr>
+        <w:t>DOUT</w:t>
+      </w:r>
+      <w:r>
+        <w:rPr>
+          <w:rFonts w:ascii="等线" w:hAnsi="等线" w:hint="eastAsia"/>
+        </w:rPr>
+        <w:t>时钟信号是一直存在的！</w:t>
+      </w:r>
+      <w:r>
+        <w:rPr>
+          <w:rFonts w:ascii="等线" w:hAnsi="等线" w:hint="eastAsia"/>
+        </w:rPr>
+        <w:t>空闲时钟极性高。</w:t>
+      </w:r>
+    </w:p>
+    <w:p/>
+    <w:p>
+      <w:r>
+        <w:rPr>
+          <w:rFonts w:hint="eastAsia"/>
+        </w:rPr>
+        <w:t>五．新的解决思路：</w:t>
+      </w:r>
+    </w:p>
+    <w:p>
+      <w:pPr>
+        <w:ind w:leftChars="207" w:left="750" w:hangingChars="150" w:hanging="315"/>
+      </w:pPr>
+      <w:r>
+        <w:rPr>
+          <w:rFonts w:hint="eastAsia"/>
+        </w:rPr>
+        <w:t>方案一：</w:t>
+      </w:r>
+      <w:r>
+        <w:rPr>
+          <w:rFonts w:hint="eastAsia"/>
+        </w:rPr>
+        <w:t>DRDY</w:t>
+      </w:r>
+      <w:r>
+        <w:rPr>
+          <w:rFonts w:hint="eastAsia"/>
+        </w:rPr>
+        <w:t>信号作为外部中断</w:t>
+      </w:r>
+      <w:r>
+        <w:rPr>
+          <w:rFonts w:hint="eastAsia"/>
+        </w:rPr>
+        <w:t>，</w:t>
+      </w:r>
+      <w:r>
+        <w:rPr>
+          <w:rFonts w:hint="eastAsia"/>
+        </w:rPr>
+        <w:t>在外部中断中打开</w:t>
+      </w:r>
+      <w:r>
+        <w:rPr>
+          <w:rFonts w:hint="eastAsia"/>
+        </w:rPr>
+        <w:t>SPI</w:t>
+      </w:r>
+      <w:r>
+        <w:rPr>
+          <w:rFonts w:hint="eastAsia"/>
+        </w:rPr>
+        <w:t>接收中断，</w:t>
+      </w:r>
+      <w:r>
+        <w:rPr>
+          <w:rFonts w:hint="eastAsia"/>
+        </w:rPr>
+        <w:t>SPI</w:t>
+      </w:r>
+      <w:r>
+        <w:rPr>
+          <w:rFonts w:hint="eastAsia"/>
+        </w:rPr>
+        <w:t>接收</w:t>
+      </w:r>
+      <w:r>
+        <w:rPr>
+          <w:rFonts w:hint="eastAsia"/>
+        </w:rPr>
+        <w:t>32</w:t>
+      </w:r>
+      <w:r>
+        <w:rPr>
+          <w:rFonts w:hint="eastAsia"/>
+        </w:rPr>
+        <w:t>个字节后，将</w:t>
+      </w:r>
+      <w:r>
+        <w:rPr>
+          <w:rFonts w:hint="eastAsia"/>
+        </w:rPr>
+        <w:t>SPI</w:t>
+      </w:r>
+      <w:r>
+        <w:rPr>
+          <w:rFonts w:hint="eastAsia"/>
+        </w:rPr>
+        <w:t>接收中断关闭</w:t>
+      </w:r>
+      <w:r>
+        <w:rPr>
+          <w:rFonts w:hint="eastAsia"/>
+        </w:rPr>
+        <w:t>。</w:t>
+      </w:r>
+    </w:p>
+    <w:p>
+      <w:pPr>
+        <w:ind w:firstLine="435"/>
+      </w:pPr>
+      <w:r>
+        <w:rPr>
+          <w:rFonts w:hint="eastAsia"/>
+        </w:rPr>
+        <w:t>1</w:t>
+      </w:r>
+      <w:r>
+        <w:rPr>
+          <w:rFonts w:hint="eastAsia"/>
+        </w:rPr>
+        <w:t>）可以看出</w:t>
+      </w:r>
+      <w:r>
+        <w:rPr>
+          <w:rFonts w:hint="eastAsia"/>
+        </w:rPr>
+        <w:t>K10</w:t>
+      </w:r>
+      <w:r>
+        <w:rPr>
+          <w:rFonts w:hint="eastAsia"/>
+        </w:rPr>
+        <w:t>的</w:t>
+      </w:r>
+      <w:r>
+        <w:rPr>
+          <w:rFonts w:hint="eastAsia"/>
+        </w:rPr>
+        <w:t>SPI</w:t>
+      </w:r>
+      <w:r>
+        <w:rPr>
+          <w:rFonts w:hint="eastAsia"/>
+        </w:rPr>
+        <w:t>时序必须匹配到</w:t>
+      </w:r>
+      <w:r>
+        <w:rPr>
+          <w:rFonts w:hint="eastAsia"/>
+        </w:rPr>
+        <w:t>AD</w:t>
+      </w:r>
+      <w:r>
+        <w:rPr>
+          <w:rFonts w:hint="eastAsia"/>
+        </w:rPr>
+        <w:t>，才有可能接收到完整</w:t>
+      </w:r>
+      <w:r>
+        <w:rPr>
+          <w:rFonts w:hint="eastAsia"/>
+        </w:rPr>
+        <w:t>AD</w:t>
+      </w:r>
+      <w:r>
+        <w:rPr>
+          <w:rFonts w:hint="eastAsia"/>
+        </w:rPr>
+        <w:t>数据。</w:t>
+      </w:r>
+    </w:p>
+    <w:p>
+      <w:pPr>
+        <w:ind w:leftChars="207" w:left="750" w:hangingChars="150" w:hanging="315"/>
+      </w:pPr>
+      <w:r>
+        <w:rPr>
+          <w:rFonts w:hint="eastAsia"/>
+        </w:rPr>
+        <w:t xml:space="preserve">   </w:t>
+      </w:r>
+      <w:r>
+        <w:rPr>
+          <w:rFonts w:hint="eastAsia"/>
+        </w:rPr>
+        <w:t>将</w:t>
+      </w:r>
+      <w:r>
+        <w:rPr>
+          <w:rFonts w:hint="eastAsia"/>
+        </w:rPr>
+        <w:t>AD</w:t>
+      </w:r>
+      <w:r>
+        <w:rPr>
+          <w:rFonts w:hint="eastAsia"/>
+        </w:rPr>
+        <w:t>的时钟频率降低，提高</w:t>
+      </w:r>
+      <w:r>
+        <w:rPr>
+          <w:rFonts w:hint="eastAsia"/>
+        </w:rPr>
+        <w:t>K10</w:t>
+      </w:r>
+      <w:r>
+        <w:rPr>
+          <w:rFonts w:hint="eastAsia"/>
+        </w:rPr>
+        <w:t>的响应（所以没有用的程序都关闭）看是否能“抓”到</w:t>
+      </w:r>
+      <w:r>
+        <w:rPr>
+          <w:rFonts w:hint="eastAsia"/>
+        </w:rPr>
+        <w:t>AD</w:t>
+      </w:r>
+      <w:r>
+        <w:rPr>
+          <w:rFonts w:hint="eastAsia"/>
+        </w:rPr>
+        <w:t>的</w:t>
+      </w:r>
+      <w:r>
+        <w:rPr>
+          <w:rFonts w:hint="eastAsia"/>
+        </w:rPr>
         <w:lastRenderedPageBreak/>
-        <w:t>沿</w:t>
-      </w:r>
-      <w:r>
-        <w:rPr>
-          <w:rFonts w:ascii="DengXian" w:hAnsi="DengXian" w:hint="eastAsia"/>
-        </w:rPr>
-        <w:t>后，再去检测</w:t>
-      </w:r>
-      <w:r>
-        <w:rPr>
-          <w:rFonts w:ascii="DengXian" w:hAnsi="DengXian"/>
-          <w:color w:val="FF0000"/>
-        </w:rPr>
-        <w:t>DCLK</w:t>
-      </w:r>
-      <w:r>
-        <w:rPr>
-          <w:rFonts w:ascii="DengXian" w:hAnsi="DengXian" w:hint="eastAsia"/>
-          <w:color w:val="FF0000"/>
-        </w:rPr>
-        <w:t>的下降沿</w:t>
-      </w:r>
-      <w:r>
-        <w:rPr>
-          <w:rFonts w:ascii="DengXian" w:hAnsi="DengXian" w:hint="eastAsia"/>
-        </w:rPr>
-        <w:t>将此下降沿对应的</w:t>
-      </w:r>
-      <w:r>
-        <w:rPr>
-          <w:rFonts w:ascii="DengXian" w:hAnsi="DengXian"/>
-        </w:rPr>
-        <w:t>DOUT</w:t>
-      </w:r>
-      <w:r>
-        <w:rPr>
-          <w:rFonts w:ascii="DengXian" w:hAnsi="DengXian" w:hint="eastAsia"/>
-        </w:rPr>
-        <w:t>保存，该值为有效数据。请采用该时序进行测试验证</w:t>
-      </w:r>
-      <w:r>
-        <w:rPr>
-          <w:rFonts w:ascii="DengXian" w:hAnsi="DengXian" w:hint="eastAsia"/>
-        </w:rPr>
-        <w:t>。</w:t>
-      </w:r>
-    </w:p>
-    <w:p>
-      <w:pPr>
-        <w:ind w:leftChars="450" w:left="945"/>
-        <w:rPr>
-          <w:rFonts w:ascii="DengXian" w:hAnsi="DengXian" w:hint="eastAsia"/>
-        </w:rPr>
-      </w:pPr>
-    </w:p>
-    <w:p>
-      <w:pPr>
-        <w:ind w:leftChars="450" w:left="945"/>
-        <w:rPr>
-          <w:rFonts w:ascii="DengXian" w:hAnsi="DengXian" w:hint="eastAsia"/>
-        </w:rPr>
-      </w:pPr>
-      <w:r>
-        <w:rPr>
-          <w:rFonts w:ascii="DengXian" w:hAnsi="DengXian" w:hint="eastAsia"/>
+        <w:t>数据；</w:t>
+      </w:r>
+      <w:r>
+        <w:rPr>
+          <w:rFonts w:hint="eastAsia"/>
+        </w:rPr>
+        <w:t xml:space="preserve"> </w:t>
+      </w:r>
+    </w:p>
+    <w:p>
+      <w:pPr>
+        <w:ind w:leftChars="207" w:left="750" w:hangingChars="150" w:hanging="315"/>
+      </w:pPr>
+      <w:r>
+        <w:rPr>
+          <w:rFonts w:hint="eastAsia"/>
         </w:rPr>
         <w:t>2</w:t>
       </w:r>
       <w:r>
         <w:rPr>
-          <w:rFonts w:ascii="DengXian" w:hAnsi="DengXian" w:hint="eastAsia"/>
-        </w:rPr>
-        <w:t>）</w:t>
-      </w:r>
-      <w:r>
-        <w:rPr>
-          <w:rFonts w:ascii="DengXian" w:hAnsi="DengXian" w:hint="eastAsia"/>
-        </w:rPr>
-        <w:t>DOUT</w:t>
-      </w:r>
-      <w:r>
-        <w:rPr>
-          <w:rFonts w:ascii="DengXian" w:hAnsi="DengXian" w:hint="eastAsia"/>
-        </w:rPr>
-        <w:t>时钟信号是一直存在的！</w:t>
-      </w:r>
-      <w:r>
-        <w:rPr>
-          <w:rFonts w:ascii="DengXian" w:hAnsi="DengXian" w:hint="eastAsia"/>
-        </w:rPr>
-        <w:t>空闲时钟极性高。</w:t>
-      </w:r>
-    </w:p>
-    <w:p/>
-    <w:p>
-      <w:r>
-        <w:rPr>
-          <w:rFonts w:hint="eastAsia"/>
-        </w:rPr>
-        <w:t>五．新的解决思路：</w:t>
+          <w:rFonts w:hint="eastAsia"/>
+        </w:rPr>
+        <w:t>）可以看出必须配置</w:t>
+      </w:r>
+      <w:r>
+        <w:rPr>
+          <w:rFonts w:hint="eastAsia"/>
+        </w:rPr>
+        <w:t>K10</w:t>
+      </w:r>
+      <w:r>
+        <w:rPr>
+          <w:rFonts w:hint="eastAsia"/>
+        </w:rPr>
+        <w:t>在下降沿采样数据。</w:t>
       </w:r>
     </w:p>
     <w:p>
@@ -3403,252 +3706,10 @@
       </w:pPr>
       <w:r>
         <w:rPr>
-          <w:rFonts w:hint="eastAsia"/>
-        </w:rPr>
-        <w:t>方案一：</w:t>
-      </w:r>
-      <w:r>
-        <w:rPr>
-          <w:rFonts w:hint="eastAsia"/>
-        </w:rPr>
-        <w:t>DRDY</w:t>
-      </w:r>
-      <w:r>
-        <w:rPr>
-          <w:rFonts w:hint="eastAsia"/>
-        </w:rPr>
-        <w:t>信号作为外部中断</w:t>
-      </w:r>
-      <w:r>
-        <w:rPr>
-          <w:rFonts w:hint="eastAsia"/>
-        </w:rPr>
-        <w:t>，</w:t>
-      </w:r>
-      <w:r>
-        <w:rPr>
-          <w:rFonts w:hint="eastAsia"/>
-        </w:rPr>
-        <w:t>在外部中断中打开</w:t>
-      </w:r>
-      <w:r>
-        <w:rPr>
-          <w:rFonts w:hint="eastAsia"/>
-        </w:rPr>
-        <w:t>SPI</w:t>
-      </w:r>
-      <w:r>
-        <w:rPr>
-          <w:rFonts w:hint="eastAsia"/>
-        </w:rPr>
-        <w:t>接收中断，</w:t>
-      </w:r>
-      <w:r>
-        <w:rPr>
-          <w:rFonts w:hint="eastAsia"/>
-        </w:rPr>
-        <w:t>SPI</w:t>
-      </w:r>
-      <w:r>
-        <w:rPr>
-          <w:rFonts w:hint="eastAsia"/>
-        </w:rPr>
-        <w:t>接收</w:t>
-      </w:r>
-      <w:r>
-        <w:rPr>
-          <w:rFonts w:hint="eastAsia"/>
-        </w:rPr>
-        <w:t>32</w:t>
-      </w:r>
-      <w:r>
-        <w:rPr>
-          <w:rFonts w:hint="eastAsia"/>
-        </w:rPr>
-        <w:t>个字节后，将</w:t>
-      </w:r>
-      <w:r>
-        <w:rPr>
-          <w:rFonts w:hint="eastAsia"/>
-        </w:rPr>
-        <w:t>SPI</w:t>
-      </w:r>
-      <w:r>
-        <w:rPr>
-          <w:rFonts w:hint="eastAsia"/>
-        </w:rPr>
-        <w:t>接收中断关闭</w:t>
-      </w:r>
-      <w:r>
-        <w:rPr>
-          <w:rFonts w:hint="eastAsia"/>
-        </w:rPr>
-        <w:t>。</w:t>
-      </w:r>
-    </w:p>
-    <w:p>
-      <w:pPr>
-        <w:ind w:firstLine="435"/>
-      </w:pPr>
-      <w:r>
-        <w:rPr>
-          <w:rFonts w:hint="eastAsia"/>
-        </w:rPr>
-        <w:t>1</w:t>
-      </w:r>
-      <w:r>
-        <w:rPr>
-          <w:rFonts w:hint="eastAsia"/>
-        </w:rPr>
-        <w:t>）可以看出</w:t>
-      </w:r>
-      <w:r>
-        <w:rPr>
-          <w:rFonts w:hint="eastAsia"/>
-        </w:rPr>
-        <w:t>K10</w:t>
-      </w:r>
-      <w:r>
-        <w:rPr>
-          <w:rFonts w:hint="eastAsia"/>
-        </w:rPr>
-        <w:t>的</w:t>
-      </w:r>
-      <w:r>
-        <w:rPr>
-          <w:rFonts w:hint="eastAsia"/>
-        </w:rPr>
-        <w:t>SPI</w:t>
-      </w:r>
-      <w:r>
-        <w:rPr>
-          <w:rFonts w:hint="eastAsia"/>
-        </w:rPr>
-        <w:t>时序必须匹配到</w:t>
-      </w:r>
-      <w:r>
-        <w:rPr>
-          <w:rFonts w:hint="eastAsia"/>
-        </w:rPr>
-        <w:t>AD</w:t>
-      </w:r>
-      <w:r>
-        <w:rPr>
-          <w:rFonts w:hint="eastAsia"/>
-        </w:rPr>
-        <w:t>，才有可能接收到完整</w:t>
-      </w:r>
-      <w:r>
-        <w:rPr>
-          <w:rFonts w:hint="eastAsia"/>
-        </w:rPr>
-        <w:t>AD</w:t>
-      </w:r>
-      <w:r>
-        <w:rPr>
-          <w:rFonts w:hint="eastAsia"/>
-        </w:rPr>
-        <w:t>数据。</w:t>
-      </w:r>
-    </w:p>
-    <w:p>
-      <w:pPr>
-        <w:ind w:leftChars="207" w:left="750" w:hangingChars="150" w:hanging="315"/>
-      </w:pPr>
-      <w:r>
-        <w:rPr>
-          <w:rFonts w:hint="eastAsia"/>
-        </w:rPr>
-        <w:t xml:space="preserve">   </w:t>
-      </w:r>
-      <w:r>
-        <w:rPr>
-          <w:rFonts w:hint="eastAsia"/>
-        </w:rPr>
-        <w:t>将</w:t>
-      </w:r>
-      <w:r>
-        <w:rPr>
-          <w:rFonts w:hint="eastAsia"/>
-        </w:rPr>
-        <w:t>AD</w:t>
-      </w:r>
-      <w:r>
-        <w:rPr>
-          <w:rFonts w:hint="eastAsia"/>
-        </w:rPr>
-        <w:t>的时钟频率降低，提高</w:t>
-      </w:r>
-      <w:r>
-        <w:rPr>
-          <w:rFonts w:hint="eastAsia"/>
-        </w:rPr>
-        <w:t>K10</w:t>
-      </w:r>
-      <w:r>
-        <w:rPr>
-          <w:rFonts w:hint="eastAsia"/>
-        </w:rPr>
-        <w:t>的响应（所以没有用的程序都关闭）看是否能“抓”到</w:t>
-      </w:r>
-      <w:r>
-        <w:rPr>
-          <w:rFonts w:hint="eastAsia"/>
-        </w:rPr>
-        <w:t>AD</w:t>
-      </w:r>
-      <w:r>
-        <w:rPr>
-          <w:rFonts w:hint="eastAsia"/>
-        </w:rPr>
-        <w:t>的数据；</w:t>
-      </w:r>
-      <w:r>
-        <w:rPr>
-          <w:rFonts w:hint="eastAsia"/>
-        </w:rPr>
-        <w:t xml:space="preserve"> </w:t>
-      </w:r>
-    </w:p>
-    <w:p>
-      <w:pPr>
-        <w:ind w:leftChars="207" w:left="750" w:hangingChars="150" w:hanging="315"/>
-      </w:pPr>
-      <w:r>
-        <w:rPr>
-          <w:rFonts w:hint="eastAsia"/>
-        </w:rPr>
-        <w:t>2</w:t>
-      </w:r>
-      <w:r>
-        <w:rPr>
-          <w:rFonts w:hint="eastAsia"/>
-        </w:rPr>
-        <w:t>）可以看出必须配置</w:t>
-      </w:r>
-      <w:r>
-        <w:rPr>
-          <w:rFonts w:hint="eastAsia"/>
-        </w:rPr>
-        <w:t>K10</w:t>
-      </w:r>
-      <w:r>
-        <w:rPr>
-          <w:rFonts w:hint="eastAsia"/>
-        </w:rPr>
-        <w:t>在下降沿采样数据。</w:t>
-      </w:r>
-    </w:p>
-    <w:p>
-      <w:pPr>
-        <w:ind w:leftChars="207" w:left="750" w:hangingChars="150" w:hanging="315"/>
-      </w:pPr>
-      <w:r>
-        <w:rPr>
           <w:noProof/>
         </w:rPr>
         <w:drawing>
-          <wp:inline distT="0" distB="0" distL="0" distR="0" wp14:anchorId="7152EAA8" wp14:editId="6855CFCA">
+          <wp:inline distT="0" distB="0" distL="0" distR="0" wp14:anchorId="0C55426A" wp14:editId="3DE18605">
             <wp:extent cx="1922405" cy="3275937"/>
             <wp:effectExtent l="0" t="0" r="1905" b="1270"/>
             <wp:docPr id="38" name="图片 38"/>
@@ -3903,7 +3964,7 @@
     </w:p>
     <w:p>
       <w:pPr>
-        <w:pStyle w:val="a7"/>
+        <w:pStyle w:val="a9"/>
         <w:ind w:left="795" w:firstLineChars="0" w:firstLine="0"/>
       </w:pPr>
       <w:r>
@@ -3912,7 +3973,7 @@
         </w:rPr>
         <w:lastRenderedPageBreak/>
         <w:drawing>
-          <wp:inline distT="0" distB="0" distL="0" distR="0" wp14:anchorId="7B72A838" wp14:editId="78AC5D55">
+          <wp:inline distT="0" distB="0" distL="0" distR="0" wp14:anchorId="0FDF396C" wp14:editId="01AAA247">
             <wp:extent cx="1685372" cy="3490623"/>
             <wp:effectExtent l="0" t="0" r="0" b="0"/>
             <wp:docPr id="34" name="图片 34"/>
@@ -4011,7 +4072,7 @@
     </w:p>
     <w:p>
       <w:pPr>
-        <w:pStyle w:val="a7"/>
+        <w:pStyle w:val="a9"/>
         <w:ind w:left="1080" w:firstLineChars="0" w:firstLine="0"/>
       </w:pPr>
       <w:r>
@@ -4019,7 +4080,7 @@
           <w:noProof/>
         </w:rPr>
         <w:drawing>
-          <wp:inline distT="0" distB="0" distL="0" distR="0" wp14:anchorId="243122CE" wp14:editId="01C1F9AB">
+          <wp:inline distT="0" distB="0" distL="0" distR="0" wp14:anchorId="0A20408F" wp14:editId="12595B5C">
             <wp:extent cx="5486400" cy="1014730"/>
             <wp:effectExtent l="0" t="0" r="0" b="0"/>
             <wp:docPr id="43" name="图片 43"/>
@@ -4057,7 +4118,7 @@
     </w:p>
     <w:p>
       <w:pPr>
-        <w:pStyle w:val="a7"/>
+        <w:pStyle w:val="a9"/>
         <w:ind w:left="1080" w:firstLineChars="0" w:firstLine="0"/>
       </w:pPr>
       <w:r>
@@ -4065,7 +4126,7 @@
           <w:noProof/>
         </w:rPr>
         <w:drawing>
-          <wp:inline distT="0" distB="0" distL="0" distR="0" wp14:anchorId="1F063B9D" wp14:editId="56440B20">
+          <wp:inline distT="0" distB="0" distL="0" distR="0" wp14:anchorId="0912A5BE" wp14:editId="2B6D1FA3">
             <wp:extent cx="5486400" cy="976630"/>
             <wp:effectExtent l="0" t="0" r="0" b="0"/>
             <wp:docPr id="37" name="图片 37"/>
@@ -4103,7 +4164,7 @@
     </w:p>
     <w:p>
       <w:pPr>
-        <w:pStyle w:val="a7"/>
+        <w:pStyle w:val="a9"/>
         <w:ind w:left="1080" w:firstLineChars="0" w:firstLine="0"/>
       </w:pPr>
     </w:p>
@@ -4186,7 +4247,7 @@
     </w:p>
     <w:p>
       <w:pPr>
-        <w:pStyle w:val="a7"/>
+        <w:pStyle w:val="a9"/>
         <w:ind w:left="1080" w:firstLineChars="0" w:firstLine="0"/>
       </w:pPr>
       <w:r>
@@ -4194,7 +4255,7 @@
           <w:noProof/>
         </w:rPr>
         <w:drawing>
-          <wp:inline distT="0" distB="0" distL="0" distR="0" wp14:anchorId="565BB05B" wp14:editId="482A3503">
+          <wp:inline distT="0" distB="0" distL="0" distR="0" wp14:anchorId="1463757D" wp14:editId="469F0042">
             <wp:extent cx="5486400" cy="1405255"/>
             <wp:effectExtent l="0" t="0" r="0" b="4445"/>
             <wp:docPr id="39" name="图片 39"/>
@@ -4232,7 +4293,7 @@
     </w:p>
     <w:p>
       <w:pPr>
-        <w:pStyle w:val="a7"/>
+        <w:pStyle w:val="a9"/>
         <w:ind w:left="1080" w:firstLineChars="0" w:firstLine="0"/>
       </w:pPr>
       <w:r>
@@ -4256,7 +4317,7 @@
     </w:p>
     <w:p>
       <w:pPr>
-        <w:pStyle w:val="a7"/>
+        <w:pStyle w:val="a9"/>
         <w:ind w:left="1080" w:firstLineChars="0" w:firstLine="0"/>
       </w:pPr>
       <w:r>
@@ -4265,7 +4326,7 @@
         </w:rPr>
         <w:lastRenderedPageBreak/>
         <w:drawing>
-          <wp:inline distT="0" distB="0" distL="0" distR="0" wp14:anchorId="3D0FA267" wp14:editId="1CB8F5C0">
+          <wp:inline distT="0" distB="0" distL="0" distR="0" wp14:anchorId="5CD9BCE1" wp14:editId="282FDE41">
             <wp:extent cx="1383527" cy="8953169"/>
             <wp:effectExtent l="0" t="0" r="7620" b="635"/>
             <wp:docPr id="42" name="图片 42"/>
@@ -4352,7 +4413,7 @@
           <w:noProof/>
         </w:rPr>
         <w:drawing>
-          <wp:inline distT="0" distB="0" distL="0" distR="0" wp14:anchorId="1D2216FF" wp14:editId="044C98A9">
+          <wp:inline distT="0" distB="0" distL="0" distR="0" wp14:anchorId="4F6E2746" wp14:editId="4FE58318">
             <wp:extent cx="5486400" cy="1014095"/>
             <wp:effectExtent l="0" t="0" r="0" b="0"/>
             <wp:docPr id="31" name="图片 31"/>
@@ -4432,7 +4493,7 @@
           <w:noProof/>
         </w:rPr>
         <w:drawing>
-          <wp:inline distT="0" distB="0" distL="0" distR="0" wp14:anchorId="439E36A5" wp14:editId="38CB2D93">
+          <wp:inline distT="0" distB="0" distL="0" distR="0" wp14:anchorId="32E30151" wp14:editId="49B652D9">
             <wp:extent cx="1407381" cy="2988360"/>
             <wp:effectExtent l="0" t="0" r="2540" b="2540"/>
             <wp:docPr id="32" name="图片 32"/>
@@ -4524,7 +4585,7 @@
           <w:noProof/>
         </w:rPr>
         <w:drawing>
-          <wp:inline distT="0" distB="0" distL="0" distR="0" wp14:anchorId="6D0BCE1E" wp14:editId="0C76281A">
+          <wp:inline distT="0" distB="0" distL="0" distR="0" wp14:anchorId="7295212D" wp14:editId="5E26AD16">
             <wp:extent cx="5486400" cy="975360"/>
             <wp:effectExtent l="0" t="0" r="0" b="0"/>
             <wp:docPr id="33" name="图片 33"/>
@@ -4592,7 +4653,7 @@
           <w:noProof/>
         </w:rPr>
         <w:drawing>
-          <wp:inline distT="0" distB="0" distL="0" distR="0" wp14:anchorId="773CDF02" wp14:editId="754459F7">
+          <wp:inline distT="0" distB="0" distL="0" distR="0" wp14:anchorId="0CCB1B02" wp14:editId="66D7D26C">
             <wp:extent cx="1474892" cy="2695492"/>
             <wp:effectExtent l="0" t="0" r="0" b="0"/>
             <wp:docPr id="35" name="图片 35"/>
@@ -4630,7 +4691,7 @@
     </w:p>
     <w:p>
       <w:pPr>
-        <w:pStyle w:val="a7"/>
+        <w:pStyle w:val="a9"/>
         <w:ind w:left="1080" w:firstLineChars="0" w:firstLine="0"/>
       </w:pPr>
       <w:r>
@@ -4685,7 +4746,7 @@
     </w:p>
     <w:p>
       <w:pPr>
-        <w:pStyle w:val="a7"/>
+        <w:pStyle w:val="a9"/>
         <w:ind w:left="1080" w:firstLineChars="0" w:firstLine="0"/>
         <w:rPr>
           <w:color w:val="1F497D"/>
@@ -4697,7 +4758,7 @@
           <w:color w:val="1F497D"/>
         </w:rPr>
         <w:drawing>
-          <wp:inline distT="0" distB="0" distL="0" distR="0">
+          <wp:inline distT="0" distB="0" distL="0" distR="0" wp14:anchorId="00B06A01" wp14:editId="0ADF6A01">
             <wp:extent cx="2512612" cy="2207096"/>
             <wp:effectExtent l="0" t="0" r="2540" b="3175"/>
             <wp:docPr id="40" name="图片 40" descr="cid:image001.jpg@01D47B75.1F63A0C0"/>
@@ -4757,7 +4818,7 @@
           <w:color w:val="1F497D"/>
         </w:rPr>
         <w:drawing>
-          <wp:inline distT="0" distB="0" distL="0" distR="0">
+          <wp:inline distT="0" distB="0" distL="0" distR="0" wp14:anchorId="37F26056" wp14:editId="68669C84">
             <wp:extent cx="2584174" cy="2256021"/>
             <wp:effectExtent l="0" t="0" r="6985" b="0"/>
             <wp:docPr id="41" name="图片 41" descr="cid:image002.jpg@01D47B75.1F63A0C0"/>
@@ -4855,7 +4916,7 @@
     </w:p>
     <w:p>
       <w:pPr>
-        <w:pStyle w:val="a7"/>
+        <w:pStyle w:val="a9"/>
         <w:ind w:left="1080" w:firstLineChars="0" w:firstLine="0"/>
       </w:pPr>
       <w:r>
@@ -4863,7 +4924,7 @@
           <w:noProof/>
         </w:rPr>
         <w:drawing>
-          <wp:inline distT="0" distB="0" distL="0" distR="0" wp14:anchorId="4D7DC44F" wp14:editId="294DE87C">
+          <wp:inline distT="0" distB="0" distL="0" distR="0" wp14:anchorId="438F713C" wp14:editId="70F7D93E">
             <wp:extent cx="5486400" cy="1022985"/>
             <wp:effectExtent l="0" t="0" r="0" b="5715"/>
             <wp:docPr id="30" name="图片 30"/>
@@ -4937,7 +4998,7 @@
       <w:hyperlink r:id="rId52" w:history="1">
         <w:r>
           <w:rPr>
-            <w:rStyle w:val="a8"/>
+            <w:rStyle w:val="aa"/>
           </w:rPr>
           <w:t>https://ez.analog.com/cn/data-converters/f/q-a/94055/ad7779</w:t>
         </w:r>
@@ -5029,47 +5090,47 @@
       <w:pPr>
         <w:ind w:firstLineChars="500" w:firstLine="1050"/>
         <w:rPr>
-          <w:rFonts w:ascii="DengXian" w:hAnsi="DengXian" w:hint="eastAsia"/>
-        </w:rPr>
-      </w:pPr>
-      <w:r>
-        <w:rPr>
-          <w:rFonts w:ascii="DengXian" w:hAnsi="DengXian" w:hint="eastAsia"/>
+          <w:rFonts w:ascii="等线" w:hAnsi="等线"/>
+        </w:rPr>
+      </w:pPr>
+      <w:r>
+        <w:rPr>
+          <w:rFonts w:ascii="等线" w:hAnsi="等线" w:hint="eastAsia"/>
         </w:rPr>
         <w:t>DOUT</w:t>
       </w:r>
       <w:r>
         <w:rPr>
-          <w:rFonts w:ascii="DengXian" w:hAnsi="DengXian" w:hint="eastAsia"/>
+          <w:rFonts w:ascii="等线" w:hAnsi="等线" w:hint="eastAsia"/>
         </w:rPr>
         <w:t>时钟信号是一直存在的！</w:t>
       </w:r>
       <w:r>
         <w:rPr>
-          <w:rFonts w:ascii="DengXian" w:hAnsi="DengXian" w:hint="eastAsia"/>
+          <w:rFonts w:ascii="等线" w:hAnsi="等线" w:hint="eastAsia"/>
           <w:b/>
         </w:rPr>
         <w:t>空闲时钟极性高</w:t>
       </w:r>
       <w:r>
         <w:rPr>
-          <w:rFonts w:ascii="DengXian" w:hAnsi="DengXian" w:hint="eastAsia"/>
+          <w:rFonts w:ascii="等线" w:hAnsi="等线" w:hint="eastAsia"/>
         </w:rPr>
         <w:t>。</w:t>
       </w:r>
     </w:p>
     <w:p>
       <w:pPr>
-        <w:pStyle w:val="a7"/>
+        <w:pStyle w:val="a9"/>
         <w:ind w:leftChars="343" w:left="720" w:firstLineChars="150" w:firstLine="315"/>
       </w:pPr>
       <w:r>
         <w:rPr>
-          <w:rFonts w:ascii="DengXian" w:hAnsi="DengXian"/>
+          <w:rFonts w:ascii="等线" w:hAnsi="等线"/>
           <w:noProof/>
         </w:rPr>
         <w:drawing>
-          <wp:inline distT="0" distB="0" distL="0" distR="0" wp14:anchorId="7B12C2F2" wp14:editId="19CDA5FE">
+          <wp:inline distT="0" distB="0" distL="0" distR="0" wp14:anchorId="6F56268B" wp14:editId="5711889F">
             <wp:extent cx="3912235" cy="1820545"/>
             <wp:effectExtent l="0" t="0" r="0" b="8255"/>
             <wp:docPr id="44" name="图片 44" descr="cid:image001.jpg@01D47AB3.89C94270"/>
@@ -5122,82 +5183,82 @@
       <w:pPr>
         <w:ind w:leftChars="450" w:left="945"/>
         <w:rPr>
-          <w:rFonts w:ascii="DengXian" w:hAnsi="DengXian" w:hint="eastAsia"/>
-        </w:rPr>
-      </w:pPr>
-      <w:r>
-        <w:rPr>
-          <w:rFonts w:ascii="DengXian" w:hAnsi="DengXian"/>
+          <w:rFonts w:ascii="等线" w:hAnsi="等线"/>
+        </w:rPr>
+      </w:pPr>
+      <w:r>
+        <w:rPr>
+          <w:rFonts w:ascii="等线" w:hAnsi="等线"/>
         </w:rPr>
         <w:t>Doutx</w:t>
       </w:r>
       <w:r>
         <w:rPr>
-          <w:rFonts w:ascii="DengXian" w:hAnsi="DengXian" w:hint="eastAsia"/>
+          <w:rFonts w:ascii="等线" w:hAnsi="等线" w:hint="eastAsia"/>
         </w:rPr>
         <w:t>的输出以</w:t>
       </w:r>
       <w:r>
         <w:rPr>
-          <w:rFonts w:ascii="DengXian" w:hAnsi="DengXian"/>
+          <w:rFonts w:ascii="等线" w:hAnsi="等线"/>
         </w:rPr>
         <w:t>DCLK</w:t>
       </w:r>
       <w:r>
         <w:rPr>
-          <w:rFonts w:ascii="DengXian" w:hAnsi="DengXian" w:hint="eastAsia"/>
+          <w:rFonts w:ascii="等线" w:hAnsi="等线" w:hint="eastAsia"/>
         </w:rPr>
         <w:t>的上升沿为参考（意思是：上升沿数据改变），建议是检测到</w:t>
       </w:r>
       <w:r>
         <w:rPr>
-          <w:rFonts w:ascii="DengXian" w:hAnsi="DengXian"/>
+          <w:rFonts w:ascii="等线" w:hAnsi="等线"/>
           <w:color w:val="FF0000"/>
         </w:rPr>
         <w:t>DRDY</w:t>
       </w:r>
       <w:r>
         <w:rPr>
-          <w:rFonts w:ascii="DengXian" w:hAnsi="DengXian" w:hint="eastAsia"/>
+          <w:rFonts w:ascii="等线" w:hAnsi="等线" w:hint="eastAsia"/>
           <w:color w:val="FF0000"/>
         </w:rPr>
         <w:t>下降沿</w:t>
       </w:r>
       <w:r>
         <w:rPr>
-          <w:rFonts w:ascii="DengXian" w:hAnsi="DengXian" w:hint="eastAsia"/>
+          <w:rFonts w:ascii="等线" w:hAnsi="等线" w:hint="eastAsia"/>
         </w:rPr>
         <w:t>后，再去检测</w:t>
       </w:r>
       <w:r>
         <w:rPr>
-          <w:rFonts w:ascii="DengXian" w:hAnsi="DengXian"/>
+          <w:rFonts w:ascii="等线" w:hAnsi="等线"/>
           <w:color w:val="FF0000"/>
         </w:rPr>
         <w:t>DCLK</w:t>
       </w:r>
       <w:r>
         <w:rPr>
-          <w:rFonts w:ascii="DengXian" w:hAnsi="DengXian" w:hint="eastAsia"/>
+          <w:rFonts w:ascii="等线" w:hAnsi="等线" w:hint="eastAsia"/>
           <w:color w:val="FF0000"/>
         </w:rPr>
         <w:t>的下降沿</w:t>
       </w:r>
       <w:r>
         <w:rPr>
-          <w:rFonts w:ascii="DengXian" w:hAnsi="DengXian" w:hint="eastAsia"/>
+          <w:rFonts w:ascii="等线" w:hAnsi="等线" w:hint="eastAsia"/>
         </w:rPr>
         <w:t>将此下降沿对应的</w:t>
       </w:r>
       <w:r>
         <w:rPr>
-          <w:rFonts w:ascii="DengXian" w:hAnsi="DengXian"/>
+          <w:rFonts w:ascii="等线" w:hAnsi="等线"/>
         </w:rPr>
         <w:t>DOUT</w:t>
       </w:r>
       <w:r>
         <w:rPr>
-          <w:rFonts w:ascii="DengXian" w:hAnsi="DengXian" w:hint="eastAsia"/>
+          <w:rFonts w:ascii="等线" w:hAnsi="等线" w:hint="eastAsia"/>
         </w:rPr>
         <w:t>保存，该值为有效数据。请采用该时序进行测试验证。</w:t>
       </w:r>
@@ -5206,7 +5267,7 @@
       <w:pPr>
         <w:ind w:leftChars="450" w:left="945"/>
         <w:rPr>
-          <w:rFonts w:ascii="DengXian" w:hAnsi="DengXian" w:hint="eastAsia"/>
+          <w:rFonts w:ascii="等线" w:hAnsi="等线"/>
         </w:rPr>
       </w:pPr>
     </w:p>
@@ -5255,7 +5316,7 @@
           <w:noProof/>
         </w:rPr>
         <w:drawing>
-          <wp:inline distT="0" distB="0" distL="0" distR="0" wp14:anchorId="3418C832" wp14:editId="7CE3F49D">
+          <wp:inline distT="0" distB="0" distL="0" distR="0" wp14:anchorId="56B32BC7" wp14:editId="32A36056">
             <wp:extent cx="5486400" cy="3095625"/>
             <wp:effectExtent l="0" t="0" r="0" b="9525"/>
             <wp:docPr id="47" name="图片 47"/>
@@ -5300,7 +5361,7 @@
           <w:noProof/>
         </w:rPr>
         <w:drawing>
-          <wp:inline distT="0" distB="0" distL="0" distR="0" wp14:anchorId="11917084" wp14:editId="02DC0ED6">
+          <wp:inline distT="0" distB="0" distL="0" distR="0" wp14:anchorId="40B3A46D" wp14:editId="46B7B3A0">
             <wp:extent cx="5486400" cy="3055620"/>
             <wp:effectExtent l="0" t="0" r="0" b="0"/>
             <wp:docPr id="46" name="图片 46"/>
@@ -5417,7 +5478,7 @@
         </w:rPr>
         <w:lastRenderedPageBreak/>
         <w:drawing>
-          <wp:inline distT="0" distB="0" distL="0" distR="0" wp14:anchorId="558C0235" wp14:editId="101BE4E4">
+          <wp:inline distT="0" distB="0" distL="0" distR="0" wp14:anchorId="1072ECA6" wp14:editId="23ED68E2">
             <wp:extent cx="4514039" cy="2759102"/>
             <wp:effectExtent l="0" t="0" r="1270" b="3175"/>
             <wp:docPr id="36" name="图片 36"/>
@@ -5522,7 +5583,7 @@
     </w:p>
     <w:p>
       <w:pPr>
-        <w:pStyle w:val="a7"/>
+        <w:pStyle w:val="a9"/>
         <w:numPr>
           <w:ilvl w:val="0"/>
           <w:numId w:val="11"/>
@@ -5627,7 +5688,7 @@
     </w:p>
     <w:p>
       <w:pPr>
-        <w:pStyle w:val="a7"/>
+        <w:pStyle w:val="a9"/>
         <w:ind w:left="720" w:firstLineChars="0" w:firstLine="0"/>
       </w:pPr>
       <w:r>
@@ -5665,7 +5726,7 @@
     </w:p>
     <w:p>
       <w:pPr>
-        <w:pStyle w:val="a7"/>
+        <w:pStyle w:val="a9"/>
         <w:ind w:left="720" w:firstLineChars="0" w:firstLine="0"/>
       </w:pPr>
       <w:r>
@@ -5673,7 +5734,7 @@
           <w:noProof/>
         </w:rPr>
         <w:drawing>
-          <wp:inline distT="0" distB="0" distL="0" distR="0" wp14:anchorId="630A1BED" wp14:editId="08A816C4">
+          <wp:inline distT="0" distB="0" distL="0" distR="0" wp14:anchorId="65DD7200" wp14:editId="7B6B6A46">
             <wp:extent cx="3819335" cy="1478943"/>
             <wp:effectExtent l="0" t="0" r="0" b="6985"/>
             <wp:docPr id="45" name="图片 45"/>
@@ -5711,7 +5772,7 @@
     </w:p>
     <w:p>
       <w:pPr>
-        <w:pStyle w:val="a7"/>
+        <w:pStyle w:val="a9"/>
         <w:ind w:left="720" w:firstLineChars="0" w:firstLine="0"/>
       </w:pPr>
       <w:r>
@@ -5765,7 +5826,7 @@
     </w:p>
     <w:p>
       <w:pPr>
-        <w:pStyle w:val="a7"/>
+        <w:pStyle w:val="a9"/>
         <w:ind w:left="720" w:firstLineChars="0" w:firstLine="0"/>
       </w:pPr>
       <w:r>
@@ -5807,13 +5868,13 @@
     </w:p>
     <w:p>
       <w:pPr>
-        <w:pStyle w:val="a7"/>
+        <w:pStyle w:val="a9"/>
         <w:ind w:left="720" w:firstLineChars="0" w:firstLine="0"/>
       </w:pPr>
     </w:p>
     <w:p>
       <w:pPr>
-        <w:pStyle w:val="a7"/>
+        <w:pStyle w:val="a9"/>
         <w:ind w:left="720" w:firstLineChars="0" w:firstLine="0"/>
       </w:pPr>
       <w:r>
@@ -5858,63 +5919,63 @@
       <w:hyperlink r:id="rId57" w:history="1">
         <w:r>
           <w:rPr>
-            <w:rStyle w:val="a8"/>
+            <w:rStyle w:val="aa"/>
             <w:rFonts w:hint="eastAsia"/>
           </w:rPr>
           <w:t>Important Data\K10  SPI  Slave  +  SPI  INT  +  AD  DOUT  Master\1</w:t>
         </w:r>
         <w:r>
           <w:rPr>
-            <w:rStyle w:val="a8"/>
+            <w:rStyle w:val="aa"/>
             <w:rFonts w:hint="eastAsia"/>
           </w:rPr>
           <w:t>线模式</w:t>
         </w:r>
         <w:r>
           <w:rPr>
-            <w:rStyle w:val="a8"/>
+            <w:rStyle w:val="aa"/>
             <w:rFonts w:hint="eastAsia"/>
           </w:rPr>
           <w:t xml:space="preserve">\K10  SPI  Slave INT + AD Master </w:t>
         </w:r>
         <w:r>
           <w:rPr>
-            <w:rStyle w:val="a8"/>
+            <w:rStyle w:val="aa"/>
             <w:rFonts w:hint="eastAsia"/>
           </w:rPr>
           <w:t>数据（空闲字不确定</w:t>
         </w:r>
         <w:r>
           <w:rPr>
-            <w:rStyle w:val="a8"/>
+            <w:rStyle w:val="aa"/>
             <w:rFonts w:hint="eastAsia"/>
           </w:rPr>
           <w:t>32</w:t>
         </w:r>
         <w:r>
           <w:rPr>
-            <w:rStyle w:val="a8"/>
+            <w:rStyle w:val="aa"/>
             <w:rFonts w:hint="eastAsia"/>
           </w:rPr>
           <w:t>，</w:t>
         </w:r>
         <w:r>
           <w:rPr>
-            <w:rStyle w:val="a8"/>
+            <w:rStyle w:val="aa"/>
             <w:rFonts w:hint="eastAsia"/>
           </w:rPr>
           <w:t>31</w:t>
         </w:r>
         <w:r>
           <w:rPr>
-            <w:rStyle w:val="a8"/>
+            <w:rStyle w:val="aa"/>
             <w:rFonts w:hint="eastAsia"/>
           </w:rPr>
           <w:t>）</w:t>
         </w:r>
         <w:r>
           <w:rPr>
-            <w:rStyle w:val="a8"/>
+            <w:rStyle w:val="aa"/>
             <w:rFonts w:hint="eastAsia"/>
           </w:rPr>
           <w:t>_20181120.xls</w:t>
@@ -5923,13 +5984,13 @@
     </w:p>
     <w:p>
       <w:pPr>
-        <w:pStyle w:val="a7"/>
+        <w:pStyle w:val="a9"/>
         <w:ind w:left="720" w:firstLineChars="0" w:firstLine="0"/>
       </w:pPr>
     </w:p>
     <w:p>
       <w:pPr>
-        <w:pStyle w:val="a7"/>
+        <w:pStyle w:val="a9"/>
         <w:ind w:left="720" w:firstLineChars="0" w:firstLine="0"/>
       </w:pPr>
       <w:r>
@@ -5953,63 +6014,63 @@
       <w:hyperlink r:id="rId58" w:history="1">
         <w:r>
           <w:rPr>
-            <w:rStyle w:val="a8"/>
+            <w:rStyle w:val="aa"/>
             <w:rFonts w:hint="eastAsia"/>
           </w:rPr>
           <w:t>Important Data\K10  SPI  Slave  +  SPI  INT  +  AD  DOUT  Master\2</w:t>
         </w:r>
         <w:r>
           <w:rPr>
-            <w:rStyle w:val="a8"/>
+            <w:rStyle w:val="aa"/>
             <w:rFonts w:hint="eastAsia"/>
           </w:rPr>
           <w:t>线模式</w:t>
         </w:r>
         <w:r>
           <w:rPr>
-            <w:rStyle w:val="a8"/>
+            <w:rStyle w:val="aa"/>
             <w:rFonts w:hint="eastAsia"/>
           </w:rPr>
           <w:t xml:space="preserve">\K10  SPI  Slave INT + AD Master </w:t>
         </w:r>
         <w:r>
           <w:rPr>
-            <w:rStyle w:val="a8"/>
+            <w:rStyle w:val="aa"/>
             <w:rFonts w:hint="eastAsia"/>
           </w:rPr>
           <w:t>数据（空闲字不确定</w:t>
         </w:r>
         <w:r>
           <w:rPr>
-            <w:rStyle w:val="a8"/>
+            <w:rStyle w:val="aa"/>
             <w:rFonts w:hint="eastAsia"/>
           </w:rPr>
           <w:t>64</w:t>
         </w:r>
         <w:r>
           <w:rPr>
-            <w:rStyle w:val="a8"/>
+            <w:rStyle w:val="aa"/>
             <w:rFonts w:hint="eastAsia"/>
           </w:rPr>
           <w:t>，</w:t>
         </w:r>
         <w:r>
           <w:rPr>
-            <w:rStyle w:val="a8"/>
+            <w:rStyle w:val="aa"/>
             <w:rFonts w:hint="eastAsia"/>
           </w:rPr>
           <w:t>63</w:t>
         </w:r>
         <w:r>
           <w:rPr>
-            <w:rStyle w:val="a8"/>
+            <w:rStyle w:val="aa"/>
             <w:rFonts w:hint="eastAsia"/>
           </w:rPr>
           <w:t>）</w:t>
         </w:r>
         <w:r>
           <w:rPr>
-            <w:rStyle w:val="a8"/>
+            <w:rStyle w:val="aa"/>
             <w:rFonts w:hint="eastAsia"/>
           </w:rPr>
           <w:t>_20181120.xls</w:t>
@@ -6018,13 +6079,13 @@
     </w:p>
     <w:p>
       <w:pPr>
-        <w:pStyle w:val="a7"/>
+        <w:pStyle w:val="a9"/>
         <w:ind w:left="720" w:firstLineChars="0" w:firstLine="0"/>
       </w:pPr>
     </w:p>
     <w:p>
       <w:pPr>
-        <w:pStyle w:val="a7"/>
+        <w:pStyle w:val="a9"/>
         <w:ind w:left="720" w:firstLineChars="0" w:firstLine="0"/>
       </w:pPr>
       <w:r>
@@ -6048,21 +6109,21 @@
       <w:hyperlink r:id="rId59" w:history="1">
         <w:r>
           <w:rPr>
-            <w:rStyle w:val="a8"/>
+            <w:rStyle w:val="aa"/>
             <w:rFonts w:hint="eastAsia"/>
           </w:rPr>
           <w:t>Important Data\K10  SPI  Slave  +  SPI  INT  +  AD  DOUT  Master\4</w:t>
         </w:r>
         <w:r>
           <w:rPr>
-            <w:rStyle w:val="a8"/>
+            <w:rStyle w:val="aa"/>
             <w:rFonts w:hint="eastAsia"/>
           </w:rPr>
           <w:t>线模式</w:t>
         </w:r>
         <w:r>
           <w:rPr>
-            <w:rStyle w:val="a8"/>
+            <w:rStyle w:val="aa"/>
             <w:rFonts w:hint="eastAsia"/>
           </w:rPr>
           <w:t>\K10  SPI Slave  +  SPI   INT  + AD DOUT Master  2_20181119.xls</w:t>
@@ -6071,19 +6132,19 @@
     </w:p>
     <w:p>
       <w:pPr>
-        <w:pStyle w:val="a7"/>
+        <w:pStyle w:val="a9"/>
         <w:ind w:left="720" w:firstLineChars="0" w:firstLine="0"/>
       </w:pPr>
     </w:p>
     <w:p>
       <w:pPr>
-        <w:pStyle w:val="a7"/>
+        <w:pStyle w:val="a9"/>
         <w:ind w:left="720" w:firstLineChars="0" w:firstLine="0"/>
       </w:pPr>
     </w:p>
     <w:p>
       <w:pPr>
-        <w:pStyle w:val="a7"/>
+        <w:pStyle w:val="a9"/>
         <w:numPr>
           <w:ilvl w:val="0"/>
           <w:numId w:val="2"/>
@@ -6163,13 +6224,13 @@
     </w:p>
     <w:p>
       <w:pPr>
-        <w:pStyle w:val="a7"/>
+        <w:pStyle w:val="a9"/>
         <w:ind w:left="720" w:firstLineChars="0" w:firstLine="0"/>
       </w:pPr>
       <w:hyperlink r:id="rId60" w:history="1">
         <w:r>
           <w:rPr>
-            <w:rStyle w:val="a8"/>
+            <w:rStyle w:val="aa"/>
           </w:rPr>
           <w:t>Important Data\K10  SPI  Slave  +  Extern  INT  +  AD  DOUT  Master\K10  SPI Slave  +  EXTERN  INT  + AD DOUT Master_20181119.xls</w:t>
         </w:r>
@@ -6177,7 +6238,7 @@
     </w:p>
     <w:p>
       <w:pPr>
-        <w:pStyle w:val="a7"/>
+        <w:pStyle w:val="a9"/>
         <w:numPr>
           <w:ilvl w:val="0"/>
           <w:numId w:val="2"/>
@@ -6363,7 +6424,7 @@
     </w:p>
     <w:p>
       <w:pPr>
-        <w:pStyle w:val="a7"/>
+        <w:pStyle w:val="a9"/>
         <w:ind w:left="720" w:firstLineChars="0" w:firstLine="0"/>
       </w:pPr>
       <w:r>
@@ -6393,7 +6454,7 @@
     </w:p>
     <w:p>
       <w:pPr>
-        <w:pStyle w:val="a7"/>
+        <w:pStyle w:val="a9"/>
         <w:ind w:left="720" w:firstLineChars="0" w:firstLine="0"/>
       </w:pPr>
       <w:r>
@@ -6401,7 +6462,7 @@
           <w:noProof/>
         </w:rPr>
         <w:drawing>
-          <wp:inline distT="0" distB="0" distL="0" distR="0" wp14:anchorId="08F5AE05" wp14:editId="06781326">
+          <wp:inline distT="0" distB="0" distL="0" distR="0" wp14:anchorId="62D8FE6E" wp14:editId="39A5BDAB">
             <wp:extent cx="3015117" cy="2218414"/>
             <wp:effectExtent l="0" t="0" r="0" b="0"/>
             <wp:docPr id="48" name="图片 48"/>
@@ -6441,7 +6502,7 @@
           <w:noProof/>
         </w:rPr>
         <w:drawing>
-          <wp:inline distT="0" distB="0" distL="0" distR="0" wp14:anchorId="6D78348E" wp14:editId="378515AF">
+          <wp:inline distT="0" distB="0" distL="0" distR="0" wp14:anchorId="266A1EB1" wp14:editId="50283069">
             <wp:extent cx="2588207" cy="1288111"/>
             <wp:effectExtent l="0" t="0" r="3175" b="7620"/>
             <wp:docPr id="49" name="图片 49"/>
@@ -6479,7 +6540,7 @@
     </w:p>
     <w:p>
       <w:pPr>
-        <w:pStyle w:val="a7"/>
+        <w:pStyle w:val="a9"/>
         <w:ind w:left="720" w:firstLineChars="0" w:firstLine="0"/>
       </w:pPr>
       <w:r>
@@ -6569,7 +6630,7 @@
     </w:p>
     <w:p>
       <w:pPr>
-        <w:pStyle w:val="a7"/>
+        <w:pStyle w:val="a9"/>
         <w:ind w:left="720" w:firstLineChars="0" w:firstLine="0"/>
       </w:pPr>
       <w:r>
@@ -6581,7 +6642,7 @@
     </w:p>
     <w:p>
       <w:pPr>
-        <w:pStyle w:val="a7"/>
+        <w:pStyle w:val="a9"/>
         <w:ind w:left="720" w:firstLineChars="0" w:firstLine="0"/>
       </w:pPr>
       <w:r>
@@ -6589,7 +6650,7 @@
           <w:noProof/>
         </w:rPr>
         <w:drawing>
-          <wp:inline distT="0" distB="0" distL="0" distR="0" wp14:anchorId="3956C879" wp14:editId="19851907">
+          <wp:inline distT="0" distB="0" distL="0" distR="0" wp14:anchorId="30D60A41" wp14:editId="1E543ED9">
             <wp:extent cx="3050648" cy="2234317"/>
             <wp:effectExtent l="0" t="0" r="0" b="0"/>
             <wp:docPr id="50" name="图片 50"/>
@@ -6629,7 +6690,7 @@
           <w:noProof/>
         </w:rPr>
         <w:drawing>
-          <wp:inline distT="0" distB="0" distL="0" distR="0" wp14:anchorId="7D26F214" wp14:editId="61993741">
+          <wp:inline distT="0" distB="0" distL="0" distR="0" wp14:anchorId="20FBDF81" wp14:editId="79BA1514">
             <wp:extent cx="2528515" cy="1298061"/>
             <wp:effectExtent l="0" t="0" r="5715" b="0"/>
             <wp:docPr id="51" name="图片 51"/>
@@ -6667,7 +6728,7 @@
     </w:p>
     <w:p>
       <w:pPr>
-        <w:pStyle w:val="a7"/>
+        <w:pStyle w:val="a9"/>
         <w:ind w:left="720" w:firstLineChars="0" w:firstLine="0"/>
       </w:pPr>
       <w:r>
@@ -6679,7 +6740,7 @@
     </w:p>
     <w:p>
       <w:pPr>
-        <w:pStyle w:val="a7"/>
+        <w:pStyle w:val="a9"/>
         <w:ind w:left="720" w:firstLineChars="0" w:firstLine="0"/>
       </w:pPr>
       <w:r>
@@ -6687,7 +6748,7 @@
           <w:noProof/>
         </w:rPr>
         <w:drawing>
-          <wp:inline distT="0" distB="0" distL="0" distR="0" wp14:anchorId="63160865" wp14:editId="62188438">
+          <wp:inline distT="0" distB="0" distL="0" distR="0" wp14:anchorId="72C78976" wp14:editId="6BF174F7">
             <wp:extent cx="3053301" cy="2255342"/>
             <wp:effectExtent l="0" t="0" r="0" b="0"/>
             <wp:docPr id="52" name="图片 52"/>
@@ -6727,7 +6788,7 @@
           <w:noProof/>
         </w:rPr>
         <w:drawing>
-          <wp:inline distT="0" distB="0" distL="0" distR="0" wp14:anchorId="427DC309" wp14:editId="15DF8194">
+          <wp:inline distT="0" distB="0" distL="0" distR="0" wp14:anchorId="292126BC" wp14:editId="77D7CFA3">
             <wp:extent cx="2561401" cy="1208598"/>
             <wp:effectExtent l="0" t="0" r="0" b="0"/>
             <wp:docPr id="53" name="图片 53"/>
@@ -6765,7 +6826,7 @@
     </w:p>
     <w:p>
       <w:pPr>
-        <w:pStyle w:val="a7"/>
+        <w:pStyle w:val="a9"/>
         <w:ind w:left="720" w:firstLineChars="0" w:firstLine="0"/>
       </w:pPr>
       <w:r>
@@ -6790,13 +6851,13 @@
     </w:p>
     <w:p>
       <w:pPr>
-        <w:pStyle w:val="a7"/>
+        <w:pStyle w:val="a9"/>
         <w:ind w:left="720" w:firstLineChars="0" w:firstLine="0"/>
       </w:pPr>
     </w:p>
     <w:p>
       <w:pPr>
-        <w:pStyle w:val="a7"/>
+        <w:pStyle w:val="a9"/>
         <w:ind w:left="720" w:firstLineChars="0" w:firstLine="0"/>
       </w:pPr>
       <w:r>
@@ -6878,7 +6939,7 @@
     </w:p>
     <w:p>
       <w:pPr>
-        <w:pStyle w:val="a7"/>
+        <w:pStyle w:val="a9"/>
         <w:ind w:left="720" w:firstLineChars="0" w:firstLine="0"/>
       </w:pPr>
       <w:r>
@@ -6944,7 +7005,7 @@
     </w:p>
     <w:p>
       <w:pPr>
-        <w:pStyle w:val="a7"/>
+        <w:pStyle w:val="a9"/>
         <w:ind w:left="720" w:firstLineChars="0" w:firstLine="0"/>
       </w:pPr>
       <w:r>
@@ -7064,13 +7125,13 @@
     </w:p>
     <w:p>
       <w:pPr>
-        <w:pStyle w:val="a7"/>
+        <w:pStyle w:val="a9"/>
         <w:ind w:left="720" w:firstLineChars="0" w:firstLine="0"/>
       </w:pPr>
     </w:p>
     <w:p>
       <w:pPr>
-        <w:pStyle w:val="a7"/>
+        <w:pStyle w:val="a9"/>
         <w:ind w:left="720" w:firstLineChars="0" w:firstLine="0"/>
       </w:pPr>
       <w:r>
@@ -7160,7 +7221,7 @@
     </w:p>
     <w:p>
       <w:pPr>
-        <w:pStyle w:val="a7"/>
+        <w:pStyle w:val="a9"/>
         <w:ind w:left="720" w:firstLineChars="0" w:firstLine="0"/>
       </w:pPr>
       <w:r>
@@ -7226,7 +7287,7 @@
     </w:p>
     <w:p>
       <w:pPr>
-        <w:pStyle w:val="a7"/>
+        <w:pStyle w:val="a9"/>
         <w:ind w:left="720" w:firstLineChars="0" w:firstLine="0"/>
       </w:pPr>
     </w:p>
@@ -7406,7 +7467,7 @@
           <w:noProof/>
         </w:rPr>
         <w:drawing>
-          <wp:inline distT="0" distB="0" distL="0" distR="0" wp14:anchorId="6F8D3F45" wp14:editId="43562F52">
+          <wp:inline distT="0" distB="0" distL="0" distR="0" wp14:anchorId="2D459C26" wp14:editId="62842210">
             <wp:extent cx="4086970" cy="620201"/>
             <wp:effectExtent l="0" t="0" r="0" b="8890"/>
             <wp:docPr id="55" name="图片 55"/>
@@ -7489,7 +7550,7 @@
           <w:noProof/>
         </w:rPr>
         <w:drawing>
-          <wp:inline distT="0" distB="0" distL="0" distR="0" wp14:anchorId="3F0FDC1D" wp14:editId="5E7C0951">
+          <wp:inline distT="0" distB="0" distL="0" distR="0" wp14:anchorId="021BABDD" wp14:editId="7A9CEDE9">
             <wp:extent cx="4723075" cy="1142503"/>
             <wp:effectExtent l="0" t="0" r="1905" b="635"/>
             <wp:docPr id="56" name="图片 56"/>
@@ -7659,7 +7720,7 @@
           <w:noProof/>
         </w:rPr>
         <w:drawing>
-          <wp:inline distT="0" distB="0" distL="0" distR="0" wp14:anchorId="0C14C9CC" wp14:editId="148E474B">
+          <wp:inline distT="0" distB="0" distL="0" distR="0" wp14:anchorId="715FFF6D" wp14:editId="0AD6EC37">
             <wp:extent cx="3554233" cy="1639828"/>
             <wp:effectExtent l="0" t="0" r="8255" b="0"/>
             <wp:docPr id="57" name="图片 57"/>
@@ -7740,7 +7801,7 @@
           <w:noProof/>
         </w:rPr>
         <w:drawing>
-          <wp:inline distT="0" distB="0" distL="0" distR="0" wp14:anchorId="3A3DA9FD" wp14:editId="5CEEDD18">
+          <wp:inline distT="0" distB="0" distL="0" distR="0" wp14:anchorId="7230B7F2" wp14:editId="520DA112">
             <wp:extent cx="5486400" cy="824230"/>
             <wp:effectExtent l="0" t="0" r="0" b="0"/>
             <wp:docPr id="58" name="图片 58"/>
@@ -7802,9 +7863,6 @@
     <w:p>
       <w:pPr>
         <w:ind w:firstLine="435"/>
-        <w:rPr>
-          <w:rFonts w:hint="eastAsia"/>
-        </w:rPr>
       </w:pPr>
       <w:r>
         <w:rPr>
@@ -7828,22 +7886,16 @@
     <w:p>
       <w:pPr>
         <w:ind w:firstLine="435"/>
-        <w:rPr>
-          <w:rFonts w:hint="eastAsia"/>
-        </w:rPr>
-      </w:pPr>
-    </w:p>
-    <w:p>
-      <w:pPr>
-        <w:pStyle w:val="a7"/>
+      </w:pPr>
+    </w:p>
+    <w:p>
+      <w:pPr>
+        <w:pStyle w:val="a9"/>
         <w:numPr>
           <w:ilvl w:val="0"/>
           <w:numId w:val="11"/>
         </w:numPr>
         <w:ind w:firstLineChars="0"/>
-        <w:rPr>
-          <w:rFonts w:hint="eastAsia"/>
-        </w:rPr>
       </w:pPr>
       <w:r>
         <w:rPr>
@@ -7860,18 +7912,15 @@
     </w:p>
     <w:p>
       <w:pPr>
-        <w:pStyle w:val="a7"/>
+        <w:pStyle w:val="a9"/>
         <w:ind w:left="780" w:firstLineChars="0" w:firstLine="0"/>
-        <w:rPr>
-          <w:rFonts w:hint="eastAsia"/>
-        </w:rPr>
       </w:pPr>
       <w:r>
         <w:rPr>
           <w:noProof/>
         </w:rPr>
         <w:drawing>
-          <wp:inline distT="0" distB="0" distL="0" distR="0" wp14:anchorId="5CFB61D9" wp14:editId="5CC71B4D">
+          <wp:inline distT="0" distB="0" distL="0" distR="0" wp14:anchorId="6FE90794" wp14:editId="59D4A303">
             <wp:extent cx="5486400" cy="1457960"/>
             <wp:effectExtent l="0" t="0" r="0" b="8890"/>
             <wp:docPr id="59" name="图片 59"/>
@@ -7909,11 +7958,8 @@
     </w:p>
     <w:p>
       <w:pPr>
-        <w:pStyle w:val="a7"/>
+        <w:pStyle w:val="a9"/>
         <w:ind w:left="780" w:firstLineChars="0" w:firstLine="0"/>
-        <w:rPr>
-          <w:rFonts w:hint="eastAsia"/>
-        </w:rPr>
       </w:pPr>
       <w:r>
         <w:rPr>
@@ -7942,11 +7988,8 @@
     </w:p>
     <w:p>
       <w:pPr>
-        <w:pStyle w:val="a7"/>
+        <w:pStyle w:val="a9"/>
         <w:ind w:left="780" w:firstLineChars="0" w:firstLine="0"/>
-        <w:rPr>
-          <w:rFonts w:hint="eastAsia"/>
-        </w:rPr>
       </w:pPr>
       <w:r>
         <w:rPr>
@@ -7957,18 +8000,15 @@
     </w:p>
     <w:p>
       <w:pPr>
-        <w:pStyle w:val="a7"/>
+        <w:pStyle w:val="a9"/>
         <w:ind w:left="780" w:firstLineChars="0" w:firstLine="0"/>
-        <w:rPr>
-          <w:rFonts w:hint="eastAsia"/>
-        </w:rPr>
       </w:pPr>
       <w:r>
         <w:rPr>
           <w:noProof/>
         </w:rPr>
         <w:drawing>
-          <wp:inline distT="0" distB="0" distL="0" distR="0" wp14:anchorId="4E4E47C3" wp14:editId="14201777">
+          <wp:inline distT="0" distB="0" distL="0" distR="0" wp14:anchorId="4D7E99CF" wp14:editId="0CDF6D60">
             <wp:extent cx="5486400" cy="1691640"/>
             <wp:effectExtent l="0" t="0" r="0" b="3810"/>
             <wp:docPr id="60" name="图片 60"/>
@@ -8006,11 +8046,8 @@
     </w:p>
     <w:p>
       <w:pPr>
-        <w:pStyle w:val="a7"/>
+        <w:pStyle w:val="a9"/>
         <w:ind w:left="780" w:firstLineChars="0" w:firstLine="0"/>
-        <w:rPr>
-          <w:rFonts w:hint="eastAsia"/>
-        </w:rPr>
       </w:pPr>
       <w:r>
         <w:rPr>
@@ -8042,12 +8079,10 @@
         </w:rPr>
         <w:t>同时是在输出数据的，并且根据设置的寄存器实时调整，直到寄存器配置完成后，达到稳定！</w:t>
       </w:r>
-      <w:bookmarkStart w:id="0" w:name="_GoBack"/>
-      <w:bookmarkEnd w:id="0"/>
-    </w:p>
-    <w:p>
-      <w:pPr>
-        <w:pStyle w:val="a7"/>
+    </w:p>
+    <w:p>
+      <w:pPr>
+        <w:pStyle w:val="a9"/>
         <w:numPr>
           <w:ilvl w:val="0"/>
           <w:numId w:val="11"/>
@@ -8078,7 +8113,7 @@
 </file>
 
 <file path=word/endnotes.xml><?xml version="1.0" encoding="utf-8"?>
-<w:endnotes xmlns:wpc="http://schemas.microsoft.com/office/word/2010/wordprocessingCanvas" xmlns:mc="http://schemas.openxmlformats.org/markup-compatibility/2006" xmlns:o="urn:schemas-microsoft-com:office:office" xmlns:r="http://schemas.openxmlformats.org/officeDocument/2006/relationships" xmlns:m="http://schemas.openxmlformats.org/officeDocument/2006/math" xmlns:v="urn:schemas-microsoft-com:vml" xmlns:wp14="http://schemas.microsoft.com/office/word/2010/wordprocessingDrawing" xmlns:wp="http://schemas.openxmlformats.org/drawingml/2006/wordprocessingDrawing" xmlns:w10="urn:schemas-microsoft-com:office:word" xmlns:w="http://schemas.openxmlformats.org/wordprocessingml/2006/main" xmlns:w14="http://schemas.microsoft.com/office/word/2010/wordml" xmlns:wpg="http://schemas.microsoft.com/office/word/2010/wordprocessingGroup" xmlns:wpi="http://schemas.microsoft.com/office/word/2010/wordprocessingInk" xmlns:wne="http://schemas.microsoft.com/office/word/2006/wordml" xmlns:wps="http://schemas.microsoft.com/office/word/2010/wordprocessingShape" mc:Ignorable="w14 wp14">
+<w:endnotes xmlns:wpc="http://schemas.microsoft.com/office/word/2010/wordprocessingCanvas" xmlns:cx="http://schemas.microsoft.com/office/drawing/2014/chartex" xmlns:cx1="http://schemas.microsoft.com/office/drawing/2015/9/8/chartex" xmlns:cx2="http://schemas.microsoft.com/office/drawing/2015/10/21/chartex" xmlns:cx3="http://schemas.microsoft.com/office/drawing/2016/5/9/chartex" xmlns:cx4="http://schemas.microsoft.com/office/drawing/2016/5/10/chartex" xmlns:cx5="http://schemas.microsoft.com/office/drawing/2016/5/11/chartex" xmlns:cx6="http://schemas.microsoft.com/office/drawing/2016/5/12/chartex" xmlns:cx7="http://schemas.microsoft.com/office/drawing/2016/5/13/chartex" xmlns:cx8="http://schemas.microsoft.com/office/drawing/2016/5/14/chartex" xmlns:mc="http://schemas.openxmlformats.org/markup-compatibility/2006" xmlns:aink="http://schemas.microsoft.com/office/drawing/2016/ink" xmlns:am3d="http://schemas.microsoft.com/office/drawing/2017/model3d" xmlns:o="urn:schemas-microsoft-com:office:office" xmlns:r="http://schemas.openxmlformats.org/officeDocument/2006/relationships" xmlns:m="http://schemas.openxmlformats.org/officeDocument/2006/math" xmlns:v="urn:schemas-microsoft-com:vml" xmlns:wp14="http://schemas.microsoft.com/office/word/2010/wordprocessingDrawing" xmlns:wp="http://schemas.openxmlformats.org/drawingml/2006/wordprocessingDrawing" xmlns:w10="urn:schemas-microsoft-com:office:word" xmlns:w="http://schemas.openxmlformats.org/wordprocessingml/2006/main" xmlns:w14="http://schemas.microsoft.com/office/word/2010/wordml" xmlns:w15="http://schemas.microsoft.com/office/word/2012/wordml" xmlns:w16cex="http://schemas.microsoft.com/office/word/2018/wordml/cex" xmlns:w16cid="http://schemas.microsoft.com/office/word/2016/wordml/cid" xmlns:w16="http://schemas.microsoft.com/office/word/2018/wordml" xmlns:w16sdtdh="http://schemas.microsoft.com/office/word/2020/wordml/sdtdatahash" xmlns:w16se="http://schemas.microsoft.com/office/word/2015/wordml/symex" xmlns:wpg="http://schemas.microsoft.com/office/word/2010/wordprocessingGroup" xmlns:wpi="http://schemas.microsoft.com/office/word/2010/wordprocessingInk" xmlns:wne="http://schemas.microsoft.com/office/word/2006/wordml" xmlns:wps="http://schemas.microsoft.com/office/word/2010/wordprocessingShape" mc:Ignorable="w14 w15 w16se w16cid w16 w16cex w16sdtdh wp14">
   <w:endnote w:type="separator" w:id="-1">
     <w:p>
       <w:r>
@@ -8097,7 +8132,7 @@
 </file>
 
 <file path=word/footer1.xml><?xml version="1.0" encoding="utf-8"?>
-<w:ftr xmlns:wpc="http://schemas.microsoft.com/office/word/2010/wordprocessingCanvas" xmlns:mc="http://schemas.openxmlformats.org/markup-compatibility/2006" xmlns:o="urn:schemas-microsoft-com:office:office" xmlns:r="http://schemas.openxmlformats.org/officeDocument/2006/relationships" xmlns:m="http://schemas.openxmlformats.org/officeDocument/2006/math" xmlns:v="urn:schemas-microsoft-com:vml" xmlns:wp14="http://schemas.microsoft.com/office/word/2010/wordprocessingDrawing" xmlns:wp="http://schemas.openxmlformats.org/drawingml/2006/wordprocessingDrawing" xmlns:w10="urn:schemas-microsoft-com:office:word" xmlns:w="http://schemas.openxmlformats.org/wordprocessingml/2006/main" xmlns:w14="http://schemas.microsoft.com/office/word/2010/wordml" xmlns:wpg="http://schemas.microsoft.com/office/word/2010/wordprocessingGroup" xmlns:wpi="http://schemas.microsoft.com/office/word/2010/wordprocessingInk" xmlns:wne="http://schemas.microsoft.com/office/word/2006/wordml" xmlns:wps="http://schemas.microsoft.com/office/word/2010/wordprocessingShape" mc:Ignorable="w14 wp14">
+<w:ftr xmlns:wpc="http://schemas.microsoft.com/office/word/2010/wordprocessingCanvas" xmlns:cx="http://schemas.microsoft.com/office/drawing/2014/chartex" xmlns:cx1="http://schemas.microsoft.com/office/drawing/2015/9/8/chartex" xmlns:cx2="http://schemas.microsoft.com/office/drawing/2015/10/21/chartex" xmlns:cx3="http://schemas.microsoft.com/office/drawing/2016/5/9/chartex" xmlns:cx4="http://schemas.microsoft.com/office/drawing/2016/5/10/chartex" xmlns:cx5="http://schemas.microsoft.com/office/drawing/2016/5/11/chartex" xmlns:cx6="http://schemas.microsoft.com/office/drawing/2016/5/12/chartex" xmlns:cx7="http://schemas.microsoft.com/office/drawing/2016/5/13/chartex" xmlns:cx8="http://schemas.microsoft.com/office/drawing/2016/5/14/chartex" xmlns:mc="http://schemas.openxmlformats.org/markup-compatibility/2006" xmlns:aink="http://schemas.microsoft.com/office/drawing/2016/ink" xmlns:am3d="http://schemas.microsoft.com/office/drawing/2017/model3d" xmlns:o="urn:schemas-microsoft-com:office:office" xmlns:r="http://schemas.openxmlformats.org/officeDocument/2006/relationships" xmlns:m="http://schemas.openxmlformats.org/officeDocument/2006/math" xmlns:v="urn:schemas-microsoft-com:vml" xmlns:wp14="http://schemas.microsoft.com/office/word/2010/wordprocessingDrawing" xmlns:wp="http://schemas.openxmlformats.org/drawingml/2006/wordprocessingDrawing" xmlns:w10="urn:schemas-microsoft-com:office:word" xmlns:w="http://schemas.openxmlformats.org/wordprocessingml/2006/main" xmlns:w14="http://schemas.microsoft.com/office/word/2010/wordml" xmlns:w15="http://schemas.microsoft.com/office/word/2012/wordml" xmlns:w16cex="http://schemas.microsoft.com/office/word/2018/wordml/cex" xmlns:w16cid="http://schemas.microsoft.com/office/word/2016/wordml/cid" xmlns:w16="http://schemas.microsoft.com/office/word/2018/wordml" xmlns:w16sdtdh="http://schemas.microsoft.com/office/word/2020/wordml/sdtdatahash" xmlns:w16se="http://schemas.microsoft.com/office/word/2015/wordml/symex" xmlns:wpg="http://schemas.microsoft.com/office/word/2010/wordprocessingGroup" xmlns:wpi="http://schemas.microsoft.com/office/word/2010/wordprocessingInk" xmlns:wne="http://schemas.microsoft.com/office/word/2006/wordml" xmlns:wps="http://schemas.microsoft.com/office/word/2010/wordprocessingShape" mc:Ignorable="w14 w15 w16se w16cid w16 w16cex w16sdtdh wp14">
   <w:p>
     <w:pPr>
       <w:pStyle w:val="a3"/>
@@ -8107,7 +8142,7 @@
         <w:noProof/>
       </w:rPr>
       <w:drawing>
-        <wp:anchor distT="0" distB="0" distL="114300" distR="114300" simplePos="0" relativeHeight="251668480" behindDoc="0" locked="0" layoutInCell="1" allowOverlap="1" wp14:anchorId="377D80D5" wp14:editId="64C438C7">
+        <wp:anchor distT="0" distB="0" distL="114300" distR="114300" simplePos="0" relativeHeight="251668480" behindDoc="0" locked="0" layoutInCell="1" allowOverlap="1" wp14:anchorId="2A4944D0" wp14:editId="57E1A625">
           <wp:simplePos x="0" y="0"/>
           <wp:positionH relativeFrom="column">
             <wp:posOffset>2145665</wp:posOffset>
@@ -8174,7 +8209,7 @@
 </file>
 
 <file path=word/footnotes.xml><?xml version="1.0" encoding="utf-8"?>
-<w:footnotes xmlns:wpc="http://schemas.microsoft.com/office/word/2010/wordprocessingCanvas" xmlns:mc="http://schemas.openxmlformats.org/markup-compatibility/2006" xmlns:o="urn:schemas-microsoft-com:office:office" xmlns:r="http://schemas.openxmlformats.org/officeDocument/2006/relationships" xmlns:m="http://schemas.openxmlformats.org/officeDocument/2006/math" xmlns:v="urn:schemas-microsoft-com:vml" xmlns:wp14="http://schemas.microsoft.com/office/word/2010/wordprocessingDrawing" xmlns:wp="http://schemas.openxmlformats.org/drawingml/2006/wordprocessingDrawing" xmlns:w10="urn:schemas-microsoft-com:office:word" xmlns:w="http://schemas.openxmlformats.org/wordprocessingml/2006/main" xmlns:w14="http://schemas.microsoft.com/office/word/2010/wordml" xmlns:wpg="http://schemas.microsoft.com/office/word/2010/wordprocessingGroup" xmlns:wpi="http://schemas.microsoft.com/office/word/2010/wordprocessingInk" xmlns:wne="http://schemas.microsoft.com/office/word/2006/wordml" xmlns:wps="http://schemas.microsoft.com/office/word/2010/wordprocessingShape" mc:Ignorable="w14 wp14">
+<w:footnotes xmlns:wpc="http://schemas.microsoft.com/office/word/2010/wordprocessingCanvas" xmlns:cx="http://schemas.microsoft.com/office/drawing/2014/chartex" xmlns:cx1="http://schemas.microsoft.com/office/drawing/2015/9/8/chartex" xmlns:cx2="http://schemas.microsoft.com/office/drawing/2015/10/21/chartex" xmlns:cx3="http://schemas.microsoft.com/office/drawing/2016/5/9/chartex" xmlns:cx4="http://schemas.microsoft.com/office/drawing/2016/5/10/chartex" xmlns:cx5="http://schemas.microsoft.com/office/drawing/2016/5/11/chartex" xmlns:cx6="http://schemas.microsoft.com/office/drawing/2016/5/12/chartex" xmlns:cx7="http://schemas.microsoft.com/office/drawing/2016/5/13/chartex" xmlns:cx8="http://schemas.microsoft.com/office/drawing/2016/5/14/chartex" xmlns:mc="http://schemas.openxmlformats.org/markup-compatibility/2006" xmlns:aink="http://schemas.microsoft.com/office/drawing/2016/ink" xmlns:am3d="http://schemas.microsoft.com/office/drawing/2017/model3d" xmlns:o="urn:schemas-microsoft-com:office:office" xmlns:r="http://schemas.openxmlformats.org/officeDocument/2006/relationships" xmlns:m="http://schemas.openxmlformats.org/officeDocument/2006/math" xmlns:v="urn:schemas-microsoft-com:vml" xmlns:wp14="http://schemas.microsoft.com/office/word/2010/wordprocessingDrawing" xmlns:wp="http://schemas.openxmlformats.org/drawingml/2006/wordprocessingDrawing" xmlns:w10="urn:schemas-microsoft-com:office:word" xmlns:w="http://schemas.openxmlformats.org/wordprocessingml/2006/main" xmlns:w14="http://schemas.microsoft.com/office/word/2010/wordml" xmlns:w15="http://schemas.microsoft.com/office/word/2012/wordml" xmlns:w16cex="http://schemas.microsoft.com/office/word/2018/wordml/cex" xmlns:w16cid="http://schemas.microsoft.com/office/word/2016/wordml/cid" xmlns:w16="http://schemas.microsoft.com/office/word/2018/wordml" xmlns:w16sdtdh="http://schemas.microsoft.com/office/word/2020/wordml/sdtdatahash" xmlns:w16se="http://schemas.microsoft.com/office/word/2015/wordml/symex" xmlns:wpg="http://schemas.microsoft.com/office/word/2010/wordprocessingGroup" xmlns:wpi="http://schemas.microsoft.com/office/word/2010/wordprocessingInk" xmlns:wne="http://schemas.microsoft.com/office/word/2006/wordml" xmlns:wps="http://schemas.microsoft.com/office/word/2010/wordprocessingShape" mc:Ignorable="w14 w15 w16se w16cid w16 w16cex w16sdtdh wp14">
   <w:footnote w:type="separator" w:id="-1">
     <w:p>
       <w:r>
@@ -8193,7 +8228,7 @@
 </file>
 
 <file path=word/header1.xml><?xml version="1.0" encoding="utf-8"?>
-<w:hdr xmlns:wpc="http://schemas.microsoft.com/office/word/2010/wordprocessingCanvas" xmlns:mc="http://schemas.openxmlformats.org/markup-compatibility/2006" xmlns:o="urn:schemas-microsoft-com:office:office" xmlns:r="http://schemas.openxmlformats.org/officeDocument/2006/relationships" xmlns:m="http://schemas.openxmlformats.org/officeDocument/2006/math" xmlns:v="urn:schemas-microsoft-com:vml" xmlns:wp14="http://schemas.microsoft.com/office/word/2010/wordprocessingDrawing" xmlns:wp="http://schemas.openxmlformats.org/drawingml/2006/wordprocessingDrawing" xmlns:w10="urn:schemas-microsoft-com:office:word" xmlns:w="http://schemas.openxmlformats.org/wordprocessingml/2006/main" xmlns:w14="http://schemas.microsoft.com/office/word/2010/wordml" xmlns:wpg="http://schemas.microsoft.com/office/word/2010/wordprocessingGroup" xmlns:wpi="http://schemas.microsoft.com/office/word/2010/wordprocessingInk" xmlns:wne="http://schemas.microsoft.com/office/word/2006/wordml" xmlns:wps="http://schemas.microsoft.com/office/word/2010/wordprocessingShape" mc:Ignorable="w14 wp14">
+<w:hdr xmlns:wpc="http://schemas.microsoft.com/office/word/2010/wordprocessingCanvas" xmlns:cx="http://schemas.microsoft.com/office/drawing/2014/chartex" xmlns:cx1="http://schemas.microsoft.com/office/drawing/2015/9/8/chartex" xmlns:cx2="http://schemas.microsoft.com/office/drawing/2015/10/21/chartex" xmlns:cx3="http://schemas.microsoft.com/office/drawing/2016/5/9/chartex" xmlns:cx4="http://schemas.microsoft.com/office/drawing/2016/5/10/chartex" xmlns:cx5="http://schemas.microsoft.com/office/drawing/2016/5/11/chartex" xmlns:cx6="http://schemas.microsoft.com/office/drawing/2016/5/12/chartex" xmlns:cx7="http://schemas.microsoft.com/office/drawing/2016/5/13/chartex" xmlns:cx8="http://schemas.microsoft.com/office/drawing/2016/5/14/chartex" xmlns:mc="http://schemas.openxmlformats.org/markup-compatibility/2006" xmlns:aink="http://schemas.microsoft.com/office/drawing/2016/ink" xmlns:am3d="http://schemas.microsoft.com/office/drawing/2017/model3d" xmlns:o="urn:schemas-microsoft-com:office:office" xmlns:r="http://schemas.openxmlformats.org/officeDocument/2006/relationships" xmlns:m="http://schemas.openxmlformats.org/officeDocument/2006/math" xmlns:v="urn:schemas-microsoft-com:vml" xmlns:wp14="http://schemas.microsoft.com/office/word/2010/wordprocessingDrawing" xmlns:wp="http://schemas.openxmlformats.org/drawingml/2006/wordprocessingDrawing" xmlns:w10="urn:schemas-microsoft-com:office:word" xmlns:w="http://schemas.openxmlformats.org/wordprocessingml/2006/main" xmlns:w14="http://schemas.microsoft.com/office/word/2010/wordml" xmlns:w15="http://schemas.microsoft.com/office/word/2012/wordml" xmlns:w16cex="http://schemas.microsoft.com/office/word/2018/wordml/cex" xmlns:w16cid="http://schemas.microsoft.com/office/word/2016/wordml/cid" xmlns:w16="http://schemas.microsoft.com/office/word/2018/wordml" xmlns:w16sdtdh="http://schemas.microsoft.com/office/word/2020/wordml/sdtdatahash" xmlns:w16se="http://schemas.microsoft.com/office/word/2015/wordml/symex" xmlns:wpg="http://schemas.microsoft.com/office/word/2010/wordprocessingGroup" xmlns:wpi="http://schemas.microsoft.com/office/word/2010/wordprocessingInk" xmlns:wne="http://schemas.microsoft.com/office/word/2006/wordml" xmlns:wps="http://schemas.microsoft.com/office/word/2010/wordprocessingShape" mc:Ignorable="w14 w15 w16se w16cid w16 w16cex w16sdtdh wp14">
   <w:p>
     <w:pPr>
       <w:pStyle w:val="a4"/>
@@ -8203,7 +8238,7 @@
         <w:noProof/>
       </w:rPr>
       <w:drawing>
-        <wp:anchor distT="0" distB="0" distL="114300" distR="114300" simplePos="0" relativeHeight="251664384" behindDoc="0" locked="0" layoutInCell="1" allowOverlap="1" wp14:anchorId="34E43004" wp14:editId="3112EA30">
+        <wp:anchor distT="0" distB="0" distL="114300" distR="114300" simplePos="0" relativeHeight="251664384" behindDoc="0" locked="0" layoutInCell="1" allowOverlap="1" wp14:anchorId="598B784E" wp14:editId="56931E0E">
           <wp:simplePos x="0" y="0"/>
           <wp:positionH relativeFrom="column">
             <wp:posOffset>3824935</wp:posOffset>
@@ -8270,7 +8305,7 @@
         <w:noProof/>
       </w:rPr>
       <w:drawing>
-        <wp:anchor distT="0" distB="0" distL="114300" distR="114300" simplePos="0" relativeHeight="251666432" behindDoc="0" locked="0" layoutInCell="1" allowOverlap="1" wp14:anchorId="3DAEFA05" wp14:editId="7CBA6FB3">
+        <wp:anchor distT="0" distB="0" distL="114300" distR="114300" simplePos="0" relativeHeight="251666432" behindDoc="0" locked="0" layoutInCell="1" allowOverlap="1" wp14:anchorId="64F4D121" wp14:editId="1F07DB39">
           <wp:simplePos x="0" y="0"/>
           <wp:positionH relativeFrom="column">
             <wp:posOffset>0</wp:posOffset>
@@ -8339,7 +8374,7 @@
       <mc:AlternateContent>
         <mc:Choice Requires="wps">
           <w:drawing>
-            <wp:anchor distT="0" distB="0" distL="114300" distR="114300" simplePos="0" relativeHeight="251660288" behindDoc="0" locked="0" layoutInCell="1" allowOverlap="1" wp14:anchorId="175C16B9" wp14:editId="42E071E0">
+            <wp:anchor distT="0" distB="0" distL="114300" distR="114300" simplePos="0" relativeHeight="251660288" behindDoc="0" locked="0" layoutInCell="1" allowOverlap="1" wp14:anchorId="0B71D355" wp14:editId="28C50B25">
               <wp:simplePos x="0" y="0"/>
               <wp:positionH relativeFrom="column">
                 <wp:posOffset>3810</wp:posOffset>
@@ -8398,13 +8433,13 @@
             </wp:anchor>
           </w:drawing>
         </mc:Choice>
-        <mc:Fallback xmlns:w15="http://schemas.microsoft.com/office/word/2012/wordml">
+        <mc:Fallback>
           <w:pict>
-            <v:shapetype w14:anchorId="666AA508" id="_x0000_t32" coordsize="21600,21600" o:spt="32" o:oned="t" path="m,l21600,21600e" filled="f">
+            <v:shapetype w14:anchorId="3AEAB885" id="_x0000_t32" coordsize="21600,21600" o:spt="32" o:oned="t" path="m,l21600,21600e" filled="f">
               <v:path arrowok="t" fillok="f" o:connecttype="none"/>
               <o:lock v:ext="edit" shapetype="t"/>
             </v:shapetype>
-            <v:shape id="AutoShape 2" o:spid="_x0000_s1026" type="#_x0000_t32" style="position:absolute;left:0;text-align:left;margin-left:.3pt;margin-top:27.95pt;width:481.9pt;height:0;z-index:251660288;visibility:visible;mso-wrap-style:square;mso-width-percent:0;mso-height-percent:0;mso-wrap-distance-left:9pt;mso-wrap-distance-top:0;mso-wrap-distance-right:9pt;mso-wrap-distance-bottom:0;mso-position-horizontal:absolute;mso-position-horizontal-relative:text;mso-position-vertical:absolute;mso-position-vertical-relative:text;mso-width-percent:0;mso-height-percent:0;mso-width-relative:page;mso-height-relative:page" o:gfxdata="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" strokecolor="#00a5b2" strokeweight="1.25pt"/>
+            <v:shape id="AutoShape 2" o:spid="_x0000_s1026" type="#_x0000_t32" style="position:absolute;left:0;text-align:left;margin-left:.3pt;margin-top:27.95pt;width:481.9pt;height:0;z-index:251660288;visibility:visible;mso-wrap-style:square;mso-width-percent:0;mso-height-percent:0;mso-wrap-distance-left:9pt;mso-wrap-distance-top:0;mso-wrap-distance-right:9pt;mso-wrap-distance-bottom:0;mso-position-horizontal:absolute;mso-position-horizontal-relative:text;mso-position-vertical:absolute;mso-position-vertical-relative:text;mso-width-percent:0;mso-height-percent:0;mso-width-relative:page;mso-height-relative:page" o:gfxdata="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" strokecolor="#00a5b2" strokeweight="1.25pt"/>
           </w:pict>
         </mc:Fallback>
       </mc:AlternateContent>
@@ -8414,8 +8449,8 @@
 </file>
 
 <file path=word/numbering.xml><?xml version="1.0" encoding="utf-8"?>
-<w:numbering xmlns:wpc="http://schemas.microsoft.com/office/word/2010/wordprocessingCanvas" xmlns:mc="http://schemas.openxmlformats.org/markup-compatibility/2006" xmlns:o="urn:schemas-microsoft-com:office:office" xmlns:r="http://schemas.openxmlformats.org/officeDocument/2006/relationships" xmlns:m="http://schemas.openxmlformats.org/officeDocument/2006/math" xmlns:v="urn:schemas-microsoft-com:vml" xmlns:wp14="http://schemas.microsoft.com/office/word/2010/wordprocessingDrawing" xmlns:wp="http://schemas.openxmlformats.org/drawingml/2006/wordprocessingDrawing" xmlns:w10="urn:schemas-microsoft-com:office:word" xmlns:w="http://schemas.openxmlformats.org/wordprocessingml/2006/main" xmlns:w14="http://schemas.microsoft.com/office/word/2010/wordml" xmlns:wpg="http://schemas.microsoft.com/office/word/2010/wordprocessingGroup" xmlns:wpi="http://schemas.microsoft.com/office/word/2010/wordprocessingInk" xmlns:wne="http://schemas.microsoft.com/office/word/2006/wordml" xmlns:wps="http://schemas.microsoft.com/office/word/2010/wordprocessingShape" mc:Ignorable="w14 wp14">
-  <w:abstractNum w:abstractNumId="0">
+<w:numbering xmlns:wpc="http://schemas.microsoft.com/office/word/2010/wordprocessingCanvas" xmlns:cx="http://schemas.microsoft.com/office/drawing/2014/chartex" xmlns:cx1="http://schemas.microsoft.com/office/drawing/2015/9/8/chartex" xmlns:cx2="http://schemas.microsoft.com/office/drawing/2015/10/21/chartex" xmlns:cx3="http://schemas.microsoft.com/office/drawing/2016/5/9/chartex" xmlns:cx4="http://schemas.microsoft.com/office/drawing/2016/5/10/chartex" xmlns:cx5="http://schemas.microsoft.com/office/drawing/2016/5/11/chartex" xmlns:cx6="http://schemas.microsoft.com/office/drawing/2016/5/12/chartex" xmlns:cx7="http://schemas.microsoft.com/office/drawing/2016/5/13/chartex" xmlns:cx8="http://schemas.microsoft.com/office/drawing/2016/5/14/chartex" xmlns:mc="http://schemas.openxmlformats.org/markup-compatibility/2006" xmlns:aink="http://schemas.microsoft.com/office/drawing/2016/ink" xmlns:am3d="http://schemas.microsoft.com/office/drawing/2017/model3d" xmlns:o="urn:schemas-microsoft-com:office:office" xmlns:r="http://schemas.openxmlformats.org/officeDocument/2006/relationships" xmlns:m="http://schemas.openxmlformats.org/officeDocument/2006/math" xmlns:v="urn:schemas-microsoft-com:vml" xmlns:wp14="http://schemas.microsoft.com/office/word/2010/wordprocessingDrawing" xmlns:wp="http://schemas.openxmlformats.org/drawingml/2006/wordprocessingDrawing" xmlns:w10="urn:schemas-microsoft-com:office:word" xmlns:w="http://schemas.openxmlformats.org/wordprocessingml/2006/main" xmlns:w14="http://schemas.microsoft.com/office/word/2010/wordml" xmlns:w15="http://schemas.microsoft.com/office/word/2012/wordml" xmlns:w16cex="http://schemas.microsoft.com/office/word/2018/wordml/cex" xmlns:w16cid="http://schemas.microsoft.com/office/word/2016/wordml/cid" xmlns:w16="http://schemas.microsoft.com/office/word/2018/wordml" xmlns:w16sdtdh="http://schemas.microsoft.com/office/word/2020/wordml/sdtdatahash" xmlns:w16se="http://schemas.microsoft.com/office/word/2015/wordml/symex" xmlns:wpg="http://schemas.microsoft.com/office/word/2010/wordprocessingGroup" xmlns:wpi="http://schemas.microsoft.com/office/word/2010/wordprocessingInk" xmlns:wne="http://schemas.microsoft.com/office/word/2006/wordml" xmlns:wps="http://schemas.microsoft.com/office/word/2010/wordprocessingShape" mc:Ignorable="w14 w15 w16se w16cid w16 w16cex w16sdtdh wp14">
+  <w:abstractNum w:abstractNumId="0" w15:restartNumberingAfterBreak="0">
     <w:nsid w:val="15DA78C5"/>
     <w:multiLevelType w:val="hybridMultilevel"/>
     <w:tmpl w:val="DB4CB6E0"/>
@@ -8504,7 +8539,7 @@
       </w:pPr>
     </w:lvl>
   </w:abstractNum>
-  <w:abstractNum w:abstractNumId="1">
+  <w:abstractNum w:abstractNumId="1" w15:restartNumberingAfterBreak="0">
     <w:nsid w:val="1A7F216C"/>
     <w:multiLevelType w:val="hybridMultilevel"/>
     <w:tmpl w:val="63EA938E"/>
@@ -8593,7 +8628,7 @@
       </w:pPr>
     </w:lvl>
   </w:abstractNum>
-  <w:abstractNum w:abstractNumId="2">
+  <w:abstractNum w:abstractNumId="2" w15:restartNumberingAfterBreak="0">
     <w:nsid w:val="263D28A9"/>
     <w:multiLevelType w:val="hybridMultilevel"/>
     <w:tmpl w:val="9F8AE932"/>
@@ -8682,7 +8717,7 @@
       </w:pPr>
     </w:lvl>
   </w:abstractNum>
-  <w:abstractNum w:abstractNumId="3">
+  <w:abstractNum w:abstractNumId="3" w15:restartNumberingAfterBreak="0">
     <w:nsid w:val="2B4D65C3"/>
     <w:multiLevelType w:val="hybridMultilevel"/>
     <w:tmpl w:val="3D66E6F2"/>
@@ -8771,7 +8806,7 @@
       </w:pPr>
     </w:lvl>
   </w:abstractNum>
-  <w:abstractNum w:abstractNumId="4">
+  <w:abstractNum w:abstractNumId="4" w15:restartNumberingAfterBreak="0">
     <w:nsid w:val="33E065CD"/>
     <w:multiLevelType w:val="hybridMultilevel"/>
     <w:tmpl w:val="14E28B68"/>
@@ -8860,7 +8895,7 @@
       </w:pPr>
     </w:lvl>
   </w:abstractNum>
-  <w:abstractNum w:abstractNumId="5">
+  <w:abstractNum w:abstractNumId="5" w15:restartNumberingAfterBreak="0">
     <w:nsid w:val="3C362515"/>
     <w:multiLevelType w:val="hybridMultilevel"/>
     <w:tmpl w:val="05A850BC"/>
@@ -8949,7 +8984,7 @@
       </w:pPr>
     </w:lvl>
   </w:abstractNum>
-  <w:abstractNum w:abstractNumId="6">
+  <w:abstractNum w:abstractNumId="6" w15:restartNumberingAfterBreak="0">
     <w:nsid w:val="3F607D34"/>
     <w:multiLevelType w:val="hybridMultilevel"/>
     <w:tmpl w:val="49942D72"/>
@@ -9038,7 +9073,7 @@
       </w:pPr>
     </w:lvl>
   </w:abstractNum>
-  <w:abstractNum w:abstractNumId="7">
+  <w:abstractNum w:abstractNumId="7" w15:restartNumberingAfterBreak="0">
     <w:nsid w:val="4D5C0FD1"/>
     <w:multiLevelType w:val="hybridMultilevel"/>
     <w:tmpl w:val="0FF80F2C"/>
@@ -9127,7 +9162,7 @@
       </w:pPr>
     </w:lvl>
   </w:abstractNum>
-  <w:abstractNum w:abstractNumId="8">
+  <w:abstractNum w:abstractNumId="8" w15:restartNumberingAfterBreak="0">
     <w:nsid w:val="52B66A2A"/>
     <w:multiLevelType w:val="hybridMultilevel"/>
     <w:tmpl w:val="6136E8E6"/>
@@ -9216,7 +9251,7 @@
       </w:pPr>
     </w:lvl>
   </w:abstractNum>
-  <w:abstractNum w:abstractNumId="9">
+  <w:abstractNum w:abstractNumId="9" w15:restartNumberingAfterBreak="0">
     <w:nsid w:val="5ED85DEE"/>
     <w:multiLevelType w:val="hybridMultilevel"/>
     <w:tmpl w:val="1616A454"/>
@@ -9305,7 +9340,7 @@
       </w:pPr>
     </w:lvl>
   </w:abstractNum>
-  <w:abstractNum w:abstractNumId="10">
+  <w:abstractNum w:abstractNumId="10" w15:restartNumberingAfterBreak="0">
     <w:nsid w:val="6B490F65"/>
     <w:multiLevelType w:val="hybridMultilevel"/>
     <w:tmpl w:val="7AC0B4EE"/>
@@ -9431,7 +9466,7 @@
 </file>
 
 <file path=word/styles.xml><?xml version="1.0" encoding="utf-8"?>
-<w:styles xmlns:mc="http://schemas.openxmlformats.org/markup-compatibility/2006" xmlns:r="http://schemas.openxmlformats.org/officeDocument/2006/relationships" xmlns:w="http://schemas.openxmlformats.org/wordprocessingml/2006/main" xmlns:w14="http://schemas.microsoft.com/office/word/2010/wordml" mc:Ignorable="w14">
+<w:styles xmlns:mc="http://schemas.openxmlformats.org/markup-compatibility/2006" xmlns:r="http://schemas.openxmlformats.org/officeDocument/2006/relationships" xmlns:w="http://schemas.openxmlformats.org/wordprocessingml/2006/main" xmlns:w14="http://schemas.microsoft.com/office/word/2010/wordml" xmlns:w15="http://schemas.microsoft.com/office/word/2012/wordml" xmlns:w16cex="http://schemas.microsoft.com/office/word/2018/wordml/cex" xmlns:w16cid="http://schemas.microsoft.com/office/word/2016/wordml/cid" xmlns:w16="http://schemas.microsoft.com/office/word/2018/wordml" xmlns:w16sdtdh="http://schemas.microsoft.com/office/word/2020/wordml/sdtdatahash" xmlns:w16se="http://schemas.microsoft.com/office/word/2015/wordml/symex" mc:Ignorable="w14 w15 w16se w16cid w16 w16cex w16sdtdh">
   <w:docDefaults>
     <w:rPrDefault>
       <w:rPr>
@@ -9441,144 +9476,383 @@
     </w:rPrDefault>
     <w:pPrDefault/>
   </w:docDefaults>
-  <w:latentStyles w:defLockedState="0" w:defUIPriority="99" w:defSemiHidden="1" w:defUnhideWhenUsed="1" w:defQFormat="0" w:count="267">
-    <w:lsdException w:name="Normal" w:semiHidden="0" w:uiPriority="0" w:unhideWhenUsed="0" w:qFormat="1"/>
-    <w:lsdException w:name="heading 1" w:semiHidden="0" w:uiPriority="9" w:unhideWhenUsed="0" w:qFormat="1"/>
-    <w:lsdException w:name="heading 2" w:uiPriority="9" w:qFormat="1"/>
-    <w:lsdException w:name="heading 3" w:uiPriority="9" w:qFormat="1"/>
-    <w:lsdException w:name="heading 4" w:uiPriority="9" w:qFormat="1"/>
-    <w:lsdException w:name="heading 5" w:uiPriority="9" w:qFormat="1"/>
-    <w:lsdException w:name="heading 6" w:uiPriority="9" w:qFormat="1"/>
-    <w:lsdException w:name="heading 7" w:uiPriority="9" w:qFormat="1"/>
-    <w:lsdException w:name="heading 8" w:uiPriority="9" w:qFormat="1"/>
-    <w:lsdException w:name="heading 9" w:uiPriority="9" w:qFormat="1"/>
-    <w:lsdException w:name="toc 1" w:uiPriority="39"/>
-    <w:lsdException w:name="toc 2" w:uiPriority="39"/>
-    <w:lsdException w:name="toc 3" w:uiPriority="39"/>
-    <w:lsdException w:name="toc 4" w:uiPriority="39"/>
-    <w:lsdException w:name="toc 5" w:uiPriority="39"/>
-    <w:lsdException w:name="toc 6" w:uiPriority="39"/>
-    <w:lsdException w:name="toc 7" w:uiPriority="39"/>
-    <w:lsdException w:name="toc 8" w:uiPriority="39"/>
-    <w:lsdException w:name="toc 9" w:uiPriority="39"/>
-    <w:lsdException w:name="caption" w:uiPriority="35" w:qFormat="1"/>
-    <w:lsdException w:name="Title" w:semiHidden="0" w:uiPriority="10" w:unhideWhenUsed="0" w:qFormat="1"/>
-    <w:lsdException w:name="Default Paragraph Font" w:uiPriority="1"/>
-    <w:lsdException w:name="Subtitle" w:semiHidden="0" w:uiPriority="11" w:unhideWhenUsed="0" w:qFormat="1"/>
-    <w:lsdException w:name="Strong" w:semiHidden="0" w:uiPriority="22" w:unhideWhenUsed="0" w:qFormat="1"/>
-    <w:lsdException w:name="Emphasis" w:semiHidden="0" w:uiPriority="20" w:unhideWhenUsed="0" w:qFormat="1"/>
-    <w:lsdException w:name="Table Grid" w:semiHidden="0" w:uiPriority="39" w:unhideWhenUsed="0"/>
-    <w:lsdException w:name="Placeholder Text" w:unhideWhenUsed="0"/>
-    <w:lsdException w:name="No Spacing" w:semiHidden="0" w:uiPriority="1" w:unhideWhenUsed="0" w:qFormat="1"/>
-    <w:lsdException w:name="Light Shading" w:semiHidden="0" w:uiPriority="60" w:unhideWhenUsed="0"/>
-    <w:lsdException w:name="Light List" w:semiHidden="0" w:uiPriority="61" w:unhideWhenUsed="0"/>
-    <w:lsdException w:name="Light Grid" w:semiHidden="0" w:uiPriority="62" w:unhideWhenUsed="0"/>
-    <w:lsdException w:name="Medium Shading 1" w:semiHidden="0" w:uiPriority="63" w:unhideWhenUsed="0"/>
-    <w:lsdException w:name="Medium Shading 2" w:semiHidden="0" w:uiPriority="64" w:unhideWhenUsed="0"/>
-    <w:lsdException w:name="Medium List 1" w:semiHidden="0" w:uiPriority="65" w:unhideWhenUsed="0"/>
-    <w:lsdException w:name="Medium List 2" w:semiHidden="0" w:uiPriority="66" w:unhideWhenUsed="0"/>
-    <w:lsdException w:name="Medium Grid 1" w:semiHidden="0" w:uiPriority="67" w:unhideWhenUsed="0"/>
-    <w:lsdException w:name="Medium Grid 2" w:semiHidden="0" w:uiPriority="68" w:unhideWhenUsed="0"/>
-    <w:lsdException w:name="Medium Grid 3" w:semiHidden="0" w:uiPriority="69" w:unhideWhenUsed="0"/>
-    <w:lsdException w:name="Dark List" w:semiHidden="0" w:uiPriority="70" w:unhideWhenUsed="0"/>
-    <w:lsdException w:name="Colorful Shading" w:semiHidden="0" w:uiPriority="71" w:unhideWhenUsed="0"/>
-    <w:lsdException w:name="Colorful List" w:semiHidden="0" w:uiPriority="72" w:unhideWhenUsed="0"/>
-    <w:lsdException w:name="Colorful Grid" w:semiHidden="0" w:uiPriority="73" w:unhideWhenUsed="0"/>
-    <w:lsdException w:name="Light Shading Accent 1" w:semiHidden="0" w:uiPriority="60" w:unhideWhenUsed="0"/>
-    <w:lsdException w:name="Light List Accent 1" w:semiHidden="0" w:uiPriority="61" w:unhideWhenUsed="0"/>
-    <w:lsdException w:name="Light Grid Accent 1" w:semiHidden="0" w:uiPriority="62" w:unhideWhenUsed="0"/>
-    <w:lsdException w:name="Medium Shading 1 Accent 1" w:semiHidden="0" w:uiPriority="63" w:unhideWhenUsed="0"/>
-    <w:lsdException w:name="Medium Shading 2 Accent 1" w:semiHidden="0" w:uiPriority="64" w:unhideWhenUsed="0"/>
-    <w:lsdException w:name="Medium List 1 Accent 1" w:semiHidden="0" w:uiPriority="65" w:unhideWhenUsed="0"/>
-    <w:lsdException w:name="Revision" w:unhideWhenUsed="0"/>
-    <w:lsdException w:name="List Paragraph" w:semiHidden="0" w:uiPriority="34" w:unhideWhenUsed="0" w:qFormat="1"/>
-    <w:lsdException w:name="Quote" w:semiHidden="0" w:uiPriority="29" w:unhideWhenUsed="0" w:qFormat="1"/>
-    <w:lsdException w:name="Intense Quote" w:semiHidden="0" w:uiPriority="30" w:unhideWhenUsed="0" w:qFormat="1"/>
-    <w:lsdException w:name="Medium List 2 Accent 1" w:semiHidden="0" w:uiPriority="66" w:unhideWhenUsed="0"/>
-    <w:lsdException w:name="Medium Grid 1 Accent 1" w:semiHidden="0" w:uiPriority="67" w:unhideWhenUsed="0"/>
-    <w:lsdException w:name="Medium Grid 2 Accent 1" w:semiHidden="0" w:uiPriority="68" w:unhideWhenUsed="0"/>
-    <w:lsdException w:name="Medium Grid 3 Accent 1" w:semiHidden="0" w:uiPriority="69" w:unhideWhenUsed="0"/>
-    <w:lsdException w:name="Dark List Accent 1" w:semiHidden="0" w:uiPriority="70" w:unhideWhenUsed="0"/>
-    <w:lsdException w:name="Colorful Shading Accent 1" w:semiHidden="0" w:uiPriority="71" w:unhideWhenUsed="0"/>
-    <w:lsdException w:name="Colorful List Accent 1" w:semiHidden="0" w:uiPriority="72" w:unhideWhenUsed="0"/>
-    <w:lsdException w:name="Colorful Grid Accent 1" w:semiHidden="0" w:uiPriority="73" w:unhideWhenUsed="0"/>
-    <w:lsdException w:name="Light Shading Accent 2" w:semiHidden="0" w:uiPriority="60" w:unhideWhenUsed="0"/>
-    <w:lsdException w:name="Light List Accent 2" w:semiHidden="0" w:uiPriority="61" w:unhideWhenUsed="0"/>
-    <w:lsdException w:name="Light Grid Accent 2" w:semiHidden="0" w:uiPriority="62" w:unhideWhenUsed="0"/>
-    <w:lsdException w:name="Medium Shading 1 Accent 2" w:semiHidden="0" w:uiPriority="63" w:unhideWhenUsed="0"/>
-    <w:lsdException w:name="Medium Shading 2 Accent 2" w:semiHidden="0" w:uiPriority="64" w:unhideWhenUsed="0"/>
-    <w:lsdException w:name="Medium List 1 Accent 2" w:semiHidden="0" w:uiPriority="65" w:unhideWhenUsed="0"/>
-    <w:lsdException w:name="Medium List 2 Accent 2" w:semiHidden="0" w:uiPriority="66" w:unhideWhenUsed="0"/>
-    <w:lsdException w:name="Medium Grid 1 Accent 2" w:semiHidden="0" w:uiPriority="67" w:unhideWhenUsed="0"/>
-    <w:lsdException w:name="Medium Grid 2 Accent 2" w:semiHidden="0" w:uiPriority="68" w:unhideWhenUsed="0"/>
-    <w:lsdException w:name="Medium Grid 3 Accent 2" w:semiHidden="0" w:uiPriority="69" w:unhideWhenUsed="0"/>
-    <w:lsdException w:name="Dark List Accent 2" w:semiHidden="0" w:uiPriority="70" w:unhideWhenUsed="0"/>
-    <w:lsdException w:name="Colorful Shading Accent 2" w:semiHidden="0" w:uiPriority="71" w:unhideWhenUsed="0"/>
-    <w:lsdException w:name="Colorful List Accent 2" w:semiHidden="0" w:uiPriority="72" w:unhideWhenUsed="0"/>
-    <w:lsdException w:name="Colorful Grid Accent 2" w:semiHidden="0" w:uiPriority="73" w:unhideWhenUsed="0"/>
-    <w:lsdException w:name="Light Shading Accent 3" w:semiHidden="0" w:uiPriority="60" w:unhideWhenUsed="0"/>
-    <w:lsdException w:name="Light List Accent 3" w:semiHidden="0" w:uiPriority="61" w:unhideWhenUsed="0"/>
-    <w:lsdException w:name="Light Grid Accent 3" w:semiHidden="0" w:uiPriority="62" w:unhideWhenUsed="0"/>
-    <w:lsdException w:name="Medium Shading 1 Accent 3" w:semiHidden="0" w:uiPriority="63" w:unhideWhenUsed="0"/>
-    <w:lsdException w:name="Medium Shading 2 Accent 3" w:semiHidden="0" w:uiPriority="64" w:unhideWhenUsed="0"/>
-    <w:lsdException w:name="Medium List 1 Accent 3" w:semiHidden="0" w:uiPriority="65" w:unhideWhenUsed="0"/>
-    <w:lsdException w:name="Medium List 2 Accent 3" w:semiHidden="0" w:uiPriority="66" w:unhideWhenUsed="0"/>
-    <w:lsdException w:name="Medium Grid 1 Accent 3" w:semiHidden="0" w:uiPriority="67" w:unhideWhenUsed="0"/>
-    <w:lsdException w:name="Medium Grid 2 Accent 3" w:semiHidden="0" w:uiPriority="68" w:unhideWhenUsed="0"/>
-    <w:lsdException w:name="Medium Grid 3 Accent 3" w:semiHidden="0" w:uiPriority="69" w:unhideWhenUsed="0"/>
-    <w:lsdException w:name="Dark List Accent 3" w:semiHidden="0" w:uiPriority="70" w:unhideWhenUsed="0"/>
-    <w:lsdException w:name="Colorful Shading Accent 3" w:semiHidden="0" w:uiPriority="71" w:unhideWhenUsed="0"/>
-    <w:lsdException w:name="Colorful List Accent 3" w:semiHidden="0" w:uiPriority="72" w:unhideWhenUsed="0"/>
-    <w:lsdException w:name="Colorful Grid Accent 3" w:semiHidden="0" w:uiPriority="73" w:unhideWhenUsed="0"/>
-    <w:lsdException w:name="Light Shading Accent 4" w:semiHidden="0" w:uiPriority="60" w:unhideWhenUsed="0"/>
-    <w:lsdException w:name="Light List Accent 4" w:semiHidden="0" w:uiPriority="61" w:unhideWhenUsed="0"/>
-    <w:lsdException w:name="Light Grid Accent 4" w:semiHidden="0" w:uiPriority="62" w:unhideWhenUsed="0"/>
-    <w:lsdException w:name="Medium Shading 1 Accent 4" w:semiHidden="0" w:uiPriority="63" w:unhideWhenUsed="0"/>
-    <w:lsdException w:name="Medium Shading 2 Accent 4" w:semiHidden="0" w:uiPriority="64" w:unhideWhenUsed="0"/>
-    <w:lsdException w:name="Medium List 1 Accent 4" w:semiHidden="0" w:uiPriority="65" w:unhideWhenUsed="0"/>
-    <w:lsdException w:name="Medium List 2 Accent 4" w:semiHidden="0" w:uiPriority="66" w:unhideWhenUsed="0"/>
-    <w:lsdException w:name="Medium Grid 1 Accent 4" w:semiHidden="0" w:uiPriority="67" w:unhideWhenUsed="0"/>
-    <w:lsdException w:name="Medium Grid 2 Accent 4" w:semiHidden="0" w:uiPriority="68" w:unhideWhenUsed="0"/>
-    <w:lsdException w:name="Medium Grid 3 Accent 4" w:semiHidden="0" w:uiPriority="69" w:unhideWhenUsed="0"/>
-    <w:lsdException w:name="Dark List Accent 4" w:semiHidden="0" w:uiPriority="70" w:unhideWhenUsed="0"/>
-    <w:lsdException w:name="Colorful Shading Accent 4" w:semiHidden="0" w:uiPriority="71" w:unhideWhenUsed="0"/>
-    <w:lsdException w:name="Colorful List Accent 4" w:semiHidden="0" w:uiPriority="72" w:unhideWhenUsed="0"/>
-    <w:lsdException w:name="Colorful Grid Accent 4" w:semiHidden="0" w:uiPriority="73" w:unhideWhenUsed="0"/>
-    <w:lsdException w:name="Light Shading Accent 5" w:semiHidden="0" w:uiPriority="60" w:unhideWhenUsed="0"/>
-    <w:lsdException w:name="Light List Accent 5" w:semiHidden="0" w:uiPriority="61" w:unhideWhenUsed="0"/>
-    <w:lsdException w:name="Light Grid Accent 5" w:semiHidden="0" w:uiPriority="62" w:unhideWhenUsed="0"/>
-    <w:lsdException w:name="Medium Shading 1 Accent 5" w:semiHidden="0" w:uiPriority="63" w:unhideWhenUsed="0"/>
-    <w:lsdException w:name="Medium Shading 2 Accent 5" w:semiHidden="0" w:uiPriority="64" w:unhideWhenUsed="0"/>
-    <w:lsdException w:name="Medium List 1 Accent 5" w:semiHidden="0" w:uiPriority="65" w:unhideWhenUsed="0"/>
-    <w:lsdException w:name="Medium List 2 Accent 5" w:semiHidden="0" w:uiPriority="66" w:unhideWhenUsed="0"/>
-    <w:lsdException w:name="Medium Grid 1 Accent 5" w:semiHidden="0" w:uiPriority="67" w:unhideWhenUsed="0"/>
-    <w:lsdException w:name="Medium Grid 2 Accent 5" w:semiHidden="0" w:uiPriority="68" w:unhideWhenUsed="0"/>
-    <w:lsdException w:name="Medium Grid 3 Accent 5" w:semiHidden="0" w:uiPriority="69" w:unhideWhenUsed="0"/>
-    <w:lsdException w:name="Dark List Accent 5" w:semiHidden="0" w:uiPriority="70" w:unhideWhenUsed="0"/>
-    <w:lsdException w:name="Colorful Shading Accent 5" w:semiHidden="0" w:uiPriority="71" w:unhideWhenUsed="0"/>
-    <w:lsdException w:name="Colorful List Accent 5" w:semiHidden="0" w:uiPriority="72" w:unhideWhenUsed="0"/>
-    <w:lsdException w:name="Colorful Grid Accent 5" w:semiHidden="0" w:uiPriority="73" w:unhideWhenUsed="0"/>
-    <w:lsdException w:name="Light Shading Accent 6" w:semiHidden="0" w:uiPriority="60" w:unhideWhenUsed="0"/>
-    <w:lsdException w:name="Light List Accent 6" w:semiHidden="0" w:uiPriority="61" w:unhideWhenUsed="0"/>
-    <w:lsdException w:name="Light Grid Accent 6" w:semiHidden="0" w:uiPriority="62" w:unhideWhenUsed="0"/>
-    <w:lsdException w:name="Medium Shading 1 Accent 6" w:semiHidden="0" w:uiPriority="63" w:unhideWhenUsed="0"/>
-    <w:lsdException w:name="Medium Shading 2 Accent 6" w:semiHidden="0" w:uiPriority="64" w:unhideWhenUsed="0"/>
-    <w:lsdException w:name="Medium List 1 Accent 6" w:semiHidden="0" w:uiPriority="65" w:unhideWhenUsed="0"/>
-    <w:lsdException w:name="Medium List 2 Accent 6" w:semiHidden="0" w:uiPriority="66" w:unhideWhenUsed="0"/>
-    <w:lsdException w:name="Medium Grid 1 Accent 6" w:semiHidden="0" w:uiPriority="67" w:unhideWhenUsed="0"/>
-    <w:lsdException w:name="Medium Grid 2 Accent 6" w:semiHidden="0" w:uiPriority="68" w:unhideWhenUsed="0"/>
-    <w:lsdException w:name="Medium Grid 3 Accent 6" w:semiHidden="0" w:uiPriority="69" w:unhideWhenUsed="0"/>
-    <w:lsdException w:name="Dark List Accent 6" w:semiHidden="0" w:uiPriority="70" w:unhideWhenUsed="0"/>
-    <w:lsdException w:name="Colorful Shading Accent 6" w:semiHidden="0" w:uiPriority="71" w:unhideWhenUsed="0"/>
-    <w:lsdException w:name="Colorful List Accent 6" w:semiHidden="0" w:uiPriority="72" w:unhideWhenUsed="0"/>
-    <w:lsdException w:name="Colorful Grid Accent 6" w:semiHidden="0" w:uiPriority="73" w:unhideWhenUsed="0"/>
-    <w:lsdException w:name="Subtle Emphasis" w:semiHidden="0" w:uiPriority="19" w:unhideWhenUsed="0" w:qFormat="1"/>
-    <w:lsdException w:name="Intense Emphasis" w:semiHidden="0" w:uiPriority="21" w:unhideWhenUsed="0" w:qFormat="1"/>
-    <w:lsdException w:name="Subtle Reference" w:semiHidden="0" w:uiPriority="31" w:unhideWhenUsed="0" w:qFormat="1"/>
-    <w:lsdException w:name="Intense Reference" w:semiHidden="0" w:uiPriority="32" w:unhideWhenUsed="0" w:qFormat="1"/>
-    <w:lsdException w:name="Book Title" w:semiHidden="0" w:uiPriority="33" w:unhideWhenUsed="0" w:qFormat="1"/>
-    <w:lsdException w:name="Bibliography" w:uiPriority="37"/>
-    <w:lsdException w:name="TOC Heading" w:uiPriority="39" w:qFormat="1"/>
+  <w:latentStyles w:defLockedState="0" w:defUIPriority="99" w:defSemiHidden="0" w:defUnhideWhenUsed="0" w:defQFormat="0" w:count="376">
+    <w:lsdException w:name="Normal" w:uiPriority="0" w:qFormat="1"/>
+    <w:lsdException w:name="heading 1" w:uiPriority="9" w:qFormat="1"/>
+    <w:lsdException w:name="heading 2" w:semiHidden="1" w:uiPriority="9" w:unhideWhenUsed="1" w:qFormat="1"/>
+    <w:lsdException w:name="heading 3" w:semiHidden="1" w:uiPriority="9" w:unhideWhenUsed="1" w:qFormat="1"/>
+    <w:lsdException w:name="heading 4" w:semiHidden="1" w:uiPriority="9" w:unhideWhenUsed="1" w:qFormat="1"/>
+    <w:lsdException w:name="heading 5" w:semiHidden="1" w:uiPriority="9" w:unhideWhenUsed="1" w:qFormat="1"/>
+    <w:lsdException w:name="heading 6" w:semiHidden="1" w:uiPriority="9" w:unhideWhenUsed="1" w:qFormat="1"/>
+    <w:lsdException w:name="heading 7" w:semiHidden="1" w:uiPriority="9" w:unhideWhenUsed="1" w:qFormat="1"/>
+    <w:lsdException w:name="heading 8" w:semiHidden="1" w:uiPriority="9" w:unhideWhenUsed="1" w:qFormat="1"/>
+    <w:lsdException w:name="heading 9" w:semiHidden="1" w:uiPriority="9" w:unhideWhenUsed="1" w:qFormat="1"/>
+    <w:lsdException w:name="index 1" w:semiHidden="1" w:unhideWhenUsed="1"/>
+    <w:lsdException w:name="index 2" w:semiHidden="1" w:unhideWhenUsed="1"/>
+    <w:lsdException w:name="index 3" w:semiHidden="1" w:unhideWhenUsed="1"/>
+    <w:lsdException w:name="index 4" w:semiHidden="1" w:unhideWhenUsed="1"/>
+    <w:lsdException w:name="index 5" w:semiHidden="1" w:unhideWhenUsed="1"/>
+    <w:lsdException w:name="index 6" w:semiHidden="1" w:unhideWhenUsed="1"/>
+    <w:lsdException w:name="index 7" w:semiHidden="1" w:unhideWhenUsed="1"/>
+    <w:lsdException w:name="index 8" w:semiHidden="1" w:unhideWhenUsed="1"/>
+    <w:lsdException w:name="index 9" w:semiHidden="1" w:unhideWhenUsed="1"/>
+    <w:lsdException w:name="toc 1" w:semiHidden="1" w:uiPriority="39" w:unhideWhenUsed="1"/>
+    <w:lsdException w:name="toc 2" w:semiHidden="1" w:uiPriority="39" w:unhideWhenUsed="1"/>
+    <w:lsdException w:name="toc 3" w:semiHidden="1" w:uiPriority="39" w:unhideWhenUsed="1"/>
+    <w:lsdException w:name="toc 4" w:semiHidden="1" w:uiPriority="39" w:unhideWhenUsed="1"/>
+    <w:lsdException w:name="toc 5" w:semiHidden="1" w:uiPriority="39" w:unhideWhenUsed="1"/>
+    <w:lsdException w:name="toc 6" w:semiHidden="1" w:uiPriority="39" w:unhideWhenUsed="1"/>
+    <w:lsdException w:name="toc 7" w:semiHidden="1" w:uiPriority="39" w:unhideWhenUsed="1"/>
+    <w:lsdException w:name="toc 8" w:semiHidden="1" w:uiPriority="39" w:unhideWhenUsed="1"/>
+    <w:lsdException w:name="toc 9" w:semiHidden="1" w:uiPriority="39" w:unhideWhenUsed="1"/>
+    <w:lsdException w:name="Normal Indent" w:semiHidden="1" w:unhideWhenUsed="1"/>
+    <w:lsdException w:name="footnote text" w:semiHidden="1" w:unhideWhenUsed="1"/>
+    <w:lsdException w:name="annotation text" w:semiHidden="1" w:unhideWhenUsed="1"/>
+    <w:lsdException w:name="header" w:semiHidden="1" w:unhideWhenUsed="1"/>
+    <w:lsdException w:name="footer" w:semiHidden="1" w:unhideWhenUsed="1"/>
+    <w:lsdException w:name="index heading" w:semiHidden="1" w:unhideWhenUsed="1"/>
+    <w:lsdException w:name="caption" w:semiHidden="1" w:uiPriority="35" w:unhideWhenUsed="1" w:qFormat="1"/>
+    <w:lsdException w:name="table of figures" w:semiHidden="1" w:unhideWhenUsed="1"/>
+    <w:lsdException w:name="envelope address" w:semiHidden="1" w:unhideWhenUsed="1"/>
+    <w:lsdException w:name="envelope return" w:semiHidden="1" w:unhideWhenUsed="1"/>
+    <w:lsdException w:name="footnote reference" w:semiHidden="1" w:unhideWhenUsed="1"/>
+    <w:lsdException w:name="annotation reference" w:semiHidden="1" w:unhideWhenUsed="1"/>
+    <w:lsdException w:name="line number" w:semiHidden="1" w:unhideWhenUsed="1"/>
+    <w:lsdException w:name="page number" w:semiHidden="1" w:unhideWhenUsed="1"/>
+    <w:lsdException w:name="endnote reference" w:semiHidden="1" w:unhideWhenUsed="1"/>
+    <w:lsdException w:name="endnote text" w:semiHidden="1" w:unhideWhenUsed="1"/>
+    <w:lsdException w:name="table of authorities" w:semiHidden="1" w:unhideWhenUsed="1"/>
+    <w:lsdException w:name="macro" w:semiHidden="1" w:unhideWhenUsed="1"/>
+    <w:lsdException w:name="toa heading" w:semiHidden="1" w:unhideWhenUsed="1"/>
+    <w:lsdException w:name="List" w:semiHidden="1" w:unhideWhenUsed="1"/>
+    <w:lsdException w:name="List Bullet" w:semiHidden="1" w:unhideWhenUsed="1"/>
+    <w:lsdException w:name="List Number" w:semiHidden="1" w:unhideWhenUsed="1"/>
+    <w:lsdException w:name="List 2" w:semiHidden="1" w:unhideWhenUsed="1"/>
+    <w:lsdException w:name="List 3" w:semiHidden="1" w:unhideWhenUsed="1"/>
+    <w:lsdException w:name="List 4" w:semiHidden="1" w:unhideWhenUsed="1"/>
+    <w:lsdException w:name="List 5" w:semiHidden="1" w:unhideWhenUsed="1"/>
+    <w:lsdException w:name="List Bullet 2" w:semiHidden="1" w:unhideWhenUsed="1"/>
+    <w:lsdException w:name="List Bullet 3" w:semiHidden="1" w:unhideWhenUsed="1"/>
+    <w:lsdException w:name="List Bullet 4" w:semiHidden="1" w:unhideWhenUsed="1"/>
+    <w:lsdException w:name="List Bullet 5" w:semiHidden="1" w:unhideWhenUsed="1"/>
+    <w:lsdException w:name="List Number 2" w:semiHidden="1" w:unhideWhenUsed="1"/>
+    <w:lsdException w:name="List Number 3" w:semiHidden="1" w:unhideWhenUsed="1"/>
+    <w:lsdException w:name="List Number 4" w:semiHidden="1" w:unhideWhenUsed="1"/>
+    <w:lsdException w:name="List Number 5" w:semiHidden="1" w:unhideWhenUsed="1"/>
+    <w:lsdException w:name="Title" w:uiPriority="10" w:qFormat="1"/>
+    <w:lsdException w:name="Closing" w:semiHidden="1" w:unhideWhenUsed="1"/>
+    <w:lsdException w:name="Signature" w:semiHidden="1" w:unhideWhenUsed="1"/>
+    <w:lsdException w:name="Default Paragraph Font" w:semiHidden="1" w:uiPriority="1" w:unhideWhenUsed="1"/>
+    <w:lsdException w:name="Body Text" w:semiHidden="1" w:unhideWhenUsed="1"/>
+    <w:lsdException w:name="Body Text Indent" w:semiHidden="1" w:unhideWhenUsed="1"/>
+    <w:lsdException w:name="List Continue" w:semiHidden="1" w:unhideWhenUsed="1"/>
+    <w:lsdException w:name="List Continue 2" w:semiHidden="1" w:unhideWhenUsed="1"/>
+    <w:lsdException w:name="List Continue 3" w:semiHidden="1" w:unhideWhenUsed="1"/>
+    <w:lsdException w:name="List Continue 4" w:semiHidden="1" w:unhideWhenUsed="1"/>
+    <w:lsdException w:name="List Continue 5" w:semiHidden="1" w:unhideWhenUsed="1"/>
+    <w:lsdException w:name="Message Header" w:semiHidden="1" w:unhideWhenUsed="1"/>
+    <w:lsdException w:name="Subtitle" w:uiPriority="11" w:qFormat="1"/>
+    <w:lsdException w:name="Salutation" w:semiHidden="1" w:unhideWhenUsed="1"/>
+    <w:lsdException w:name="Date" w:semiHidden="1" w:unhideWhenUsed="1"/>
+    <w:lsdException w:name="Body Text First Indent" w:semiHidden="1" w:unhideWhenUsed="1"/>
+    <w:lsdException w:name="Body Text First Indent 2" w:semiHidden="1" w:unhideWhenUsed="1"/>
+    <w:lsdException w:name="Note Heading" w:semiHidden="1" w:unhideWhenUsed="1"/>
+    <w:lsdException w:name="Body Text 2" w:semiHidden="1" w:unhideWhenUsed="1"/>
+    <w:lsdException w:name="Body Text 3" w:semiHidden="1" w:unhideWhenUsed="1"/>
+    <w:lsdException w:name="Body Text Indent 2" w:semiHidden="1" w:unhideWhenUsed="1"/>
+    <w:lsdException w:name="Body Text Indent 3" w:semiHidden="1" w:unhideWhenUsed="1"/>
+    <w:lsdException w:name="Block Text" w:semiHidden="1" w:unhideWhenUsed="1"/>
+    <w:lsdException w:name="Hyperlink" w:semiHidden="1" w:unhideWhenUsed="1"/>
+    <w:lsdException w:name="FollowedHyperlink" w:semiHidden="1" w:unhideWhenUsed="1"/>
+    <w:lsdException w:name="Strong" w:uiPriority="22" w:qFormat="1"/>
+    <w:lsdException w:name="Emphasis" w:uiPriority="20" w:qFormat="1"/>
+    <w:lsdException w:name="Document Map" w:semiHidden="1" w:unhideWhenUsed="1"/>
+    <w:lsdException w:name="Plain Text" w:semiHidden="1" w:unhideWhenUsed="1"/>
+    <w:lsdException w:name="E-mail Signature" w:semiHidden="1" w:unhideWhenUsed="1"/>
+    <w:lsdException w:name="HTML Top of Form" w:semiHidden="1" w:unhideWhenUsed="1"/>
+    <w:lsdException w:name="HTML Bottom of Form" w:semiHidden="1" w:unhideWhenUsed="1"/>
+    <w:lsdException w:name="Normal (Web)" w:semiHidden="1" w:unhideWhenUsed="1"/>
+    <w:lsdException w:name="HTML Acronym" w:semiHidden="1" w:unhideWhenUsed="1"/>
+    <w:lsdException w:name="HTML Address" w:semiHidden="1" w:unhideWhenUsed="1"/>
+    <w:lsdException w:name="HTML Cite" w:semiHidden="1" w:unhideWhenUsed="1"/>
+    <w:lsdException w:name="HTML Code" w:semiHidden="1" w:unhideWhenUsed="1"/>
+    <w:lsdException w:name="HTML Definition" w:semiHidden="1" w:unhideWhenUsed="1"/>
+    <w:lsdException w:name="HTML Keyboard" w:semiHidden="1" w:unhideWhenUsed="1"/>
+    <w:lsdException w:name="HTML Preformatted" w:semiHidden="1" w:unhideWhenUsed="1"/>
+    <w:lsdException w:name="HTML Sample" w:semiHidden="1" w:unhideWhenUsed="1"/>
+    <w:lsdException w:name="HTML Typewriter" w:semiHidden="1" w:unhideWhenUsed="1"/>
+    <w:lsdException w:name="HTML Variable" w:semiHidden="1" w:unhideWhenUsed="1"/>
+    <w:lsdException w:name="Normal Table" w:semiHidden="1" w:unhideWhenUsed="1"/>
+    <w:lsdException w:name="annotation subject" w:semiHidden="1" w:unhideWhenUsed="1"/>
+    <w:lsdException w:name="No List" w:semiHidden="1" w:unhideWhenUsed="1"/>
+    <w:lsdException w:name="Outline List 1" w:semiHidden="1" w:unhideWhenUsed="1"/>
+    <w:lsdException w:name="Outline List 2" w:semiHidden="1" w:unhideWhenUsed="1"/>
+    <w:lsdException w:name="Outline List 3" w:semiHidden="1" w:unhideWhenUsed="1"/>
+    <w:lsdException w:name="Table Simple 1" w:semiHidden="1" w:unhideWhenUsed="1"/>
+    <w:lsdException w:name="Table Simple 2" w:semiHidden="1" w:unhideWhenUsed="1"/>
+    <w:lsdException w:name="Table Simple 3" w:semiHidden="1" w:unhideWhenUsed="1"/>
+    <w:lsdException w:name="Table Classic 1" w:semiHidden="1" w:unhideWhenUsed="1"/>
+    <w:lsdException w:name="Table Classic 2" w:semiHidden="1" w:unhideWhenUsed="1"/>
+    <w:lsdException w:name="Table Classic 3" w:semiHidden="1" w:unhideWhenUsed="1"/>
+    <w:lsdException w:name="Table Classic 4" w:semiHidden="1" w:unhideWhenUsed="1"/>
+    <w:lsdException w:name="Table Colorful 1" w:semiHidden="1" w:unhideWhenUsed="1"/>
+    <w:lsdException w:name="Table Colorful 2" w:semiHidden="1" w:unhideWhenUsed="1"/>
+    <w:lsdException w:name="Table Colorful 3" w:semiHidden="1" w:unhideWhenUsed="1"/>
+    <w:lsdException w:name="Table Columns 1" w:semiHidden="1" w:unhideWhenUsed="1"/>
+    <w:lsdException w:name="Table Columns 2" w:semiHidden="1" w:unhideWhenUsed="1"/>
+    <w:lsdException w:name="Table Columns 3" w:semiHidden="1" w:unhideWhenUsed="1"/>
+    <w:lsdException w:name="Table Columns 4" w:semiHidden="1" w:unhideWhenUsed="1"/>
+    <w:lsdException w:name="Table Columns 5" w:semiHidden="1" w:unhideWhenUsed="1"/>
+    <w:lsdException w:name="Table Grid 1" w:semiHidden="1" w:unhideWhenUsed="1"/>
+    <w:lsdException w:name="Table Grid 2" w:semiHidden="1" w:unhideWhenUsed="1"/>
+    <w:lsdException w:name="Table Grid 3" w:semiHidden="1" w:unhideWhenUsed="1"/>
+    <w:lsdException w:name="Table Grid 4" w:semiHidden="1" w:unhideWhenUsed="1"/>
+    <w:lsdException w:name="Table Grid 5" w:semiHidden="1" w:unhideWhenUsed="1"/>
+    <w:lsdException w:name="Table Grid 6" w:semiHidden="1" w:unhideWhenUsed="1"/>
+    <w:lsdException w:name="Table Grid 7" w:semiHidden="1" w:unhideWhenUsed="1"/>
+    <w:lsdException w:name="Table Grid 8" w:semiHidden="1" w:unhideWhenUsed="1"/>
+    <w:lsdException w:name="Table List 1" w:semiHidden="1" w:unhideWhenUsed="1"/>
+    <w:lsdException w:name="Table List 2" w:semiHidden="1" w:unhideWhenUsed="1"/>
+    <w:lsdException w:name="Table List 3" w:semiHidden="1" w:unhideWhenUsed="1"/>
+    <w:lsdException w:name="Table List 4" w:semiHidden="1" w:unhideWhenUsed="1"/>
+    <w:lsdException w:name="Table List 5" w:semiHidden="1" w:unhideWhenUsed="1"/>
+    <w:lsdException w:name="Table List 6" w:semiHidden="1" w:unhideWhenUsed="1"/>
+    <w:lsdException w:name="Table List 7" w:semiHidden="1" w:unhideWhenUsed="1"/>
+    <w:lsdException w:name="Table List 8" w:semiHidden="1" w:unhideWhenUsed="1"/>
+    <w:lsdException w:name="Table 3D effects 1" w:semiHidden="1" w:unhideWhenUsed="1"/>
+    <w:lsdException w:name="Table 3D effects 2" w:semiHidden="1" w:unhideWhenUsed="1"/>
+    <w:lsdException w:name="Table 3D effects 3" w:semiHidden="1" w:unhideWhenUsed="1"/>
+    <w:lsdException w:name="Table Contemporary" w:semiHidden="1" w:unhideWhenUsed="1"/>
+    <w:lsdException w:name="Table Elegant" w:semiHidden="1" w:unhideWhenUsed="1"/>
+    <w:lsdException w:name="Table Professional" w:semiHidden="1" w:unhideWhenUsed="1"/>
+    <w:lsdException w:name="Table Subtle 1" w:semiHidden="1" w:unhideWhenUsed="1"/>
+    <w:lsdException w:name="Table Subtle 2" w:semiHidden="1" w:unhideWhenUsed="1"/>
+    <w:lsdException w:name="Table Web 1" w:semiHidden="1" w:unhideWhenUsed="1"/>
+    <w:lsdException w:name="Table Web 2" w:semiHidden="1" w:unhideWhenUsed="1"/>
+    <w:lsdException w:name="Table Web 3" w:semiHidden="1" w:unhideWhenUsed="1"/>
+    <w:lsdException w:name="Balloon Text" w:semiHidden="1" w:unhideWhenUsed="1"/>
+    <w:lsdException w:name="Table Grid" w:semiHidden="1" w:uiPriority="39" w:unhideWhenUsed="1"/>
+    <w:lsdException w:name="Table Theme" w:semiHidden="1" w:unhideWhenUsed="1"/>
+    <w:lsdException w:name="Placeholder Text" w:semiHidden="1"/>
+    <w:lsdException w:name="No Spacing" w:uiPriority="1" w:qFormat="1"/>
+    <w:lsdException w:name="Light Shading" w:uiPriority="60"/>
+    <w:lsdException w:name="Light List" w:uiPriority="61"/>
+    <w:lsdException w:name="Light Grid" w:uiPriority="62"/>
+    <w:lsdException w:name="Medium Shading 1" w:uiPriority="63"/>
+    <w:lsdException w:name="Medium Shading 2" w:uiPriority="64"/>
+    <w:lsdException w:name="Medium List 1" w:uiPriority="65"/>
+    <w:lsdException w:name="Medium List 2" w:uiPriority="66"/>
+    <w:lsdException w:name="Medium Grid 1" w:uiPriority="67"/>
+    <w:lsdException w:name="Medium Grid 2" w:uiPriority="68"/>
+    <w:lsdException w:name="Medium Grid 3" w:uiPriority="69"/>
+    <w:lsdException w:name="Dark List" w:uiPriority="70"/>
+    <w:lsdException w:name="Colorful Shading" w:uiPriority="71"/>
+    <w:lsdException w:name="Colorful List" w:uiPriority="72"/>
+    <w:lsdException w:name="Colorful Grid" w:uiPriority="73"/>
+    <w:lsdException w:name="Light Shading Accent 1" w:uiPriority="60"/>
+    <w:lsdException w:name="Light List Accent 1" w:uiPriority="61"/>
+    <w:lsdException w:name="Light Grid Accent 1" w:uiPriority="62"/>
+    <w:lsdException w:name="Medium Shading 1 Accent 1" w:uiPriority="63"/>
+    <w:lsdException w:name="Medium Shading 2 Accent 1" w:uiPriority="64"/>
+    <w:lsdException w:name="Medium List 1 Accent 1" w:uiPriority="65"/>
+    <w:lsdException w:name="Revision" w:semiHidden="1"/>
+    <w:lsdException w:name="List Paragraph" w:uiPriority="34" w:qFormat="1"/>
+    <w:lsdException w:name="Quote" w:uiPriority="29" w:qFormat="1"/>
+    <w:lsdException w:name="Intense Quote" w:uiPriority="30" w:qFormat="1"/>
+    <w:lsdException w:name="Medium List 2 Accent 1" w:uiPriority="66"/>
+    <w:lsdException w:name="Medium Grid 1 Accent 1" w:uiPriority="67"/>
+    <w:lsdException w:name="Medium Grid 2 Accent 1" w:uiPriority="68"/>
+    <w:lsdException w:name="Medium Grid 3 Accent 1" w:uiPriority="69"/>
+    <w:lsdException w:name="Dark List Accent 1" w:uiPriority="70"/>
+    <w:lsdException w:name="Colorful Shading Accent 1" w:uiPriority="71"/>
+    <w:lsdException w:name="Colorful List Accent 1" w:uiPriority="72"/>
+    <w:lsdException w:name="Colorful Grid Accent 1" w:uiPriority="73"/>
+    <w:lsdException w:name="Light Shading Accent 2" w:uiPriority="60"/>
+    <w:lsdException w:name="Light List Accent 2" w:uiPriority="61"/>
+    <w:lsdException w:name="Light Grid Accent 2" w:uiPriority="62"/>
+    <w:lsdException w:name="Medium Shading 1 Accent 2" w:uiPriority="63"/>
+    <w:lsdException w:name="Medium Shading 2 Accent 2" w:uiPriority="64"/>
+    <w:lsdException w:name="Medium List 1 Accent 2" w:uiPriority="65"/>
+    <w:lsdException w:name="Medium List 2 Accent 2" w:uiPriority="66"/>
+    <w:lsdException w:name="Medium Grid 1 Accent 2" w:uiPriority="67"/>
+    <w:lsdException w:name="Medium Grid 2 Accent 2" w:uiPriority="68"/>
+    <w:lsdException w:name="Medium Grid 3 Accent 2" w:uiPriority="69"/>
+    <w:lsdException w:name="Dark List Accent 2" w:uiPriority="70"/>
+    <w:lsdException w:name="Colorful Shading Accent 2" w:uiPriority="71"/>
+    <w:lsdException w:name="Colorful List Accent 2" w:uiPriority="72"/>
+    <w:lsdException w:name="Colorful Grid Accent 2" w:uiPriority="73"/>
+    <w:lsdException w:name="Light Shading Accent 3" w:uiPriority="60"/>
+    <w:lsdException w:name="Light List Accent 3" w:uiPriority="61"/>
+    <w:lsdException w:name="Light Grid Accent 3" w:uiPriority="62"/>
+    <w:lsdException w:name="Medium Shading 1 Accent 3" w:uiPriority="63"/>
+    <w:lsdException w:name="Medium Shading 2 Accent 3" w:uiPriority="64"/>
+    <w:lsdException w:name="Medium List 1 Accent 3" w:uiPriority="65"/>
+    <w:lsdException w:name="Medium List 2 Accent 3" w:uiPriority="66"/>
+    <w:lsdException w:name="Medium Grid 1 Accent 3" w:uiPriority="67"/>
+    <w:lsdException w:name="Medium Grid 2 Accent 3" w:uiPriority="68"/>
+    <w:lsdException w:name="Medium Grid 3 Accent 3" w:uiPriority="69"/>
+    <w:lsdException w:name="Dark List Accent 3" w:uiPriority="70"/>
+    <w:lsdException w:name="Colorful Shading Accent 3" w:uiPriority="71"/>
+    <w:lsdException w:name="Colorful List Accent 3" w:uiPriority="72"/>
+    <w:lsdException w:name="Colorful Grid Accent 3" w:uiPriority="73"/>
+    <w:lsdException w:name="Light Shading Accent 4" w:uiPriority="60"/>
+    <w:lsdException w:name="Light List Accent 4" w:uiPriority="61"/>
+    <w:lsdException w:name="Light Grid Accent 4" w:uiPriority="62"/>
+    <w:lsdException w:name="Medium Shading 1 Accent 4" w:uiPriority="63"/>
+    <w:lsdException w:name="Medium Shading 2 Accent 4" w:uiPriority="64"/>
+    <w:lsdException w:name="Medium List 1 Accent 4" w:uiPriority="65"/>
+    <w:lsdException w:name="Medium List 2 Accent 4" w:uiPriority="66"/>
+    <w:lsdException w:name="Medium Grid 1 Accent 4" w:uiPriority="67"/>
+    <w:lsdException w:name="Medium Grid 2 Accent 4" w:uiPriority="68"/>
+    <w:lsdException w:name="Medium Grid 3 Accent 4" w:uiPriority="69"/>
+    <w:lsdException w:name="Dark List Accent 4" w:uiPriority="70"/>
+    <w:lsdException w:name="Colorful Shading Accent 4" w:uiPriority="71"/>
+    <w:lsdException w:name="Colorful List Accent 4" w:uiPriority="72"/>
+    <w:lsdException w:name="Colorful Grid Accent 4" w:uiPriority="73"/>
+    <w:lsdException w:name="Light Shading Accent 5" w:uiPriority="60"/>
+    <w:lsdException w:name="Light List Accent 5" w:uiPriority="61"/>
+    <w:lsdException w:name="Light Grid Accent 5" w:uiPriority="62"/>
+    <w:lsdException w:name="Medium Shading 1 Accent 5" w:uiPriority="63"/>
+    <w:lsdException w:name="Medium Shading 2 Accent 5" w:uiPriority="64"/>
+    <w:lsdException w:name="Medium List 1 Accent 5" w:uiPriority="65"/>
+    <w:lsdException w:name="Medium List 2 Accent 5" w:uiPriority="66"/>
+    <w:lsdException w:name="Medium Grid 1 Accent 5" w:uiPriority="67"/>
+    <w:lsdException w:name="Medium Grid 2 Accent 5" w:uiPriority="68"/>
+    <w:lsdException w:name="Medium Grid 3 Accent 5" w:uiPriority="69"/>
+    <w:lsdException w:name="Dark List Accent 5" w:uiPriority="70"/>
+    <w:lsdException w:name="Colorful Shading Accent 5" w:uiPriority="71"/>
+    <w:lsdException w:name="Colorful List Accent 5" w:uiPriority="72"/>
+    <w:lsdException w:name="Colorful Grid Accent 5" w:uiPriority="73"/>
+    <w:lsdException w:name="Light Shading Accent 6" w:uiPriority="60"/>
+    <w:lsdException w:name="Light List Accent 6" w:uiPriority="61"/>
+    <w:lsdException w:name="Light Grid Accent 6" w:uiPriority="62"/>
+    <w:lsdException w:name="Medium Shading 1 Accent 6" w:uiPriority="63"/>
+    <w:lsdException w:name="Medium Shading 2 Accent 6" w:uiPriority="64"/>
+    <w:lsdException w:name="Medium List 1 Accent 6" w:uiPriority="65"/>
+    <w:lsdException w:name="Medium List 2 Accent 6" w:uiPriority="66"/>
+    <w:lsdException w:name="Medium Grid 1 Accent 6" w:uiPriority="67"/>
+    <w:lsdException w:name="Medium Grid 2 Accent 6" w:uiPriority="68"/>
+    <w:lsdException w:name="Medium Grid 3 Accent 6" w:uiPriority="69"/>
+    <w:lsdException w:name="Dark List Accent 6" w:uiPriority="70"/>
+    <w:lsdException w:name="Colorful Shading Accent 6" w:uiPriority="71"/>
+    <w:lsdException w:name="Colorful List Accent 6" w:uiPriority="72"/>
+    <w:lsdException w:name="Colorful Grid Accent 6" w:uiPriority="73"/>
+    <w:lsdException w:name="Subtle Emphasis" w:uiPriority="19" w:qFormat="1"/>
+    <w:lsdException w:name="Intense Emphasis" w:uiPriority="21" w:qFormat="1"/>
+    <w:lsdException w:name="Subtle Reference" w:uiPriority="31" w:qFormat="1"/>
+    <w:lsdException w:name="Intense Reference" w:uiPriority="32" w:qFormat="1"/>
+    <w:lsdException w:name="Book Title" w:uiPriority="33" w:qFormat="1"/>
+    <w:lsdException w:name="Bibliography" w:semiHidden="1" w:uiPriority="37" w:unhideWhenUsed="1"/>
+    <w:lsdException w:name="TOC Heading" w:semiHidden="1" w:uiPriority="39" w:unhideWhenUsed="1" w:qFormat="1"/>
+    <w:lsdException w:name="Plain Table 1" w:uiPriority="41"/>
+    <w:lsdException w:name="Plain Table 2" w:uiPriority="42"/>
+    <w:lsdException w:name="Plain Table 3" w:uiPriority="43"/>
+    <w:lsdException w:name="Plain Table 4" w:uiPriority="44"/>
+    <w:lsdException w:name="Plain Table 5" w:uiPriority="45"/>
+    <w:lsdException w:name="Grid Table Light" w:uiPriority="40"/>
+    <w:lsdException w:name="Grid Table 1 Light" w:uiPriority="46"/>
+    <w:lsdException w:name="Grid Table 2" w:uiPriority="47"/>
+    <w:lsdException w:name="Grid Table 3" w:uiPriority="48"/>
+    <w:lsdException w:name="Grid Table 4" w:uiPriority="49"/>
+    <w:lsdException w:name="Grid Table 5 Dark" w:uiPriority="50"/>
+    <w:lsdException w:name="Grid Table 6 Colorful" w:uiPriority="51"/>
+    <w:lsdException w:name="Grid Table 7 Colorful" w:uiPriority="52"/>
+    <w:lsdException w:name="Grid Table 1 Light Accent 1" w:uiPriority="46"/>
+    <w:lsdException w:name="Grid Table 2 Accent 1" w:uiPriority="47"/>
+    <w:lsdException w:name="Grid Table 3 Accent 1" w:uiPriority="48"/>
+    <w:lsdException w:name="Grid Table 4 Accent 1" w:uiPriority="49"/>
+    <w:lsdException w:name="Grid Table 5 Dark Accent 1" w:uiPriority="50"/>
+    <w:lsdException w:name="Grid Table 6 Colorful Accent 1" w:uiPriority="51"/>
+    <w:lsdException w:name="Grid Table 7 Colorful Accent 1" w:uiPriority="52"/>
+    <w:lsdException w:name="Grid Table 1 Light Accent 2" w:uiPriority="46"/>
+    <w:lsdException w:name="Grid Table 2 Accent 2" w:uiPriority="47"/>
+    <w:lsdException w:name="Grid Table 3 Accent 2" w:uiPriority="48"/>
+    <w:lsdException w:name="Grid Table 4 Accent 2" w:uiPriority="49"/>
+    <w:lsdException w:name="Grid Table 5 Dark Accent 2" w:uiPriority="50"/>
+    <w:lsdException w:name="Grid Table 6 Colorful Accent 2" w:uiPriority="51"/>
+    <w:lsdException w:name="Grid Table 7 Colorful Accent 2" w:uiPriority="52"/>
+    <w:lsdException w:name="Grid Table 1 Light Accent 3" w:uiPriority="46"/>
+    <w:lsdException w:name="Grid Table 2 Accent 3" w:uiPriority="47"/>
+    <w:lsdException w:name="Grid Table 3 Accent 3" w:uiPriority="48"/>
+    <w:lsdException w:name="Grid Table 4 Accent 3" w:uiPriority="49"/>
+    <w:lsdException w:name="Grid Table 5 Dark Accent 3" w:uiPriority="50"/>
+    <w:lsdException w:name="Grid Table 6 Colorful Accent 3" w:uiPriority="51"/>
+    <w:lsdException w:name="Grid Table 7 Colorful Accent 3" w:uiPriority="52"/>
+    <w:lsdException w:name="Grid Table 1 Light Accent 4" w:uiPriority="46"/>
+    <w:lsdException w:name="Grid Table 2 Accent 4" w:uiPriority="47"/>
+    <w:lsdException w:name="Grid Table 3 Accent 4" w:uiPriority="48"/>
+    <w:lsdException w:name="Grid Table 4 Accent 4" w:uiPriority="49"/>
+    <w:lsdException w:name="Grid Table 5 Dark Accent 4" w:uiPriority="50"/>
+    <w:lsdException w:name="Grid Table 6 Colorful Accent 4" w:uiPriority="51"/>
+    <w:lsdException w:name="Grid Table 7 Colorful Accent 4" w:uiPriority="52"/>
+    <w:lsdException w:name="Grid Table 1 Light Accent 5" w:uiPriority="46"/>
+    <w:lsdException w:name="Grid Table 2 Accent 5" w:uiPriority="47"/>
+    <w:lsdException w:name="Grid Table 3 Accent 5" w:uiPriority="48"/>
+    <w:lsdException w:name="Grid Table 4 Accent 5" w:uiPriority="49"/>
+    <w:lsdException w:name="Grid Table 5 Dark Accent 5" w:uiPriority="50"/>
+    <w:lsdException w:name="Grid Table 6 Colorful Accent 5" w:uiPriority="51"/>
+    <w:lsdException w:name="Grid Table 7 Colorful Accent 5" w:uiPriority="52"/>
+    <w:lsdException w:name="Grid Table 1 Light Accent 6" w:uiPriority="46"/>
+    <w:lsdException w:name="Grid Table 2 Accent 6" w:uiPriority="47"/>
+    <w:lsdException w:name="Grid Table 3 Accent 6" w:uiPriority="48"/>
+    <w:lsdException w:name="Grid Table 4 Accent 6" w:uiPriority="49"/>
+    <w:lsdException w:name="Grid Table 5 Dark Accent 6" w:uiPriority="50"/>
+    <w:lsdException w:name="Grid Table 6 Colorful Accent 6" w:uiPriority="51"/>
+    <w:lsdException w:name="Grid Table 7 Colorful Accent 6" w:uiPriority="52"/>
+    <w:lsdException w:name="List Table 1 Light" w:uiPriority="46"/>
+    <w:lsdException w:name="List Table 2" w:uiPriority="47"/>
+    <w:lsdException w:name="List Table 3" w:uiPriority="48"/>
+    <w:lsdException w:name="List Table 4" w:uiPriority="49"/>
+    <w:lsdException w:name="List Table 5 Dark" w:uiPriority="50"/>
+    <w:lsdException w:name="List Table 6 Colorful" w:uiPriority="51"/>
+    <w:lsdException w:name="List Table 7 Colorful" w:uiPriority="52"/>
+    <w:lsdException w:name="List Table 1 Light Accent 1" w:uiPriority="46"/>
+    <w:lsdException w:name="List Table 2 Accent 1" w:uiPriority="47"/>
+    <w:lsdException w:name="List Table 3 Accent 1" w:uiPriority="48"/>
+    <w:lsdException w:name="List Table 4 Accent 1" w:uiPriority="49"/>
+    <w:lsdException w:name="List Table 5 Dark Accent 1" w:uiPriority="50"/>
+    <w:lsdException w:name="List Table 6 Colorful Accent 1" w:uiPriority="51"/>
+    <w:lsdException w:name="List Table 7 Colorful Accent 1" w:uiPriority="52"/>
+    <w:lsdException w:name="List Table 1 Light Accent 2" w:uiPriority="46"/>
+    <w:lsdException w:name="List Table 2 Accent 2" w:uiPriority="47"/>
+    <w:lsdException w:name="List Table 3 Accent 2" w:uiPriority="48"/>
+    <w:lsdException w:name="List Table 4 Accent 2" w:uiPriority="49"/>
+    <w:lsdException w:name="List Table 5 Dark Accent 2" w:uiPriority="50"/>
+    <w:lsdException w:name="List Table 6 Colorful Accent 2" w:uiPriority="51"/>
+    <w:lsdException w:name="List Table 7 Colorful Accent 2" w:uiPriority="52"/>
+    <w:lsdException w:name="List Table 1 Light Accent 3" w:uiPriority="46"/>
+    <w:lsdException w:name="List Table 2 Accent 3" w:uiPriority="47"/>
+    <w:lsdException w:name="List Table 3 Accent 3" w:uiPriority="48"/>
+    <w:lsdException w:name="List Table 4 Accent 3" w:uiPriority="49"/>
+    <w:lsdException w:name="List Table 5 Dark Accent 3" w:uiPriority="50"/>
+    <w:lsdException w:name="List Table 6 Colorful Accent 3" w:uiPriority="51"/>
+    <w:lsdException w:name="List Table 7 Colorful Accent 3" w:uiPriority="52"/>
+    <w:lsdException w:name="List Table 1 Light Accent 4" w:uiPriority="46"/>
+    <w:lsdException w:name="List Table 2 Accent 4" w:uiPriority="47"/>
+    <w:lsdException w:name="List Table 3 Accent 4" w:uiPriority="48"/>
+    <w:lsdException w:name="List Table 4 Accent 4" w:uiPriority="49"/>
+    <w:lsdException w:name="List Table 5 Dark Accent 4" w:uiPriority="50"/>
+    <w:lsdException w:name="List Table 6 Colorful Accent 4" w:uiPriority="51"/>
+    <w:lsdException w:name="List Table 7 Colorful Accent 4" w:uiPriority="52"/>
+    <w:lsdException w:name="List Table 1 Light Accent 5" w:uiPriority="46"/>
+    <w:lsdException w:name="List Table 2 Accent 5" w:uiPriority="47"/>
+    <w:lsdException w:name="List Table 3 Accent 5" w:uiPriority="48"/>
+    <w:lsdException w:name="List Table 4 Accent 5" w:uiPriority="49"/>
+    <w:lsdException w:name="List Table 5 Dark Accent 5" w:uiPriority="50"/>
+    <w:lsdException w:name="List Table 6 Colorful Accent 5" w:uiPriority="51"/>
+    <w:lsdException w:name="List Table 7 Colorful Accent 5" w:uiPriority="52"/>
+    <w:lsdException w:name="List Table 1 Light Accent 6" w:uiPriority="46"/>
+    <w:lsdException w:name="List Table 2 Accent 6" w:uiPriority="47"/>
+    <w:lsdException w:name="List Table 3 Accent 6" w:uiPriority="48"/>
+    <w:lsdException w:name="List Table 4 Accent 6" w:uiPriority="49"/>
+    <w:lsdException w:name="List Table 5 Dark Accent 6" w:uiPriority="50"/>
+    <w:lsdException w:name="List Table 6 Colorful Accent 6" w:uiPriority="51"/>
+    <w:lsdException w:name="List Table 7 Colorful Accent 6" w:uiPriority="52"/>
+    <w:lsdException w:name="Mention" w:semiHidden="1" w:unhideWhenUsed="1"/>
+    <w:lsdException w:name="Smart Hyperlink" w:semiHidden="1" w:unhideWhenUsed="1"/>
+    <w:lsdException w:name="Hashtag" w:semiHidden="1" w:unhideWhenUsed="1"/>
+    <w:lsdException w:name="Unresolved Mention" w:semiHidden="1" w:unhideWhenUsed="1"/>
+    <w:lsdException w:name="Smart Link" w:semiHidden="1" w:unhideWhenUsed="1"/>
   </w:latentStyles>
   <w:style w:type="paragraph" w:default="1" w:styleId="a">
     <w:name w:val="Normal"/>
@@ -9657,7 +9931,7 @@
   <w:style w:type="paragraph" w:styleId="a5">
     <w:name w:val="Balloon Text"/>
     <w:basedOn w:val="a"/>
-    <w:link w:val="Char"/>
+    <w:link w:val="a6"/>
     <w:uiPriority w:val="99"/>
     <w:semiHidden/>
     <w:unhideWhenUsed/>
@@ -9667,8 +9941,8 @@
       <w:szCs w:val="18"/>
     </w:rPr>
   </w:style>
-  <w:style w:type="character" w:customStyle="1" w:styleId="Char">
-    <w:name w:val="批注框文本 Char"/>
+  <w:style w:type="character" w:customStyle="1" w:styleId="a6">
+    <w:name w:val="批注框文本 字符"/>
     <w:basedOn w:val="a0"/>
     <w:link w:val="a5"/>
     <w:uiPriority w:val="99"/>
@@ -9680,11 +9954,11 @@
       <w:szCs w:val="18"/>
     </w:rPr>
   </w:style>
-  <w:style w:type="paragraph" w:styleId="a6">
+  <w:style w:type="paragraph" w:styleId="a7">
     <w:name w:val="Title"/>
     <w:basedOn w:val="a"/>
     <w:next w:val="a"/>
-    <w:link w:val="Char0"/>
+    <w:link w:val="a8"/>
     <w:uiPriority w:val="10"/>
     <w:qFormat/>
     <w:rsid w:val="00410915"/>
@@ -9701,10 +9975,10 @@
       <w:szCs w:val="32"/>
     </w:rPr>
   </w:style>
-  <w:style w:type="character" w:customStyle="1" w:styleId="Char0">
-    <w:name w:val="标题 Char"/>
+  <w:style w:type="character" w:customStyle="1" w:styleId="a8">
+    <w:name w:val="标题 字符"/>
     <w:basedOn w:val="a0"/>
-    <w:link w:val="a6"/>
+    <w:link w:val="a7"/>
     <w:uiPriority w:val="10"/>
     <w:rsid w:val="00410915"/>
     <w:rPr>
@@ -9716,7 +9990,7 @@
       <w:szCs w:val="32"/>
     </w:rPr>
   </w:style>
-  <w:style w:type="paragraph" w:styleId="a7">
+  <w:style w:type="paragraph" w:styleId="a9">
     <w:name w:val="List Paragraph"/>
     <w:basedOn w:val="a"/>
     <w:uiPriority w:val="34"/>
@@ -9726,7 +10000,7 @@
       <w:ind w:firstLineChars="200" w:firstLine="420"/>
     </w:pPr>
   </w:style>
-  <w:style w:type="character" w:styleId="a8">
+  <w:style w:type="character" w:styleId="aa">
     <w:name w:val="Hyperlink"/>
     <w:basedOn w:val="a0"/>
     <w:uiPriority w:val="99"/>
@@ -9737,329 +10011,7 @@
       <w:u w:val="single"/>
     </w:rPr>
   </w:style>
-  <w:style w:type="character" w:styleId="a9">
-    <w:name w:val="FollowedHyperlink"/>
-    <w:basedOn w:val="a0"/>
-    <w:uiPriority w:val="99"/>
-    <w:semiHidden/>
-    <w:unhideWhenUsed/>
-    <w:rsid w:val="00A71828"/>
-    <w:rPr>
-      <w:color w:val="954F72" w:themeColor="followedHyperlink"/>
-      <w:u w:val="single"/>
-    </w:rPr>
-  </w:style>
-</w:styles>
-</file>
-
-<file path=word/stylesWithEffects.xml><?xml version="1.0" encoding="utf-8"?>
-<w:styles xmlns:wpc="http://schemas.microsoft.com/office/word/2010/wordprocessingCanvas" xmlns:mc="http://schemas.openxmlformats.org/markup-compatibility/2006" xmlns:o="urn:schemas-microsoft-com:office:office" xmlns:r="http://schemas.openxmlformats.org/officeDocument/2006/relationships" xmlns:m="http://schemas.openxmlformats.org/officeDocument/2006/math" xmlns:v="urn:schemas-microsoft-com:vml" xmlns:wp14="http://schemas.microsoft.com/office/word/2010/wordprocessingDrawing" xmlns:wp="http://schemas.openxmlformats.org/drawingml/2006/wordprocessingDrawing" xmlns:w10="urn:schemas-microsoft-com:office:word" xmlns:w="http://schemas.openxmlformats.org/wordprocessingml/2006/main" xmlns:w14="http://schemas.microsoft.com/office/word/2010/wordml" xmlns:wpg="http://schemas.microsoft.com/office/word/2010/wordprocessingGroup" xmlns:wpi="http://schemas.microsoft.com/office/word/2010/wordprocessingInk" xmlns:wne="http://schemas.microsoft.com/office/word/2006/wordml" xmlns:wps="http://schemas.microsoft.com/office/word/2010/wordprocessingShape" mc:Ignorable="w14 wp14">
-  <w:docDefaults>
-    <w:rPrDefault>
-      <w:rPr>
-        <w:rFonts w:ascii="Times New Roman" w:eastAsia="宋体" w:hAnsi="Times New Roman" w:cs="Times New Roman"/>
-        <w:lang w:val="en-US" w:eastAsia="zh-CN" w:bidi="ar-SA"/>
-      </w:rPr>
-    </w:rPrDefault>
-    <w:pPrDefault/>
-  </w:docDefaults>
-  <w:latentStyles w:defLockedState="0" w:defUIPriority="99" w:defSemiHidden="1" w:defUnhideWhenUsed="1" w:defQFormat="0" w:count="267">
-    <w:lsdException w:name="Normal" w:semiHidden="0" w:uiPriority="0" w:unhideWhenUsed="0" w:qFormat="1"/>
-    <w:lsdException w:name="heading 1" w:semiHidden="0" w:uiPriority="9" w:unhideWhenUsed="0" w:qFormat="1"/>
-    <w:lsdException w:name="heading 2" w:uiPriority="9" w:qFormat="1"/>
-    <w:lsdException w:name="heading 3" w:uiPriority="9" w:qFormat="1"/>
-    <w:lsdException w:name="heading 4" w:uiPriority="9" w:qFormat="1"/>
-    <w:lsdException w:name="heading 5" w:uiPriority="9" w:qFormat="1"/>
-    <w:lsdException w:name="heading 6" w:uiPriority="9" w:qFormat="1"/>
-    <w:lsdException w:name="heading 7" w:uiPriority="9" w:qFormat="1"/>
-    <w:lsdException w:name="heading 8" w:uiPriority="9" w:qFormat="1"/>
-    <w:lsdException w:name="heading 9" w:uiPriority="9" w:qFormat="1"/>
-    <w:lsdException w:name="toc 1" w:uiPriority="39"/>
-    <w:lsdException w:name="toc 2" w:uiPriority="39"/>
-    <w:lsdException w:name="toc 3" w:uiPriority="39"/>
-    <w:lsdException w:name="toc 4" w:uiPriority="39"/>
-    <w:lsdException w:name="toc 5" w:uiPriority="39"/>
-    <w:lsdException w:name="toc 6" w:uiPriority="39"/>
-    <w:lsdException w:name="toc 7" w:uiPriority="39"/>
-    <w:lsdException w:name="toc 8" w:uiPriority="39"/>
-    <w:lsdException w:name="toc 9" w:uiPriority="39"/>
-    <w:lsdException w:name="caption" w:uiPriority="35" w:qFormat="1"/>
-    <w:lsdException w:name="Title" w:semiHidden="0" w:uiPriority="10" w:unhideWhenUsed="0" w:qFormat="1"/>
-    <w:lsdException w:name="Default Paragraph Font" w:uiPriority="1"/>
-    <w:lsdException w:name="Subtitle" w:semiHidden="0" w:uiPriority="11" w:unhideWhenUsed="0" w:qFormat="1"/>
-    <w:lsdException w:name="Strong" w:semiHidden="0" w:uiPriority="22" w:unhideWhenUsed="0" w:qFormat="1"/>
-    <w:lsdException w:name="Emphasis" w:semiHidden="0" w:uiPriority="20" w:unhideWhenUsed="0" w:qFormat="1"/>
-    <w:lsdException w:name="Table Grid" w:semiHidden="0" w:uiPriority="39" w:unhideWhenUsed="0"/>
-    <w:lsdException w:name="Placeholder Text" w:unhideWhenUsed="0"/>
-    <w:lsdException w:name="No Spacing" w:semiHidden="0" w:uiPriority="1" w:unhideWhenUsed="0" w:qFormat="1"/>
-    <w:lsdException w:name="Light Shading" w:semiHidden="0" w:uiPriority="60" w:unhideWhenUsed="0"/>
-    <w:lsdException w:name="Light List" w:semiHidden="0" w:uiPriority="61" w:unhideWhenUsed="0"/>
-    <w:lsdException w:name="Light Grid" w:semiHidden="0" w:uiPriority="62" w:unhideWhenUsed="0"/>
-    <w:lsdException w:name="Medium Shading 1" w:semiHidden="0" w:uiPriority="63" w:unhideWhenUsed="0"/>
-    <w:lsdException w:name="Medium Shading 2" w:semiHidden="0" w:uiPriority="64" w:unhideWhenUsed="0"/>
-    <w:lsdException w:name="Medium List 1" w:semiHidden="0" w:uiPriority="65" w:unhideWhenUsed="0"/>
-    <w:lsdException w:name="Medium List 2" w:semiHidden="0" w:uiPriority="66" w:unhideWhenUsed="0"/>
-    <w:lsdException w:name="Medium Grid 1" w:semiHidden="0" w:uiPriority="67" w:unhideWhenUsed="0"/>
-    <w:lsdException w:name="Medium Grid 2" w:semiHidden="0" w:uiPriority="68" w:unhideWhenUsed="0"/>
-    <w:lsdException w:name="Medium Grid 3" w:semiHidden="0" w:uiPriority="69" w:unhideWhenUsed="0"/>
-    <w:lsdException w:name="Dark List" w:semiHidden="0" w:uiPriority="70" w:unhideWhenUsed="0"/>
-    <w:lsdException w:name="Colorful Shading" w:semiHidden="0" w:uiPriority="71" w:unhideWhenUsed="0"/>
-    <w:lsdException w:name="Colorful List" w:semiHidden="0" w:uiPriority="72" w:unhideWhenUsed="0"/>
-    <w:lsdException w:name="Colorful Grid" w:semiHidden="0" w:uiPriority="73" w:unhideWhenUsed="0"/>
-    <w:lsdException w:name="Light Shading Accent 1" w:semiHidden="0" w:uiPriority="60" w:unhideWhenUsed="0"/>
-    <w:lsdException w:name="Light List Accent 1" w:semiHidden="0" w:uiPriority="61" w:unhideWhenUsed="0"/>
-    <w:lsdException w:name="Light Grid Accent 1" w:semiHidden="0" w:uiPriority="62" w:unhideWhenUsed="0"/>
-    <w:lsdException w:name="Medium Shading 1 Accent 1" w:semiHidden="0" w:uiPriority="63" w:unhideWhenUsed="0"/>
-    <w:lsdException w:name="Medium Shading 2 Accent 1" w:semiHidden="0" w:uiPriority="64" w:unhideWhenUsed="0"/>
-    <w:lsdException w:name="Medium List 1 Accent 1" w:semiHidden="0" w:uiPriority="65" w:unhideWhenUsed="0"/>
-    <w:lsdException w:name="Revision" w:unhideWhenUsed="0"/>
-    <w:lsdException w:name="List Paragraph" w:semiHidden="0" w:uiPriority="34" w:unhideWhenUsed="0" w:qFormat="1"/>
-    <w:lsdException w:name="Quote" w:semiHidden="0" w:uiPriority="29" w:unhideWhenUsed="0" w:qFormat="1"/>
-    <w:lsdException w:name="Intense Quote" w:semiHidden="0" w:uiPriority="30" w:unhideWhenUsed="0" w:qFormat="1"/>
-    <w:lsdException w:name="Medium List 2 Accent 1" w:semiHidden="0" w:uiPriority="66" w:unhideWhenUsed="0"/>
-    <w:lsdException w:name="Medium Grid 1 Accent 1" w:semiHidden="0" w:uiPriority="67" w:unhideWhenUsed="0"/>
-    <w:lsdException w:name="Medium Grid 2 Accent 1" w:semiHidden="0" w:uiPriority="68" w:unhideWhenUsed="0"/>
-    <w:lsdException w:name="Medium Grid 3 Accent 1" w:semiHidden="0" w:uiPriority="69" w:unhideWhenUsed="0"/>
-    <w:lsdException w:name="Dark List Accent 1" w:semiHidden="0" w:uiPriority="70" w:unhideWhenUsed="0"/>
-    <w:lsdException w:name="Colorful Shading Accent 1" w:semiHidden="0" w:uiPriority="71" w:unhideWhenUsed="0"/>
-    <w:lsdException w:name="Colorful List Accent 1" w:semiHidden="0" w:uiPriority="72" w:unhideWhenUsed="0"/>
-    <w:lsdException w:name="Colorful Grid Accent 1" w:semiHidden="0" w:uiPriority="73" w:unhideWhenUsed="0"/>
-    <w:lsdException w:name="Light Shading Accent 2" w:semiHidden="0" w:uiPriority="60" w:unhideWhenUsed="0"/>
-    <w:lsdException w:name="Light List Accent 2" w:semiHidden="0" w:uiPriority="61" w:unhideWhenUsed="0"/>
-    <w:lsdException w:name="Light Grid Accent 2" w:semiHidden="0" w:uiPriority="62" w:unhideWhenUsed="0"/>
-    <w:lsdException w:name="Medium Shading 1 Accent 2" w:semiHidden="0" w:uiPriority="63" w:unhideWhenUsed="0"/>
-    <w:lsdException w:name="Medium Shading 2 Accent 2" w:semiHidden="0" w:uiPriority="64" w:unhideWhenUsed="0"/>
-    <w:lsdException w:name="Medium List 1 Accent 2" w:semiHidden="0" w:uiPriority="65" w:unhideWhenUsed="0"/>
-    <w:lsdException w:name="Medium List 2 Accent 2" w:semiHidden="0" w:uiPriority="66" w:unhideWhenUsed="0"/>
-    <w:lsdException w:name="Medium Grid 1 Accent 2" w:semiHidden="0" w:uiPriority="67" w:unhideWhenUsed="0"/>
-    <w:lsdException w:name="Medium Grid 2 Accent 2" w:semiHidden="0" w:uiPriority="68" w:unhideWhenUsed="0"/>
-    <w:lsdException w:name="Medium Grid 3 Accent 2" w:semiHidden="0" w:uiPriority="69" w:unhideWhenUsed="0"/>
-    <w:lsdException w:name="Dark List Accent 2" w:semiHidden="0" w:uiPriority="70" w:unhideWhenUsed="0"/>
-    <w:lsdException w:name="Colorful Shading Accent 2" w:semiHidden="0" w:uiPriority="71" w:unhideWhenUsed="0"/>
-    <w:lsdException w:name="Colorful List Accent 2" w:semiHidden="0" w:uiPriority="72" w:unhideWhenUsed="0"/>
-    <w:lsdException w:name="Colorful Grid Accent 2" w:semiHidden="0" w:uiPriority="73" w:unhideWhenUsed="0"/>
-    <w:lsdException w:name="Light Shading Accent 3" w:semiHidden="0" w:uiPriority="60" w:unhideWhenUsed="0"/>
-    <w:lsdException w:name="Light List Accent 3" w:semiHidden="0" w:uiPriority="61" w:unhideWhenUsed="0"/>
-    <w:lsdException w:name="Light Grid Accent 3" w:semiHidden="0" w:uiPriority="62" w:unhideWhenUsed="0"/>
-    <w:lsdException w:name="Medium Shading 1 Accent 3" w:semiHidden="0" w:uiPriority="63" w:unhideWhenUsed="0"/>
-    <w:lsdException w:name="Medium Shading 2 Accent 3" w:semiHidden="0" w:uiPriority="64" w:unhideWhenUsed="0"/>
-    <w:lsdException w:name="Medium List 1 Accent 3" w:semiHidden="0" w:uiPriority="65" w:unhideWhenUsed="0"/>
-    <w:lsdException w:name="Medium List 2 Accent 3" w:semiHidden="0" w:uiPriority="66" w:unhideWhenUsed="0"/>
-    <w:lsdException w:name="Medium Grid 1 Accent 3" w:semiHidden="0" w:uiPriority="67" w:unhideWhenUsed="0"/>
-    <w:lsdException w:name="Medium Grid 2 Accent 3" w:semiHidden="0" w:uiPriority="68" w:unhideWhenUsed="0"/>
-    <w:lsdException w:name="Medium Grid 3 Accent 3" w:semiHidden="0" w:uiPriority="69" w:unhideWhenUsed="0"/>
-    <w:lsdException w:name="Dark List Accent 3" w:semiHidden="0" w:uiPriority="70" w:unhideWhenUsed="0"/>
-    <w:lsdException w:name="Colorful Shading Accent 3" w:semiHidden="0" w:uiPriority="71" w:unhideWhenUsed="0"/>
-    <w:lsdException w:name="Colorful List Accent 3" w:semiHidden="0" w:uiPriority="72" w:unhideWhenUsed="0"/>
-    <w:lsdException w:name="Colorful Grid Accent 3" w:semiHidden="0" w:uiPriority="73" w:unhideWhenUsed="0"/>
-    <w:lsdException w:name="Light Shading Accent 4" w:semiHidden="0" w:uiPriority="60" w:unhideWhenUsed="0"/>
-    <w:lsdException w:name="Light List Accent 4" w:semiHidden="0" w:uiPriority="61" w:unhideWhenUsed="0"/>
-    <w:lsdException w:name="Light Grid Accent 4" w:semiHidden="0" w:uiPriority="62" w:unhideWhenUsed="0"/>
-    <w:lsdException w:name="Medium Shading 1 Accent 4" w:semiHidden="0" w:uiPriority="63" w:unhideWhenUsed="0"/>
-    <w:lsdException w:name="Medium Shading 2 Accent 4" w:semiHidden="0" w:uiPriority="64" w:unhideWhenUsed="0"/>
-    <w:lsdException w:name="Medium List 1 Accent 4" w:semiHidden="0" w:uiPriority="65" w:unhideWhenUsed="0"/>
-    <w:lsdException w:name="Medium List 2 Accent 4" w:semiHidden="0" w:uiPriority="66" w:unhideWhenUsed="0"/>
-    <w:lsdException w:name="Medium Grid 1 Accent 4" w:semiHidden="0" w:uiPriority="67" w:unhideWhenUsed="0"/>
-    <w:lsdException w:name="Medium Grid 2 Accent 4" w:semiHidden="0" w:uiPriority="68" w:unhideWhenUsed="0"/>
-    <w:lsdException w:name="Medium Grid 3 Accent 4" w:semiHidden="0" w:uiPriority="69" w:unhideWhenUsed="0"/>
-    <w:lsdException w:name="Dark List Accent 4" w:semiHidden="0" w:uiPriority="70" w:unhideWhenUsed="0"/>
-    <w:lsdException w:name="Colorful Shading Accent 4" w:semiHidden="0" w:uiPriority="71" w:unhideWhenUsed="0"/>
-    <w:lsdException w:name="Colorful List Accent 4" w:semiHidden="0" w:uiPriority="72" w:unhideWhenUsed="0"/>
-    <w:lsdException w:name="Colorful Grid Accent 4" w:semiHidden="0" w:uiPriority="73" w:unhideWhenUsed="0"/>
-    <w:lsdException w:name="Light Shading Accent 5" w:semiHidden="0" w:uiPriority="60" w:unhideWhenUsed="0"/>
-    <w:lsdException w:name="Light List Accent 5" w:semiHidden="0" w:uiPriority="61" w:unhideWhenUsed="0"/>
-    <w:lsdException w:name="Light Grid Accent 5" w:semiHidden="0" w:uiPriority="62" w:unhideWhenUsed="0"/>
-    <w:lsdException w:name="Medium Shading 1 Accent 5" w:semiHidden="0" w:uiPriority="63" w:unhideWhenUsed="0"/>
-    <w:lsdException w:name="Medium Shading 2 Accent 5" w:semiHidden="0" w:uiPriority="64" w:unhideWhenUsed="0"/>
-    <w:lsdException w:name="Medium List 1 Accent 5" w:semiHidden="0" w:uiPriority="65" w:unhideWhenUsed="0"/>
-    <w:lsdException w:name="Medium List 2 Accent 5" w:semiHidden="0" w:uiPriority="66" w:unhideWhenUsed="0"/>
-    <w:lsdException w:name="Medium Grid 1 Accent 5" w:semiHidden="0" w:uiPriority="67" w:unhideWhenUsed="0"/>
-    <w:lsdException w:name="Medium Grid 2 Accent 5" w:semiHidden="0" w:uiPriority="68" w:unhideWhenUsed="0"/>
-    <w:lsdException w:name="Medium Grid 3 Accent 5" w:semiHidden="0" w:uiPriority="69" w:unhideWhenUsed="0"/>
-    <w:lsdException w:name="Dark List Accent 5" w:semiHidden="0" w:uiPriority="70" w:unhideWhenUsed="0"/>
-    <w:lsdException w:name="Colorful Shading Accent 5" w:semiHidden="0" w:uiPriority="71" w:unhideWhenUsed="0"/>
-    <w:lsdException w:name="Colorful List Accent 5" w:semiHidden="0" w:uiPriority="72" w:unhideWhenUsed="0"/>
-    <w:lsdException w:name="Colorful Grid Accent 5" w:semiHidden="0" w:uiPriority="73" w:unhideWhenUsed="0"/>
-    <w:lsdException w:name="Light Shading Accent 6" w:semiHidden="0" w:uiPriority="60" w:unhideWhenUsed="0"/>
-    <w:lsdException w:name="Light List Accent 6" w:semiHidden="0" w:uiPriority="61" w:unhideWhenUsed="0"/>
-    <w:lsdException w:name="Light Grid Accent 6" w:semiHidden="0" w:uiPriority="62" w:unhideWhenUsed="0"/>
-    <w:lsdException w:name="Medium Shading 1 Accent 6" w:semiHidden="0" w:uiPriority="63" w:unhideWhenUsed="0"/>
-    <w:lsdException w:name="Medium Shading 2 Accent 6" w:semiHidden="0" w:uiPriority="64" w:unhideWhenUsed="0"/>
-    <w:lsdException w:name="Medium List 1 Accent 6" w:semiHidden="0" w:uiPriority="65" w:unhideWhenUsed="0"/>
-    <w:lsdException w:name="Medium List 2 Accent 6" w:semiHidden="0" w:uiPriority="66" w:unhideWhenUsed="0"/>
-    <w:lsdException w:name="Medium Grid 1 Accent 6" w:semiHidden="0" w:uiPriority="67" w:unhideWhenUsed="0"/>
-    <w:lsdException w:name="Medium Grid 2 Accent 6" w:semiHidden="0" w:uiPriority="68" w:unhideWhenUsed="0"/>
-    <w:lsdException w:name="Medium Grid 3 Accent 6" w:semiHidden="0" w:uiPriority="69" w:unhideWhenUsed="0"/>
-    <w:lsdException w:name="Dark List Accent 6" w:semiHidden="0" w:uiPriority="70" w:unhideWhenUsed="0"/>
-    <w:lsdException w:name="Colorful Shading Accent 6" w:semiHidden="0" w:uiPriority="71" w:unhideWhenUsed="0"/>
-    <w:lsdException w:name="Colorful List Accent 6" w:semiHidden="0" w:uiPriority="72" w:unhideWhenUsed="0"/>
-    <w:lsdException w:name="Colorful Grid Accent 6" w:semiHidden="0" w:uiPriority="73" w:unhideWhenUsed="0"/>
-    <w:lsdException w:name="Subtle Emphasis" w:semiHidden="0" w:uiPriority="19" w:unhideWhenUsed="0" w:qFormat="1"/>
-    <w:lsdException w:name="Intense Emphasis" w:semiHidden="0" w:uiPriority="21" w:unhideWhenUsed="0" w:qFormat="1"/>
-    <w:lsdException w:name="Subtle Reference" w:semiHidden="0" w:uiPriority="31" w:unhideWhenUsed="0" w:qFormat="1"/>
-    <w:lsdException w:name="Intense Reference" w:semiHidden="0" w:uiPriority="32" w:unhideWhenUsed="0" w:qFormat="1"/>
-    <w:lsdException w:name="Book Title" w:semiHidden="0" w:uiPriority="33" w:unhideWhenUsed="0" w:qFormat="1"/>
-    <w:lsdException w:name="Bibliography" w:uiPriority="37"/>
-    <w:lsdException w:name="TOC Heading" w:uiPriority="39" w:qFormat="1"/>
-  </w:latentStyles>
-  <w:style w:type="paragraph" w:default="1" w:styleId="a">
-    <w:name w:val="Normal"/>
-    <w:qFormat/>
-    <w:pPr>
-      <w:widowControl w:val="0"/>
-      <w:jc w:val="both"/>
-    </w:pPr>
-    <w:rPr>
-      <w:kern w:val="2"/>
-      <w:sz w:val="21"/>
-    </w:rPr>
-  </w:style>
-  <w:style w:type="character" w:default="1" w:styleId="a0">
-    <w:name w:val="Default Paragraph Font"/>
-    <w:uiPriority w:val="1"/>
-    <w:semiHidden/>
-    <w:unhideWhenUsed/>
-  </w:style>
-  <w:style w:type="table" w:default="1" w:styleId="a1">
-    <w:name w:val="Normal Table"/>
-    <w:uiPriority w:val="99"/>
-    <w:semiHidden/>
-    <w:unhideWhenUsed/>
-    <w:tblPr>
-      <w:tblInd w:w="0" w:type="dxa"/>
-      <w:tblCellMar>
-        <w:top w:w="0" w:type="dxa"/>
-        <w:left w:w="108" w:type="dxa"/>
-        <w:bottom w:w="0" w:type="dxa"/>
-        <w:right w:w="108" w:type="dxa"/>
-      </w:tblCellMar>
-    </w:tblPr>
-  </w:style>
-  <w:style w:type="numbering" w:default="1" w:styleId="a2">
-    <w:name w:val="No List"/>
-    <w:uiPriority w:val="99"/>
-    <w:semiHidden/>
-    <w:unhideWhenUsed/>
-  </w:style>
-  <w:style w:type="paragraph" w:styleId="a3">
-    <w:name w:val="footer"/>
-    <w:basedOn w:val="a"/>
-    <w:pPr>
-      <w:tabs>
-        <w:tab w:val="center" w:pos="4153"/>
-        <w:tab w:val="right" w:pos="8306"/>
-      </w:tabs>
-      <w:snapToGrid w:val="0"/>
-      <w:jc w:val="left"/>
-    </w:pPr>
-    <w:rPr>
-      <w:sz w:val="18"/>
-    </w:rPr>
-  </w:style>
-  <w:style w:type="paragraph" w:styleId="a4">
-    <w:name w:val="header"/>
-    <w:basedOn w:val="a"/>
-    <w:pPr>
-      <w:pBdr>
-        <w:top w:val="none" w:sz="0" w:space="1" w:color="auto"/>
-        <w:left w:val="none" w:sz="0" w:space="4" w:color="auto"/>
-        <w:bottom w:val="none" w:sz="0" w:space="1" w:color="auto"/>
-        <w:right w:val="none" w:sz="0" w:space="4" w:color="auto"/>
-      </w:pBdr>
-      <w:tabs>
-        <w:tab w:val="center" w:pos="4153"/>
-        <w:tab w:val="right" w:pos="8306"/>
-      </w:tabs>
-      <w:snapToGrid w:val="0"/>
-    </w:pPr>
-    <w:rPr>
-      <w:sz w:val="18"/>
-    </w:rPr>
-  </w:style>
-  <w:style w:type="paragraph" w:styleId="a5">
-    <w:name w:val="Balloon Text"/>
-    <w:basedOn w:val="a"/>
-    <w:link w:val="Char"/>
-    <w:uiPriority w:val="99"/>
-    <w:semiHidden/>
-    <w:unhideWhenUsed/>
-    <w:rsid w:val="009D238B"/>
-    <w:rPr>
-      <w:sz w:val="18"/>
-      <w:szCs w:val="18"/>
-    </w:rPr>
-  </w:style>
-  <w:style w:type="character" w:customStyle="1" w:styleId="Char">
-    <w:name w:val="批注框文本 Char"/>
-    <w:basedOn w:val="a0"/>
-    <w:link w:val="a5"/>
-    <w:uiPriority w:val="99"/>
-    <w:semiHidden/>
-    <w:rsid w:val="009D238B"/>
-    <w:rPr>
-      <w:kern w:val="2"/>
-      <w:sz w:val="18"/>
-      <w:szCs w:val="18"/>
-    </w:rPr>
-  </w:style>
-  <w:style w:type="paragraph" w:styleId="a6">
-    <w:name w:val="Title"/>
-    <w:basedOn w:val="a"/>
-    <w:next w:val="a"/>
-    <w:link w:val="Char0"/>
-    <w:uiPriority w:val="10"/>
-    <w:qFormat/>
-    <w:rsid w:val="00410915"/>
-    <w:pPr>
-      <w:spacing w:before="240" w:after="60"/>
-      <w:jc w:val="center"/>
-      <w:outlineLvl w:val="0"/>
-    </w:pPr>
-    <w:rPr>
-      <w:rFonts w:asciiTheme="majorHAnsi" w:hAnsiTheme="majorHAnsi" w:cstheme="majorBidi"/>
-      <w:b/>
-      <w:bCs/>
-      <w:sz w:val="32"/>
-      <w:szCs w:val="32"/>
-    </w:rPr>
-  </w:style>
-  <w:style w:type="character" w:customStyle="1" w:styleId="Char0">
-    <w:name w:val="标题 Char"/>
-    <w:basedOn w:val="a0"/>
-    <w:link w:val="a6"/>
-    <w:uiPriority w:val="10"/>
-    <w:rsid w:val="00410915"/>
-    <w:rPr>
-      <w:rFonts w:asciiTheme="majorHAnsi" w:hAnsiTheme="majorHAnsi" w:cstheme="majorBidi"/>
-      <w:b/>
-      <w:bCs/>
-      <w:kern w:val="2"/>
-      <w:sz w:val="32"/>
-      <w:szCs w:val="32"/>
-    </w:rPr>
-  </w:style>
-  <w:style w:type="paragraph" w:styleId="a7">
-    <w:name w:val="List Paragraph"/>
-    <w:basedOn w:val="a"/>
-    <w:uiPriority w:val="34"/>
-    <w:qFormat/>
-    <w:rsid w:val="00410915"/>
-    <w:pPr>
-      <w:ind w:firstLineChars="200" w:firstLine="420"/>
-    </w:pPr>
-  </w:style>
-  <w:style w:type="character" w:styleId="a8">
-    <w:name w:val="Hyperlink"/>
-    <w:basedOn w:val="a0"/>
-    <w:uiPriority w:val="99"/>
-    <w:unhideWhenUsed/>
-    <w:rsid w:val="00EB2C1E"/>
-    <w:rPr>
-      <w:color w:val="0563C1" w:themeColor="hyperlink"/>
-      <w:u w:val="single"/>
-    </w:rPr>
-  </w:style>
-  <w:style w:type="character" w:styleId="a9">
+  <w:style w:type="character" w:styleId="ab">
     <w:name w:val="FollowedHyperlink"/>
     <w:basedOn w:val="a0"/>
     <w:uiPriority w:val="99"/>
@@ -10329,7 +10281,7 @@
   <a:extraClrSchemeLst/>
   <a:extLst>
     <a:ext uri="{05A4C25C-085E-4340-85A3-A5531E510DB2}">
-      <thm15:themeFamily xmlns:thm15="http://schemas.microsoft.com/office/thememl/2012/main" xmlns="" name="Office Theme" id="{62F939B6-93AF-4DB8-9C6B-D6C7DFDC589F}" vid="{4A3C46E8-61CC-4603-A589-7422A47A8E4A}"/>
+      <thm15:themeFamily xmlns:thm15="http://schemas.microsoft.com/office/thememl/2012/main" name="Office Theme" id="{62F939B6-93AF-4DB8-9C6B-D6C7DFDC589F}" vid="{4A3C46E8-61CC-4603-A589-7422A47A8E4A}"/>
     </a:ext>
   </a:extLst>
 </a:theme>

</xml_diff>